<commit_message>
Update proposal with final GitHub repository URL
</commit_message>
<xml_diff>
--- a/docs/Task1_Project_Proposal_Campus_Secondhand_Platform.docx
+++ b/docs/Task1_Project_Proposal_Campus_Secondhand_Platform.docx
@@ -479,7 +479,7 @@
         <w:jc w:val="both"/>
       </w:pPr>
       <w:r>
-        <w:t>Project Website / GitHub URL: https://github.com/cccc1ccc</w:t>
+        <w:t>Project Website / GitHub URL: https://github.com/cccc1ccc/smart-campus-secondhand</w:t>
       </w:r>
     </w:p>
     <w:p>
@@ -1884,14 +1884,14 @@
 
 <file path=word/endnotes.xml><?xml version="1.0" encoding="utf-8"?>
 <w:endnotes xmlns:w="http://schemas.openxmlformats.org/wordprocessingml/2006/main" xmlns:w14="http://schemas.microsoft.com/office/word/2010/wordml" xmlns:mc="http://schemas.openxmlformats.org/markup-compatibility/2006" mc:Ignorable="w14">
-  <w:endnote w:type="continuationSeparator" w:id="0">
+  <w:endnote w:type="continuationSeparator" w:id="1">
     <w:p>
       <w:pPr>
         <w:spacing w:line="240" w:lineRule="auto"/>
       </w:pPr>
     </w:p>
   </w:endnote>
-  <w:endnote w:type="separator" w:id="1">
+  <w:endnote w:type="separator" w:id="0">
     <w:p>
       <w:pPr>
         <w:spacing w:line="240" w:lineRule="auto"/>
@@ -1937,14 +1937,14 @@
 
 <file path=word/footnotes.xml><?xml version="1.0" encoding="utf-8"?>
 <w:footnotes xmlns:w="http://schemas.openxmlformats.org/wordprocessingml/2006/main" xmlns:w14="http://schemas.microsoft.com/office/word/2010/wordml" xmlns:mc="http://schemas.openxmlformats.org/markup-compatibility/2006" mc:Ignorable="w14">
-  <w:footnote w:type="continuationSeparator" w:id="0">
+  <w:footnote w:type="continuationSeparator" w:id="1">
     <w:p>
       <w:pPr>
         <w:spacing w:before="0" w:after="0" w:line="276" w:lineRule="auto"/>
       </w:pPr>
     </w:p>
   </w:footnote>
-  <w:footnote w:type="separator" w:id="1">
+  <w:footnote w:type="separator" w:id="0">
     <w:p>
       <w:pPr>
         <w:spacing w:before="0" w:after="0" w:line="276" w:lineRule="auto"/>
@@ -1997,297 +1997,313 @@
     <w:pPrDefault/>
   </w:docDefaults>
   <w:latentStyles w:defLockedState="0" w:defUIPriority="99" w:defSemiHidden="1" w:defUnhideWhenUsed="1" w:defQFormat="0" w:count="260">
-    <w:lsdException w:name="Light List Accent 2" w:uiPriority="61" w:semiHidden="0" w:unhideWhenUsed="0"/>
+    <w:lsdException w:name="Colorful Shading Accent 2" w:uiPriority="71" w:semiHidden="0" w:unhideWhenUsed="0"/>
     <w:lsdException w:name="Table Grid 5" w:uiPriority="99"/>
+    <w:lsdException w:name="heading 7" w:locked="1" w:uiPriority="0" w:qFormat="1"/>
+    <w:lsdException w:name="Table Columns 2" w:uiPriority="99"/>
+    <w:lsdException w:name="Normal Table" w:uiPriority="99"/>
+    <w:lsdException w:name="Colorful Shading Accent 5" w:uiPriority="71" w:semiHidden="0" w:unhideWhenUsed="0"/>
+    <w:lsdException w:name="Body Text" w:uiPriority="99"/>
+    <w:lsdException w:name="List Number" w:uiPriority="99"/>
+    <w:lsdException w:name="Table Classic 1" w:uiPriority="99"/>
+    <w:lsdException w:name="Medium Shading 1 Accent 1" w:uiPriority="63" w:semiHidden="0" w:unhideWhenUsed="0"/>
+    <w:lsdException w:name="toc 7" w:locked="1" w:uiPriority="0" w:semiHidden="0" w:unhideWhenUsed="0"/>
+    <w:lsdException w:name="Hyperlink" w:uiPriority="99" w:semiHidden="0" w:unhideWhenUsed="0"/>
+    <w:lsdException w:name="List Continue 5" w:uiPriority="99"/>
+    <w:lsdException w:name="Medium Shading 2 Accent 1" w:uiPriority="64" w:semiHidden="0" w:unhideWhenUsed="0"/>
+    <w:lsdException w:name="List Number 4" w:uiPriority="99"/>
+    <w:lsdException w:name="toa heading" w:uiPriority="99"/>
+    <w:lsdException w:name="Medium Shading 2 Accent 6" w:uiPriority="64" w:semiHidden="0" w:unhideWhenUsed="0"/>
+    <w:lsdException w:name="HTML Typewriter" w:uiPriority="99"/>
+    <w:lsdException w:name="Medium Grid 3 Accent 5" w:uiPriority="69" w:semiHidden="0" w:unhideWhenUsed="0"/>
+    <w:lsdException w:name="Table Classic 3" w:uiPriority="99"/>
+    <w:lsdException w:name="toc 5" w:locked="1" w:uiPriority="0" w:semiHidden="0" w:unhideWhenUsed="0"/>
+    <w:lsdException w:name="Message Header" w:uiPriority="99"/>
+    <w:lsdException w:name="Medium Shading 1" w:uiPriority="63" w:semiHidden="0" w:unhideWhenUsed="0"/>
+    <w:lsdException w:name="Table 3D effects 1" w:uiPriority="99"/>
+    <w:lsdException w:name="Dark List" w:uiPriority="70" w:semiHidden="0" w:unhideWhenUsed="0"/>
+    <w:lsdException w:name="Medium Shading 1 Accent 6" w:uiPriority="63" w:semiHidden="0" w:unhideWhenUsed="0"/>
+    <w:lsdException w:name="Medium List 2 Accent 6" w:uiPriority="66" w:semiHidden="0" w:unhideWhenUsed="0"/>
+    <w:lsdException w:name="List Continue 3" w:uiPriority="99"/>
+    <w:lsdException w:name="Table List 2" w:uiPriority="99"/>
+    <w:lsdException w:name="Table Elegant" w:uiPriority="99"/>
+    <w:lsdException w:name="Light Shading Accent 3" w:uiPriority="60" w:semiHidden="0" w:unhideWhenUsed="0"/>
+    <w:lsdException w:name="Light Grid Accent 4" w:uiPriority="62" w:semiHidden="0" w:unhideWhenUsed="0"/>
+    <w:lsdException w:name="Colorful Shading Accent 4" w:uiPriority="71" w:semiHidden="0" w:unhideWhenUsed="0"/>
+    <w:lsdException w:name="List Bullet" w:uiPriority="99"/>
+    <w:lsdException w:name="Table List 5" w:uiPriority="99"/>
     <w:lsdException w:name="Table Simple 1" w:uiPriority="99"/>
+    <w:lsdException w:name="List 4" w:uiPriority="99"/>
+    <w:lsdException w:name="Medium List 1 Accent 4" w:uiPriority="65" w:semiHidden="0" w:unhideWhenUsed="0"/>
+    <w:lsdException w:name="index 5" w:uiPriority="99"/>
+    <w:lsdException w:name="Table Grid 7" w:uiPriority="99"/>
+    <w:lsdException w:name="toc 6" w:locked="1" w:uiPriority="0" w:semiHidden="0" w:unhideWhenUsed="0"/>
+    <w:lsdException w:name="heading 9" w:locked="1" w:uiPriority="0" w:qFormat="1"/>
+    <w:lsdException w:name="Note Heading" w:uiPriority="99"/>
+    <w:lsdException w:name="annotation subject" w:uiPriority="99"/>
+    <w:lsdException w:name="Medium Grid 2 Accent 2" w:uiPriority="68" w:semiHidden="0" w:unhideWhenUsed="0"/>
+    <w:lsdException w:name="Table Colorful 1" w:uiPriority="99"/>
+    <w:lsdException w:name="HTML Sample" w:uiPriority="99"/>
+    <w:lsdException w:name="toc 1" w:uiPriority="39" w:semiHidden="0" w:unhideWhenUsed="0"/>
+    <w:lsdException w:name="Light Shading Accent 4" w:uiPriority="60" w:semiHidden="0" w:unhideWhenUsed="0"/>
+    <w:lsdException w:name="HTML Address" w:uiPriority="99"/>
+    <w:lsdException w:name="Medium Shading 2 Accent 5" w:uiPriority="64" w:semiHidden="0" w:unhideWhenUsed="0"/>
+    <w:lsdException w:name="toc 9" w:locked="1" w:uiPriority="0" w:semiHidden="0" w:unhideWhenUsed="0"/>
+    <w:lsdException w:name="footnote text" w:uiPriority="99"/>
+    <w:lsdException w:name="Medium Grid 3 Accent 4" w:uiPriority="69" w:semiHidden="0" w:unhideWhenUsed="0"/>
+    <w:lsdException w:name="List Number 5" w:uiPriority="99"/>
+    <w:lsdException w:name="Medium Shading 2" w:uiPriority="64" w:semiHidden="0" w:unhideWhenUsed="0"/>
+    <w:lsdException w:name="Medium Grid 3 Accent 3" w:uiPriority="69" w:semiHidden="0" w:unhideWhenUsed="0"/>
+    <w:lsdException w:name="Medium List 2 Accent 2" w:uiPriority="66" w:semiHidden="0" w:unhideWhenUsed="0"/>
+    <w:lsdException w:name="Table Colorful 3" w:uiPriority="99"/>
+    <w:lsdException w:name="Closing" w:uiPriority="99"/>
+    <w:lsdException w:name="Normal (Web)" w:uiPriority="99"/>
+    <w:lsdException w:name="E-mail Signature" w:uiPriority="99"/>
+    <w:lsdException w:name="line number" w:uiPriority="99"/>
+    <w:lsdException w:name="Table List 4" w:uiPriority="99"/>
+    <w:lsdException w:name="Light Shading Accent 2" w:uiPriority="60" w:semiHidden="0" w:unhideWhenUsed="0"/>
+    <w:lsdException w:name="index 1" w:uiPriority="99"/>
+    <w:lsdException w:name="Table Classic 2" w:uiPriority="99"/>
+    <w:lsdException w:name="index heading" w:uiPriority="99"/>
+    <w:lsdException w:name="Medium Shading 1 Accent 2" w:uiPriority="63" w:semiHidden="0" w:unhideWhenUsed="0"/>
+    <w:lsdException w:name="Table Subtle 1" w:uiPriority="99"/>
+    <w:lsdException w:name="Body Text Indent 3" w:uiPriority="99"/>
+    <w:lsdException w:name="Light Shading Accent 5" w:uiPriority="60" w:semiHidden="0" w:unhideWhenUsed="0"/>
+    <w:lsdException w:name="Medium Grid 1 Accent 5" w:uiPriority="67" w:semiHidden="0" w:unhideWhenUsed="0"/>
+    <w:lsdException w:name="Medium Grid 2 Accent 6" w:uiPriority="68" w:semiHidden="0" w:unhideWhenUsed="0"/>
+    <w:lsdException w:name="List Number 3" w:uiPriority="99"/>
+    <w:lsdException w:name="Emphasis" w:locked="1" w:uiPriority="0" w:semiHidden="0" w:unhideWhenUsed="0" w:qFormat="1"/>
+    <w:lsdException w:name="index 3" w:uiPriority="99"/>
+    <w:lsdException w:name="Medium List 1 Accent 6" w:uiPriority="65" w:semiHidden="0" w:unhideWhenUsed="0"/>
+    <w:lsdException w:name="HTML Preformatted" w:uiPriority="99"/>
+    <w:lsdException w:name="Table Columns 1" w:uiPriority="99"/>
+    <w:lsdException w:name="Table List 7" w:uiPriority="99"/>
+    <w:lsdException w:name="Body Text Indent" w:uiPriority="99"/>
+    <w:lsdException w:name="Table Classic 4" w:uiPriority="99"/>
+    <w:lsdException w:name="Medium Grid 2" w:uiPriority="68" w:semiHidden="0" w:unhideWhenUsed="0"/>
+    <w:lsdException w:name="Colorful Shading Accent 6" w:uiPriority="71" w:semiHidden="0" w:unhideWhenUsed="0"/>
+    <w:lsdException w:name="heading 5" w:locked="1" w:uiPriority="0" w:qFormat="1"/>
+    <w:lsdException w:name="Light List Accent 5" w:uiPriority="61" w:semiHidden="0" w:unhideWhenUsed="0"/>
+    <w:lsdException w:name="Medium Grid 3 Accent 6" w:uiPriority="69" w:semiHidden="0" w:unhideWhenUsed="0"/>
+    <w:lsdException w:name="Medium Grid 2 Accent 4" w:uiPriority="68" w:semiHidden="0" w:unhideWhenUsed="0"/>
+    <w:lsdException w:name="Default Paragraph Font" w:uiPriority="1"/>
+    <w:lsdException w:name="toc 8" w:locked="1" w:uiPriority="0" w:semiHidden="0" w:unhideWhenUsed="0"/>
+    <w:lsdException w:name="Medium Grid 1 Accent 6" w:uiPriority="67" w:semiHidden="0" w:unhideWhenUsed="0"/>
+    <w:lsdException w:name="annotation reference" w:uiPriority="99"/>
+    <w:lsdException w:name="Dark List Accent 5" w:uiPriority="70" w:semiHidden="0" w:unhideWhenUsed="0"/>
+    <w:lsdException w:name="HTML Code" w:uiPriority="99"/>
+    <w:lsdException w:name="toc 3" w:locked="1" w:uiPriority="39" w:semiHidden="0" w:unhideWhenUsed="0"/>
+    <w:lsdException w:name="Light Shading Accent 6" w:uiPriority="60" w:semiHidden="0" w:unhideWhenUsed="0"/>
+    <w:lsdException w:name="table of authorities" w:uiPriority="99"/>
+    <w:lsdException w:name="Medium List 2 Accent 3" w:uiPriority="66" w:semiHidden="0" w:unhideWhenUsed="0"/>
+    <w:lsdException w:name="Table Web 3" w:uiPriority="99"/>
+    <w:lsdException w:name="Medium Grid 1 Accent 1" w:uiPriority="67" w:semiHidden="0" w:unhideWhenUsed="0"/>
+    <w:lsdException w:name="FollowedHyperlink" w:uiPriority="99"/>
+    <w:lsdException w:name="List 3" w:uiPriority="99"/>
+    <w:lsdException w:name="Light Grid Accent 3" w:uiPriority="62" w:semiHidden="0" w:unhideWhenUsed="0"/>
+    <w:lsdException w:name="Table Grid 4" w:uiPriority="99"/>
+    <w:lsdException w:name="Light Shading Accent 1" w:uiPriority="60" w:semiHidden="0" w:unhideWhenUsed="0"/>
+    <w:lsdException w:name="List Bullet 3" w:uiPriority="99"/>
+    <w:lsdException w:name="heading 6" w:locked="1" w:uiPriority="0" w:qFormat="1"/>
+    <w:lsdException w:name="Medium List 2 Accent 4" w:uiPriority="66" w:semiHidden="0" w:unhideWhenUsed="0"/>
+    <w:lsdException w:name="Table Columns 3" w:uiPriority="99"/>
+    <w:lsdException w:name="HTML Variable" w:uiPriority="99"/>
+    <w:lsdException w:name="index 7" w:uiPriority="99"/>
+    <w:lsdException w:name="Table Web 1" w:uiPriority="99"/>
+    <w:lsdException w:name="heading 1" w:uiPriority="99" w:semiHidden="0" w:unhideWhenUsed="0" w:qFormat="1"/>
+    <w:lsdException w:name="Colorful Grid Accent 5" w:uiPriority="73" w:semiHidden="0" w:unhideWhenUsed="0"/>
+    <w:lsdException w:name="Table Colorful 2" w:uiPriority="99"/>
+    <w:lsdException w:name="Table Grid" w:locked="1" w:uiPriority="99" w:semiHidden="0" w:unhideWhenUsed="0"/>
+    <w:lsdException w:name="Block Text" w:uiPriority="99"/>
+    <w:lsdException w:name="Table List 6" w:uiPriority="99"/>
+    <w:lsdException w:name="Medium Grid 3" w:uiPriority="69" w:semiHidden="0" w:unhideWhenUsed="0"/>
+    <w:lsdException w:name="Medium List 1" w:uiPriority="65" w:semiHidden="0" w:unhideWhenUsed="0"/>
+    <w:lsdException w:name="Light List Accent 4" w:uiPriority="61" w:semiHidden="0" w:unhideWhenUsed="0"/>
+    <w:lsdException w:name="Medium List 2 Accent 1" w:uiPriority="66" w:semiHidden="0" w:unhideWhenUsed="0"/>
     <w:lsdException w:name="Body Text First Indent" w:uiPriority="99"/>
+    <w:lsdException w:name="Date" w:uiPriority="99"/>
+    <w:lsdException w:name="table of figures" w:uiPriority="99" w:semiHidden="0"/>
+    <w:lsdException w:name="header" w:uiPriority="99" w:semiHidden="0" w:unhideWhenUsed="0"/>
+    <w:lsdException w:name="List Paragraph" w:uiPriority="34" w:semiHidden="0" w:unhideWhenUsed="0" w:qFormat="1"/>
+    <w:lsdException w:name="envelope address" w:uiPriority="99"/>
     <w:lsdException w:name="List Continue 4" w:uiPriority="99"/>
+    <w:lsdException w:name="Dark List Accent 1" w:uiPriority="70" w:semiHidden="0" w:unhideWhenUsed="0"/>
+    <w:lsdException w:name="index 2" w:uiPriority="99"/>
     <w:lsdException w:name="HTML Keyboard" w:uiPriority="99"/>
-    <w:lsdException w:name="Medium Grid 2 Accent 6" w:uiPriority="68" w:semiHidden="0" w:unhideWhenUsed="0"/>
-    <w:lsdException w:name="Medium Grid 3 Accent 6" w:uiPriority="69" w:semiHidden="0" w:unhideWhenUsed="0"/>
+    <w:lsdException w:name="Medium Grid 2 Accent 5" w:uiPriority="68" w:semiHidden="0" w:unhideWhenUsed="0"/>
+    <w:lsdException w:name="Colorful Grid Accent 3" w:uiPriority="73" w:semiHidden="0" w:unhideWhenUsed="0"/>
+    <w:lsdException w:name="index 9" w:uiPriority="99"/>
+    <w:lsdException w:name="Colorful List Accent 3" w:uiPriority="72" w:semiHidden="0" w:unhideWhenUsed="0"/>
+    <w:lsdException w:name="Colorful List" w:uiPriority="72" w:semiHidden="0" w:unhideWhenUsed="0"/>
+    <w:lsdException w:name="index 4" w:uiPriority="99"/>
     <w:lsdException w:name="Medium Grid 1 Accent 3" w:uiPriority="67" w:semiHidden="0" w:unhideWhenUsed="0"/>
-    <w:lsdException w:name="Colorful List" w:uiPriority="72" w:semiHidden="0" w:unhideWhenUsed="0"/>
+    <w:lsdException w:name="Table Grid 6" w:uiPriority="99"/>
+    <w:lsdException w:name="Light List Accent 3" w:uiPriority="61" w:semiHidden="0" w:unhideWhenUsed="0"/>
+    <w:lsdException w:name="footnote reference" w:uiPriority="99"/>
+    <w:lsdException w:name="heading 8" w:locked="1" w:uiPriority="0" w:qFormat="1"/>
+    <w:lsdException w:name="Dark List Accent 6" w:uiPriority="70" w:semiHidden="0" w:unhideWhenUsed="0"/>
+    <w:lsdException w:name="Body Text 2" w:uiPriority="99"/>
+    <w:lsdException w:name="endnote reference" w:uiPriority="99"/>
+    <w:lsdException w:name="Medium Grid 2 Accent 3" w:uiPriority="68" w:semiHidden="0" w:unhideWhenUsed="0"/>
+    <w:lsdException w:name="heading 3" w:locked="1" w:uiPriority="99" w:semiHidden="0" w:unhideWhenUsed="0" w:qFormat="1"/>
+    <w:lsdException w:name="Balloon Text" w:uiPriority="99" w:unhideWhenUsed="0"/>
+    <w:lsdException w:name="Colorful Grid Accent 4" w:uiPriority="73" w:semiHidden="0" w:unhideWhenUsed="0"/>
+    <w:lsdException w:name="Colorful List Accent 4" w:uiPriority="72" w:semiHidden="0" w:unhideWhenUsed="0"/>
+    <w:lsdException w:name="Body Text First Indent 2" w:uiPriority="99"/>
+    <w:lsdException w:name="Colorful Grid" w:uiPriority="73" w:semiHidden="0" w:unhideWhenUsed="0"/>
+    <w:lsdException w:name="Colorful Shading" w:uiPriority="71" w:semiHidden="0" w:unhideWhenUsed="0"/>
+    <w:lsdException w:name="List" w:uiPriority="99"/>
+    <w:lsdException w:name="endnote text" w:uiPriority="99"/>
+    <w:lsdException w:name="Light List Accent 1" w:uiPriority="61" w:semiHidden="0" w:unhideWhenUsed="0"/>
+    <w:lsdException w:name="Medium Grid 1 Accent 4" w:uiPriority="67" w:semiHidden="0" w:unhideWhenUsed="0"/>
+    <w:lsdException w:name="Medium Grid 3 Accent 2" w:uiPriority="69" w:semiHidden="0" w:unhideWhenUsed="0"/>
+    <w:lsdException w:name="Medium List 1 Accent 3" w:uiPriority="65" w:semiHidden="0" w:unhideWhenUsed="0"/>
+    <w:lsdException w:name="Table Columns 4" w:uiPriority="99"/>
+    <w:lsdException w:name="Colorful Shading Accent 3" w:uiPriority="71" w:semiHidden="0" w:unhideWhenUsed="0"/>
+    <w:lsdException w:name="List Bullet 5" w:uiPriority="99"/>
+    <w:lsdException w:name="index 8" w:uiPriority="99"/>
+    <w:lsdException w:name="Table Theme" w:uiPriority="99"/>
+    <w:lsdException w:name="HTML Definition" w:uiPriority="99"/>
+    <w:lsdException w:name="Table Simple 3" w:uiPriority="99"/>
+    <w:lsdException w:name="Colorful Grid Accent 2" w:uiPriority="73" w:semiHidden="0" w:unhideWhenUsed="0"/>
+    <w:lsdException w:name="Document Map" w:uiPriority="99"/>
+    <w:lsdException w:name="Colorful List Accent 2" w:uiPriority="72" w:semiHidden="0" w:unhideWhenUsed="0"/>
+    <w:lsdException w:name="Signature" w:uiPriority="99"/>
+    <w:lsdException w:name="heading 4" w:locked="1" w:uiPriority="0" w:qFormat="1"/>
+    <w:lsdException w:name="page number" w:uiPriority="99"/>
+    <w:lsdException w:name="Colorful Shading Accent 1" w:uiPriority="71" w:semiHidden="0" w:unhideWhenUsed="0"/>
+    <w:lsdException w:name="Colorful List Accent 5" w:uiPriority="72" w:semiHidden="0" w:unhideWhenUsed="0"/>
+    <w:lsdException w:name="Light Grid Accent 1" w:uiPriority="62" w:semiHidden="0" w:unhideWhenUsed="0"/>
+    <w:lsdException w:name="Table Contemporary" w:uiPriority="99"/>
+    <w:lsdException w:name="toc 4" w:locked="1" w:uiPriority="0" w:semiHidden="0" w:unhideWhenUsed="0"/>
+    <w:lsdException w:name="Normal" w:uiPriority="0" w:semiHidden="0" w:unhideWhenUsed="0" w:qFormat="1"/>
     <w:lsdException w:name="heading 2" w:uiPriority="99" w:semiHidden="0" w:unhideWhenUsed="0" w:qFormat="1"/>
-    <w:lsdException w:name="Table Grid" w:locked="1" w:uiPriority="99" w:semiHidden="0" w:unhideWhenUsed="0"/>
-    <w:lsdException w:name="footnote reference" w:uiPriority="99"/>
-    <w:lsdException w:name="List 3" w:uiPriority="99"/>
-    <w:lsdException w:name="Signature" w:uiPriority="99"/>
-    <w:lsdException w:name="Colorful Shading Accent 3" w:uiPriority="71" w:semiHidden="0" w:unhideWhenUsed="0"/>
-    <w:lsdException w:name="Dark List" w:uiPriority="70" w:semiHidden="0" w:unhideWhenUsed="0"/>
-    <w:lsdException w:name="Medium List 2 Accent 1" w:uiPriority="66" w:semiHidden="0" w:unhideWhenUsed="0"/>
-    <w:lsdException w:name="Normal (Web)" w:uiPriority="99"/>
-    <w:lsdException w:name="Colorful Grid Accent 3" w:uiPriority="73" w:semiHidden="0" w:unhideWhenUsed="0"/>
+    <w:lsdException w:name="Medium List 1 Accent 1" w:uiPriority="65" w:semiHidden="0" w:unhideWhenUsed="0"/>
+    <w:lsdException w:name="caption" w:locked="1" w:uiPriority="99" w:semiHidden="0" w:unhideWhenUsed="0" w:qFormat="1"/>
+    <w:lsdException w:name="Subtitle" w:locked="1" w:uiPriority="0" w:semiHidden="0" w:unhideWhenUsed="0" w:qFormat="1"/>
+    <w:lsdException w:name="HTML Acronym" w:uiPriority="99"/>
+    <w:lsdException w:name="Dark List Accent 4" w:uiPriority="70" w:semiHidden="0" w:unhideWhenUsed="0"/>
+    <w:lsdException w:name="toc 2" w:uiPriority="39" w:semiHidden="0" w:unhideWhenUsed="0"/>
+    <w:lsdException w:name="Table List 8" w:uiPriority="99"/>
     <w:lsdException w:name="Medium Shading 1 Accent 5" w:uiPriority="63" w:semiHidden="0" w:unhideWhenUsed="0"/>
-    <w:lsdException w:name="heading 8" w:locked="1" w:uiPriority="0" w:qFormat="1"/>
-    <w:lsdException w:name="Medium Grid 1 Accent 4" w:uiPriority="67" w:semiHidden="0" w:unhideWhenUsed="0"/>
-    <w:lsdException w:name="toc 5" w:locked="1" w:uiPriority="0" w:semiHidden="0" w:unhideWhenUsed="0"/>
+    <w:lsdException w:name="annotation text" w:uiPriority="99"/>
+    <w:lsdException w:name="Table Web 2" w:uiPriority="99"/>
+    <w:lsdException w:name="Colorful Grid Accent 6" w:uiPriority="73" w:semiHidden="0" w:unhideWhenUsed="0"/>
+    <w:lsdException w:name="Colorful List Accent 6" w:uiPriority="72" w:semiHidden="0" w:unhideWhenUsed="0"/>
+    <w:lsdException w:name="List Continue 2" w:uiPriority="99"/>
+    <w:lsdException w:name="Table List 3" w:uiPriority="99"/>
+    <w:lsdException w:name="Medium List 2 Accent 5" w:uiPriority="66" w:semiHidden="0" w:unhideWhenUsed="0"/>
+    <w:lsdException w:name="List 2" w:uiPriority="99"/>
+    <w:lsdException w:name="Dark List Accent 3" w:uiPriority="70" w:semiHidden="0" w:unhideWhenUsed="0"/>
+    <w:lsdException w:name="Light Grid Accent 2" w:uiPriority="62" w:semiHidden="0" w:unhideWhenUsed="0"/>
+    <w:lsdException w:name="HTML Cite" w:uiPriority="99"/>
+    <w:lsdException w:name="Medium List 1 Accent 2" w:uiPriority="65" w:semiHidden="0" w:unhideWhenUsed="0"/>
+    <w:lsdException w:name="Table Simple 2" w:uiPriority="99"/>
+    <w:lsdException w:name="Colorful Grid Accent 1" w:uiPriority="73" w:semiHidden="0" w:unhideWhenUsed="0"/>
+    <w:lsdException w:name="List 5" w:uiPriority="99"/>
+    <w:lsdException w:name="Table 3D effects 2" w:uiPriority="99"/>
+    <w:lsdException w:name="Colorful List Accent 1" w:uiPriority="72" w:semiHidden="0" w:unhideWhenUsed="0"/>
     <w:lsdException w:name="index 6" w:uiPriority="99"/>
-    <w:lsdException w:name="HTML Sample" w:uiPriority="99"/>
-    <w:lsdException w:name="Table Grid 7" w:uiPriority="99"/>
-    <w:lsdException w:name="Medium Grid 3 Accent 3" w:uiPriority="69" w:semiHidden="0" w:unhideWhenUsed="0"/>
-    <w:lsdException w:name="Medium Grid 1" w:uiPriority="67" w:semiHidden="0" w:unhideWhenUsed="0"/>
-    <w:lsdException w:name="Light List Accent 6" w:uiPriority="61" w:semiHidden="0" w:unhideWhenUsed="0"/>
-    <w:lsdException w:name="HTML Acronym" w:uiPriority="99"/>
-    <w:lsdException w:name="Note Heading" w:uiPriority="99"/>
-    <w:lsdException w:name="toa heading" w:uiPriority="99"/>
-    <w:lsdException w:name="Medium Shading 1 Accent 3" w:uiPriority="63" w:semiHidden="0" w:unhideWhenUsed="0"/>
-    <w:lsdException w:name="Table Classic 2" w:uiPriority="99"/>
-    <w:lsdException w:name="Medium Grid 3 Accent 5" w:uiPriority="69" w:semiHidden="0" w:unhideWhenUsed="0"/>
-    <w:lsdException w:name="Table Web 1" w:uiPriority="99"/>
-    <w:lsdException w:name="Medium Grid 1 Accent 2" w:uiPriority="67" w:semiHidden="0" w:unhideWhenUsed="0"/>
-    <w:lsdException w:name="Table Contemporary" w:uiPriority="99"/>
-    <w:lsdException w:name="Medium List 2 Accent 2" w:uiPriority="66" w:semiHidden="0" w:unhideWhenUsed="0"/>
-    <w:lsdException w:name="Colorful List Accent 6" w:uiPriority="72" w:semiHidden="0" w:unhideWhenUsed="0"/>
-    <w:lsdException w:name="List 2" w:uiPriority="99"/>
-    <w:lsdException w:name="Colorful Shading" w:uiPriority="71" w:semiHidden="0" w:unhideWhenUsed="0"/>
-    <w:lsdException w:name="Medium List 2 Accent 4" w:uiPriority="66" w:semiHidden="0" w:unhideWhenUsed="0"/>
-    <w:lsdException w:name="Light Grid Accent 4" w:uiPriority="62" w:semiHidden="0" w:unhideWhenUsed="0"/>
-    <w:lsdException w:name="List Number 2" w:uiPriority="99"/>
-    <w:lsdException w:name="List Continue" w:uiPriority="99"/>
-    <w:lsdException w:name="Medium Grid 2 Accent 2" w:uiPriority="68" w:semiHidden="0" w:unhideWhenUsed="0"/>
-    <w:lsdException w:name="Medium List 2 Accent 5" w:uiPriority="66" w:semiHidden="0" w:unhideWhenUsed="0"/>
-    <w:lsdException w:name="table of authorities" w:uiPriority="99"/>
-    <w:lsdException w:name="caption" w:locked="1" w:uiPriority="99" w:semiHidden="0" w:unhideWhenUsed="0" w:qFormat="1"/>
-    <w:lsdException w:name="Table Classic 1" w:uiPriority="99"/>
-    <w:lsdException w:name="Table Columns 5" w:uiPriority="99"/>
-    <w:lsdException w:name="List Bullet 3" w:uiPriority="99"/>
-    <w:lsdException w:name="Light List Accent 1" w:uiPriority="61" w:semiHidden="0" w:unhideWhenUsed="0"/>
-    <w:lsdException w:name="Medium Grid 3 Accent 1" w:uiPriority="69" w:semiHidden="0" w:unhideWhenUsed="0"/>
-    <w:lsdException w:name="Message Header" w:uiPriority="99"/>
-    <w:lsdException w:name="Medium Grid 1 Accent 6" w:uiPriority="67" w:semiHidden="0" w:unhideWhenUsed="0"/>
-    <w:lsdException w:name="Table Colorful 3" w:uiPriority="99"/>
-    <w:lsdException w:name="Medium Grid 1 Accent 5" w:uiPriority="67" w:semiHidden="0" w:unhideWhenUsed="0"/>
-    <w:lsdException w:name="Colorful Grid" w:uiPriority="73" w:semiHidden="0" w:unhideWhenUsed="0"/>
-    <w:lsdException w:name="Dark List Accent 2" w:uiPriority="70" w:semiHidden="0" w:unhideWhenUsed="0"/>
-    <w:lsdException w:name="Light Shading Accent 6" w:uiPriority="60" w:semiHidden="0" w:unhideWhenUsed="0"/>
-    <w:lsdException w:name="Medium List 2 Accent 6" w:uiPriority="66" w:semiHidden="0" w:unhideWhenUsed="0"/>
-    <w:lsdException w:name="Subtitle" w:locked="1" w:uiPriority="0" w:semiHidden="0" w:unhideWhenUsed="0" w:qFormat="1"/>
-    <w:lsdException w:name="Table Simple 3" w:uiPriority="99"/>
-    <w:lsdException w:name="Dark List Accent 4" w:uiPriority="70" w:semiHidden="0" w:unhideWhenUsed="0"/>
-    <w:lsdException w:name="Medium List 1 Accent 6" w:uiPriority="65" w:semiHidden="0" w:unhideWhenUsed="0"/>
-    <w:lsdException w:name="Colorful List Accent 2" w:uiPriority="72" w:semiHidden="0" w:unhideWhenUsed="0"/>
-    <w:lsdException w:name="Plain Text" w:uiPriority="99"/>
-    <w:lsdException w:name="index 4" w:uiPriority="99"/>
-    <w:lsdException w:name="Table List 4" w:uiPriority="99"/>
-    <w:lsdException w:name="heading 3" w:locked="1" w:uiPriority="99" w:semiHidden="0" w:unhideWhenUsed="0" w:qFormat="1"/>
-    <w:lsdException w:name="List Number 3" w:uiPriority="99"/>
+    <w:lsdException w:name="Light Grid Accent 5" w:uiPriority="62" w:semiHidden="0" w:unhideWhenUsed="0"/>
+    <w:lsdException w:name="Medium List 1 Accent 5" w:uiPriority="65" w:semiHidden="0" w:unhideWhenUsed="0"/>
     <w:lsdException w:name="Body Text Indent 2" w:uiPriority="99"/>
-    <w:lsdException w:name="List Bullet" w:uiPriority="99"/>
-    <w:lsdException w:name="Default Paragraph Font" w:uiPriority="1"/>
-    <w:lsdException w:name="Table Columns 1" w:uiPriority="99"/>
-    <w:lsdException w:name="line number" w:uiPriority="99"/>
-    <w:lsdException w:name="Table List 2" w:uiPriority="99"/>
-    <w:lsdException w:name="E-mail Signature" w:uiPriority="99"/>
-    <w:lsdException w:name="annotation reference" w:uiPriority="99"/>
-    <w:lsdException w:name="Closing" w:uiPriority="99"/>
-    <w:lsdException w:name="Body Text First Indent 2" w:uiPriority="99"/>
-    <w:lsdException w:name="heading 4" w:locked="1" w:uiPriority="0" w:qFormat="1"/>
-    <w:lsdException w:name="Hyperlink" w:uiPriority="99" w:semiHidden="0" w:unhideWhenUsed="0"/>
-    <w:lsdException w:name="Light Shading Accent 2" w:uiPriority="60" w:semiHidden="0" w:unhideWhenUsed="0"/>
-    <w:lsdException w:name="List Number 4" w:uiPriority="99"/>
-    <w:lsdException w:name="Light Grid Accent 6" w:uiPriority="62" w:semiHidden="0" w:unhideWhenUsed="0"/>
-    <w:lsdException w:name="envelope return" w:uiPriority="99"/>
-    <w:lsdException w:name="toc 2" w:uiPriority="39" w:semiHidden="0" w:unhideWhenUsed="0"/>
-    <w:lsdException w:name="Table Grid 4" w:uiPriority="99"/>
-    <w:lsdException w:name="Normal" w:uiPriority="0" w:semiHidden="0" w:unhideWhenUsed="0" w:qFormat="1"/>
-    <w:lsdException w:name="Medium Shading 2 Accent 4" w:uiPriority="64" w:semiHidden="0" w:unhideWhenUsed="0"/>
-    <w:lsdException w:name="HTML Definition" w:uiPriority="99"/>
-    <w:lsdException w:name="index 3" w:uiPriority="99"/>
-    <w:lsdException w:name="Body Text Indent" w:uiPriority="99"/>
-    <w:lsdException w:name="Medium List 1 Accent 2" w:uiPriority="65" w:semiHidden="0" w:unhideWhenUsed="0"/>
-    <w:lsdException w:name="Colorful List Accent 1" w:uiPriority="72" w:semiHidden="0" w:unhideWhenUsed="0"/>
-    <w:lsdException w:name="Light Grid Accent 3" w:uiPriority="62" w:semiHidden="0" w:unhideWhenUsed="0"/>
-    <w:lsdException w:name="Medium Shading 1" w:uiPriority="63" w:semiHidden="0" w:unhideWhenUsed="0"/>
-    <w:lsdException w:name="Title" w:locked="1" w:uiPriority="0" w:semiHidden="0" w:unhideWhenUsed="0" w:qFormat="1"/>
-    <w:lsdException w:name="List 5" w:uiPriority="99"/>
-    <w:lsdException w:name="Medium Shading 2 Accent 3" w:uiPriority="64" w:semiHidden="0" w:unhideWhenUsed="0"/>
-    <w:lsdException w:name="Colorful Shading Accent 4" w:uiPriority="71" w:semiHidden="0" w:unhideWhenUsed="0"/>
-    <w:lsdException w:name="FollowedHyperlink" w:uiPriority="99"/>
-    <w:lsdException w:name="Medium Grid 2 Accent 1" w:uiPriority="68" w:semiHidden="0" w:unhideWhenUsed="0"/>
-    <w:lsdException w:name="heading 7" w:locked="1" w:uiPriority="0" w:qFormat="1"/>
-    <w:lsdException w:name="Medium List 1" w:uiPriority="65" w:semiHidden="0" w:unhideWhenUsed="0"/>
-    <w:lsdException w:name="Date" w:uiPriority="99"/>
-    <w:lsdException w:name="Table Columns 2" w:uiPriority="99"/>
-    <w:lsdException w:name="Body Text" w:uiPriority="99"/>
-    <w:lsdException w:name="Table Columns 3" w:uiPriority="99"/>
-    <w:lsdException w:name="Body Text 3" w:uiPriority="99"/>
-    <w:lsdException w:name="List Bullet 4" w:uiPriority="99"/>
-    <w:lsdException w:name="macro" w:uiPriority="99"/>
-    <w:lsdException w:name="Light Grid Accent 1" w:uiPriority="62" w:semiHidden="0" w:unhideWhenUsed="0"/>
-    <w:lsdException w:name="Colorful Grid Accent 4" w:uiPriority="73" w:semiHidden="0" w:unhideWhenUsed="0"/>
-    <w:lsdException w:name="Light List Accent 3" w:uiPriority="61" w:semiHidden="0" w:unhideWhenUsed="0"/>
-    <w:lsdException w:name="Table List 6" w:uiPriority="99"/>
-    <w:lsdException w:name="toc 6" w:locked="1" w:uiPriority="0" w:semiHidden="0" w:unhideWhenUsed="0"/>
-    <w:lsdException w:name="Table Subtle 1" w:uiPriority="99"/>
-    <w:lsdException w:name="Light Shading Accent 1" w:uiPriority="60" w:semiHidden="0" w:unhideWhenUsed="0"/>
-    <w:lsdException w:name="Light List" w:uiPriority="61" w:semiHidden="0" w:unhideWhenUsed="0"/>
-    <w:lsdException w:name="Colorful List Accent 3" w:uiPriority="72" w:semiHidden="0" w:unhideWhenUsed="0"/>
-    <w:lsdException w:name="Medium Shading 2 Accent 5" w:uiPriority="64" w:semiHidden="0" w:unhideWhenUsed="0"/>
-    <w:lsdException w:name="Medium Grid 3 Accent 2" w:uiPriority="69" w:semiHidden="0" w:unhideWhenUsed="0"/>
     <w:lsdException w:name="Light Grid" w:uiPriority="62" w:semiHidden="0" w:unhideWhenUsed="0"/>
     <w:lsdException w:name="Table List 1" w:uiPriority="99"/>
-    <w:lsdException w:name="heading 5" w:locked="1" w:uiPriority="0" w:qFormat="1"/>
-    <w:lsdException w:name="Emphasis" w:locked="1" w:uiPriority="0" w:semiHidden="0" w:unhideWhenUsed="0" w:qFormat="1"/>
-    <w:lsdException w:name="Medium Grid 1 Accent 1" w:uiPriority="67" w:semiHidden="0" w:unhideWhenUsed="0"/>
-    <w:lsdException w:name="Colorful Shading Accent 2" w:uiPriority="71" w:semiHidden="0" w:unhideWhenUsed="0"/>
-    <w:lsdException w:name="Medium Shading 1 Accent 2" w:uiPriority="63" w:semiHidden="0" w:unhideWhenUsed="0"/>
-    <w:lsdException w:name="Light Grid Accent 2" w:uiPriority="62" w:semiHidden="0" w:unhideWhenUsed="0"/>
+    <w:lsdException w:name="footer" w:uiPriority="99" w:semiHidden="0" w:unhideWhenUsed="0"/>
+    <w:lsdException w:name="Medium Grid 2 Accent 1" w:uiPriority="68" w:semiHidden="0" w:unhideWhenUsed="0"/>
+    <w:lsdException w:name="Strong" w:locked="1" w:uiPriority="0" w:semiHidden="0" w:unhideWhenUsed="0" w:qFormat="1"/>
+    <w:lsdException w:name="Light List Accent 6" w:uiPriority="61" w:semiHidden="0" w:unhideWhenUsed="0"/>
     <w:lsdException w:name="Medium List 2" w:uiPriority="66" w:semiHidden="0" w:unhideWhenUsed="0"/>
+    <w:lsdException w:name="Salutation" w:uiPriority="99"/>
+    <w:lsdException w:name="List Continue" w:uiPriority="99"/>
+    <w:lsdException w:name="Medium Shading 2 Accent 4" w:uiPriority="64" w:semiHidden="0" w:unhideWhenUsed="0"/>
+    <w:lsdException w:name="Table Grid 8" w:uiPriority="99"/>
+    <w:lsdException w:name="Medium Shading 1 Accent 4" w:uiPriority="63" w:semiHidden="0" w:unhideWhenUsed="0"/>
+    <w:lsdException w:name="Table Grid 3" w:uiPriority="99"/>
+    <w:lsdException w:name="Dark List Accent 2" w:uiPriority="70" w:semiHidden="0" w:unhideWhenUsed="0"/>
+    <w:lsdException w:name="Light Shading" w:uiPriority="60" w:semiHidden="0" w:unhideWhenUsed="0"/>
+    <w:lsdException w:name="Title" w:locked="1" w:uiPriority="0" w:semiHidden="0" w:unhideWhenUsed="0" w:qFormat="1"/>
+    <w:lsdException w:name="Medium Shading 1 Accent 3" w:uiPriority="63" w:semiHidden="0" w:unhideWhenUsed="0"/>
+    <w:lsdException w:name="Medium Grid 1 Accent 2" w:uiPriority="67" w:semiHidden="0" w:unhideWhenUsed="0"/>
+    <w:lsdException w:name="Light List" w:uiPriority="61" w:semiHidden="0" w:unhideWhenUsed="0"/>
+    <w:lsdException w:name="Light Grid Accent 6" w:uiPriority="62" w:semiHidden="0" w:unhideWhenUsed="0"/>
+    <w:lsdException w:name="Body Text 3" w:uiPriority="99"/>
+    <w:lsdException w:name="Normal Indent" w:uiPriority="99"/>
+    <w:lsdException w:name="Table Grid 1" w:uiPriority="99"/>
+    <w:lsdException w:name="List Number 2" w:uiPriority="99"/>
+    <w:lsdException w:name="Light List Accent 2" w:uiPriority="61" w:semiHidden="0" w:unhideWhenUsed="0"/>
+    <w:lsdException w:name="Medium Shading 2 Accent 3" w:uiPriority="64" w:semiHidden="0" w:unhideWhenUsed="0"/>
+    <w:lsdException w:name="Medium Grid 1" w:uiPriority="67" w:semiHidden="0" w:unhideWhenUsed="0"/>
+    <w:lsdException w:name="Plain Text" w:uiPriority="99"/>
     <w:lsdException w:name="Table 3D effects 3" w:uiPriority="99"/>
-    <w:lsdException w:name="Strong" w:locked="1" w:uiPriority="0" w:semiHidden="0" w:unhideWhenUsed="0" w:qFormat="1"/>
-    <w:lsdException w:name="List Number" w:uiPriority="99"/>
-    <w:lsdException w:name="Table List 8" w:uiPriority="99"/>
-    <w:lsdException w:name="Colorful List Accent 4" w:uiPriority="72" w:semiHidden="0" w:unhideWhenUsed="0"/>
-    <w:lsdException w:name="envelope address" w:uiPriority="99"/>
-    <w:lsdException w:name="Table Elegant" w:uiPriority="99"/>
-    <w:lsdException w:name="Medium Shading 2" w:uiPriority="64" w:semiHidden="0" w:unhideWhenUsed="0"/>
-    <w:lsdException w:name="Table Theme" w:uiPriority="99"/>
-    <w:lsdException w:name="heading 6" w:locked="1" w:uiPriority="0" w:qFormat="1"/>
-    <w:lsdException w:name="HTML Preformatted" w:uiPriority="99"/>
-    <w:lsdException w:name="Dark List Accent 3" w:uiPriority="70" w:semiHidden="0" w:unhideWhenUsed="0"/>
-    <w:lsdException w:name="List Continue 5" w:uiPriority="99"/>
-    <w:lsdException w:name="Table Grid 6" w:uiPriority="99"/>
-    <w:lsdException w:name="index 2" w:uiPriority="99"/>
-    <w:lsdException w:name="annotation text" w:uiPriority="99"/>
+    <w:lsdException w:name="Table Subtle 2" w:uiPriority="99"/>
+    <w:lsdException w:name="List Bullet 2" w:uiPriority="99"/>
+    <w:lsdException w:name="Table Professional" w:uiPriority="99"/>
+    <w:lsdException w:name="Table Grid 2" w:uiPriority="99"/>
+    <w:lsdException w:name="Placeholder Text" w:uiPriority="99" w:unhideWhenUsed="0"/>
+    <w:lsdException w:name="Medium Grid 3 Accent 1" w:uiPriority="69" w:semiHidden="0" w:unhideWhenUsed="0"/>
+    <w:lsdException w:name="Table Columns 5" w:uiPriority="99"/>
+    <w:lsdException w:name="envelope return" w:uiPriority="99"/>
+    <w:lsdException w:name="List Bullet 4" w:uiPriority="99"/>
     <w:lsdException w:name="Medium Shading 2 Accent 2" w:uiPriority="64" w:semiHidden="0" w:unhideWhenUsed="0"/>
-    <w:lsdException w:name="Medium Grid 3" w:uiPriority="69" w:semiHidden="0" w:unhideWhenUsed="0"/>
-    <w:lsdException w:name="Medium Shading 1 Accent 1" w:uiPriority="63" w:semiHidden="0" w:unhideWhenUsed="0"/>
-    <w:lsdException w:name="toc 8" w:locked="1" w:uiPriority="0" w:semiHidden="0" w:unhideWhenUsed="0"/>
-    <w:lsdException w:name="index 8" w:uiPriority="99"/>
-    <w:lsdException w:name="Light List Accent 4" w:uiPriority="61" w:semiHidden="0" w:unhideWhenUsed="0"/>
-    <w:lsdException w:name="Light Shading Accent 3" w:uiPriority="60" w:semiHidden="0" w:unhideWhenUsed="0"/>
-    <w:lsdException w:name="Body Text 2" w:uiPriority="99"/>
-    <w:lsdException w:name="Block Text" w:uiPriority="99"/>
-    <w:lsdException w:name="header" w:uiPriority="99" w:semiHidden="0" w:unhideWhenUsed="0"/>
-    <w:lsdException w:name="Dark List Accent 1" w:uiPriority="70" w:semiHidden="0" w:unhideWhenUsed="0"/>
-    <w:lsdException w:name="Table List 5" w:uiPriority="99"/>
-    <w:lsdException w:name="Light Shading Accent 4" w:uiPriority="60" w:semiHidden="0" w:unhideWhenUsed="0"/>
-    <w:lsdException w:name="Medium List 1 Accent 3" w:uiPriority="65" w:semiHidden="0" w:unhideWhenUsed="0"/>
-    <w:lsdException w:name="HTML Code" w:uiPriority="99"/>
-    <w:lsdException w:name="Colorful Shading Accent 6" w:uiPriority="71" w:semiHidden="0" w:unhideWhenUsed="0"/>
-    <w:lsdException w:name="Table Grid 1" w:uiPriority="99"/>
-    <w:lsdException w:name="Medium Grid 2 Accent 3" w:uiPriority="68" w:semiHidden="0" w:unhideWhenUsed="0"/>
-    <w:lsdException w:name="Medium Shading 1 Accent 6" w:uiPriority="63" w:semiHidden="0" w:unhideWhenUsed="0"/>
-    <w:lsdException w:name="heading 9" w:locked="1" w:uiPriority="0" w:qFormat="1"/>
-    <w:lsdException w:name="HTML Cite" w:uiPriority="99"/>
-    <w:lsdException w:name="page number" w:uiPriority="99"/>
-    <w:lsdException w:name="index 7" w:uiPriority="99"/>
-    <w:lsdException w:name="Medium Shading 2 Accent 1" w:uiPriority="64" w:semiHidden="0" w:unhideWhenUsed="0"/>
-    <w:lsdException w:name="HTML Typewriter" w:uiPriority="99"/>
-    <w:lsdException w:name="index heading" w:uiPriority="99"/>
-    <w:lsdException w:name="Dark List Accent 6" w:uiPriority="70" w:semiHidden="0" w:unhideWhenUsed="0"/>
-    <w:lsdException w:name="Medium Grid 2 Accent 4" w:uiPriority="68" w:semiHidden="0" w:unhideWhenUsed="0"/>
-    <w:lsdException w:name="toc 4" w:locked="1" w:uiPriority="0" w:semiHidden="0" w:unhideWhenUsed="0"/>
-    <w:lsdException w:name="Table Columns 4" w:uiPriority="99"/>
-    <w:lsdException w:name="Placeholder Text" w:uiPriority="99" w:unhideWhenUsed="0"/>
-    <w:lsdException w:name="Colorful Grid Accent 6" w:uiPriority="73" w:semiHidden="0" w:unhideWhenUsed="0"/>
-    <w:lsdException w:name="index 1" w:uiPriority="99"/>
-    <w:lsdException w:name="table of figures" w:uiPriority="99" w:semiHidden="0"/>
-    <w:lsdException w:name="Light Shading" w:uiPriority="60" w:semiHidden="0" w:unhideWhenUsed="0"/>
-    <w:lsdException w:name="Table Subtle 2" w:uiPriority="99"/>
-    <w:lsdException w:name="Table Grid 2" w:uiPriority="99"/>
-    <w:lsdException w:name="Colorful List Accent 5" w:uiPriority="72" w:semiHidden="0" w:unhideWhenUsed="0"/>
-    <w:lsdException w:name="Colorful Shading Accent 1" w:uiPriority="71" w:semiHidden="0" w:unhideWhenUsed="0"/>
-    <w:lsdException w:name="Medium List 1 Accent 5" w:uiPriority="65" w:semiHidden="0" w:unhideWhenUsed="0"/>
-    <w:lsdException w:name="footer" w:uiPriority="99" w:semiHidden="0" w:unhideWhenUsed="0"/>
-    <w:lsdException w:name="Table Grid 8" w:uiPriority="99"/>
-    <w:lsdException w:name="List Paragraph" w:uiPriority="34" w:semiHidden="0" w:unhideWhenUsed="0" w:qFormat="1"/>
-    <w:lsdException w:name="Medium List 1 Accent 4" w:uiPriority="65" w:semiHidden="0" w:unhideWhenUsed="0"/>
-    <w:lsdException w:name="Table List 7" w:uiPriority="99"/>
-    <w:lsdException w:name="toc 7" w:locked="1" w:uiPriority="0" w:semiHidden="0" w:unhideWhenUsed="0"/>
-    <w:lsdException w:name="Table 3D effects 1" w:uiPriority="99"/>
-    <w:lsdException w:name="endnote text" w:uiPriority="99"/>
-    <w:lsdException w:name="Body Text Indent 3" w:uiPriority="99"/>
-    <w:lsdException w:name="HTML Variable" w:uiPriority="99"/>
-    <w:lsdException w:name="Light Grid Accent 5" w:uiPriority="62" w:semiHidden="0" w:unhideWhenUsed="0"/>
-    <w:lsdException w:name="Dark List Accent 5" w:uiPriority="70" w:semiHidden="0" w:unhideWhenUsed="0"/>
-    <w:lsdException w:name="toc 1" w:uiPriority="39" w:semiHidden="0" w:unhideWhenUsed="0"/>
-    <w:lsdException w:name="index 5" w:uiPriority="99"/>
-    <w:lsdException w:name="List Bullet 2" w:uiPriority="99"/>
-    <w:lsdException w:name="Normal Indent" w:uiPriority="99"/>
-    <w:lsdException w:name="Light Shading Accent 5" w:uiPriority="60" w:semiHidden="0" w:unhideWhenUsed="0"/>
-    <w:lsdException w:name="Medium Shading 1 Accent 4" w:uiPriority="63" w:semiHidden="0" w:unhideWhenUsed="0"/>
-    <w:lsdException w:name="heading 1" w:uiPriority="99" w:semiHidden="0" w:unhideWhenUsed="0" w:qFormat="1"/>
-    <w:lsdException w:name="List Continue 2" w:uiPriority="99"/>
-    <w:lsdException w:name="Table Classic 4" w:uiPriority="99"/>
-    <w:lsdException w:name="Colorful Shading Accent 5" w:uiPriority="71" w:semiHidden="0" w:unhideWhenUsed="0"/>
-    <w:lsdException w:name="Table Web 3" w:uiPriority="99"/>
-    <w:lsdException w:name="Table Colorful 2" w:uiPriority="99"/>
-    <w:lsdException w:name="Colorful Grid Accent 2" w:uiPriority="73" w:semiHidden="0" w:unhideWhenUsed="0"/>
-    <w:lsdException w:name="endnote reference" w:uiPriority="99"/>
-    <w:lsdException w:name="footnote text" w:uiPriority="99"/>
-    <w:lsdException w:name="annotation subject" w:uiPriority="99"/>
-    <w:lsdException w:name="Table List 3" w:uiPriority="99"/>
-    <w:lsdException w:name="Table Colorful 1" w:uiPriority="99"/>
-    <w:lsdException w:name="Normal Table" w:uiPriority="99"/>
-    <w:lsdException w:name="Medium Grid 2" w:uiPriority="68" w:semiHidden="0" w:unhideWhenUsed="0"/>
-    <w:lsdException w:name="index 9" w:uiPriority="99"/>
-    <w:lsdException w:name="Medium Grid 3 Accent 4" w:uiPriority="69" w:semiHidden="0" w:unhideWhenUsed="0"/>
-    <w:lsdException w:name="toc 3" w:locked="1" w:uiPriority="39" w:semiHidden="0" w:unhideWhenUsed="0"/>
-    <w:lsdException w:name="Medium List 2 Accent 3" w:uiPriority="66" w:semiHidden="0" w:unhideWhenUsed="0"/>
-    <w:lsdException w:name="List" w:uiPriority="99"/>
-    <w:lsdException w:name="List 4" w:uiPriority="99"/>
-    <w:lsdException w:name="Colorful Grid Accent 5" w:uiPriority="73" w:semiHidden="0" w:unhideWhenUsed="0"/>
-    <w:lsdException w:name="Table Classic 3" w:uiPriority="99"/>
-    <w:lsdException w:name="Balloon Text" w:uiPriority="99" w:unhideWhenUsed="0"/>
-    <w:lsdException w:name="Table Simple 2" w:uiPriority="99"/>
-    <w:lsdException w:name="HTML Address" w:uiPriority="99"/>
-    <w:lsdException w:name="Medium Shading 2 Accent 6" w:uiPriority="64" w:semiHidden="0" w:unhideWhenUsed="0"/>
-    <w:lsdException w:name="Medium Grid 2 Accent 5" w:uiPriority="68" w:semiHidden="0" w:unhideWhenUsed="0"/>
-    <w:lsdException w:name="Salutation" w:uiPriority="99"/>
-    <w:lsdException w:name="List Continue 3" w:uiPriority="99"/>
-    <w:lsdException w:name="Table Web 2" w:uiPriority="99"/>
-    <w:lsdException w:name="Table 3D effects 2" w:uiPriority="99"/>
-    <w:lsdException w:name="Table Professional" w:uiPriority="99"/>
-    <w:lsdException w:name="toc 9" w:locked="1" w:uiPriority="0" w:semiHidden="0" w:unhideWhenUsed="0"/>
-    <w:lsdException w:name="List Number 5" w:uiPriority="99"/>
-    <w:lsdException w:name="Light List Accent 5" w:uiPriority="61" w:semiHidden="0" w:unhideWhenUsed="0"/>
-    <w:lsdException w:name="Colorful Grid Accent 1" w:uiPriority="73" w:semiHidden="0" w:unhideWhenUsed="0"/>
-    <w:lsdException w:name="Document Map" w:uiPriority="99"/>
-    <w:lsdException w:name="Table Grid 3" w:uiPriority="99"/>
-    <w:lsdException w:name="Medium List 1 Accent 1" w:uiPriority="65" w:semiHidden="0" w:unhideWhenUsed="0"/>
-    <w:lsdException w:name="List Bullet 5" w:uiPriority="99"/>
+    <w:lsdException w:name="macro" w:uiPriority="99"/>
   </w:latentStyles>
-  <w:style w:type="paragraph" w:styleId="000027">
-    <w:name w:val="List Paragraph"/>
+  <w:style w:type="paragraph" w:styleId="000017">
+    <w:name w:val="endnote text"/>
     <w:basedOn w:val="00000c"/>
-    <w:uiPriority w:val="34"/>
-    <w:qFormat w:val="1"/>
-    <w:pPr>
-      <w:ind w:firstLine="0"/>
-      <w:contextualSpacing w:val="1"/>
-    </w:pPr>
-  </w:style>
-  <w:style w:type="paragraph" w:styleId="00001f">
-    <w:name w:val="toc 2"/>
-    <w:basedOn w:val="00000c"/>
-    <w:next w:val="00000c"/>
-    <w:autoRedefine w:val="1"/>
-    <w:uiPriority w:val="39"/>
-    <w:pPr>
-      <w:spacing w:after="100"/>
-      <w:ind w:left="397" w:firstLine="0"/>
-    </w:pPr>
-  </w:style>
-  <w:style w:type="character" w:styleId="00001a" w:customStyle="1">
-    <w:name w:val="批注框文本 字符"/>
-    <w:basedOn w:val="000013"/>
-    <w:link w:val="000019"/>
+    <w:link w:val="000018"/>
     <w:uiPriority w:val="99"/>
     <w:semiHidden w:val="1"/>
-    <w:qFormat w:val="1"/>
-    <w:locked w:val="1"/>
+    <w:unhideWhenUsed w:val="1"/>
+    <w:pPr>
+      <w:spacing w:after="0"/>
+      <w:ind w:left="57" w:hanging="57"/>
+    </w:pPr>
+    <w:rPr>
+      <w:sz w:val="20"/>
+      <w:szCs w:val="20"/>
+    </w:rPr>
+  </w:style>
+  <w:style w:type="character" w:styleId="000013" w:default="1">
+    <w:name w:val="Default Paragraph Font"/>
+    <w:uiPriority w:val="1"/>
+    <w:semiHidden w:val="1"/>
+    <w:unhideWhenUsed w:val="1"/>
+  </w:style>
+  <w:style w:type="paragraph" w:styleId="000019">
+    <w:name w:val="Balloon Text"/>
+    <w:basedOn w:val="00000c"/>
+    <w:link w:val="00001a"/>
+    <w:uiPriority w:val="99"/>
+    <w:semiHidden w:val="1"/>
+    <w:pPr>
+      <w:spacing w:after="0"/>
+    </w:pPr>
     <w:rPr>
       <w:rFonts w:ascii="Tahoma" w:hAnsi="Tahoma" w:cs="Tahoma"/>
       <w:sz w:val="16"/>
       <w:szCs w:val="16"/>
     </w:rPr>
   </w:style>
-  <w:style w:type="paragraph" w:styleId="00000f">
-    <w:name w:val="heading 2"/>
+  <w:style w:type="table" w:styleId="000014" w:default="1">
+    <w:name w:val="Normal Table"/>
+    <w:uiPriority w:val="99"/>
+    <w:semiHidden w:val="1"/>
+    <w:unhideWhenUsed w:val="1"/>
+    <w:tblPr>
+      <w:tblCellMar>
+        <w:top w:w="0" w:type="dxa"/>
+        <w:left w:w="108" w:type="dxa"/>
+        <w:bottom w:w="0" w:type="dxa"/>
+        <w:right w:w="108" w:type="dxa"/>
+      </w:tblCellMar>
+    </w:tblPr>
+  </w:style>
+  <w:style w:type="paragraph" w:styleId="00000d">
+    <w:name w:val="heading 1"/>
     <w:basedOn w:val="00000c"/>
     <w:next w:val="00000c"/>
-    <w:link w:val="000010"/>
+    <w:link w:val="00000e"/>
     <w:uiPriority w:val="99"/>
     <w:qFormat w:val="1"/>
     <w:pPr>
@@ -2295,14 +2311,63 @@
       <w:keepLines w:val="1"/>
       <w:spacing w:before="200" w:after="120"/>
       <w:ind w:firstLine="0"/>
-      <w:outlineLvl w:val="1"/>
+      <w:jc w:val="center"/>
+      <w:outlineLvl w:val="0"/>
     </w:pPr>
     <w:rPr>
       <w:rFonts w:ascii="Times New Roman" w:hAnsi="Times New Roman"/>
       <w:b w:val="1"/>
       <w:bCs w:val="1"/>
-      <w:sz w:val="26"/>
-      <w:szCs w:val="26"/>
+      <w:sz w:val="32"/>
+      <w:szCs w:val="28"/>
+    </w:rPr>
+  </w:style>
+  <w:style w:type="character" w:styleId="00001c" w:customStyle="1">
+    <w:name w:val="页眉 字符"/>
+    <w:basedOn w:val="000013"/>
+    <w:link w:val="000006"/>
+    <w:uiPriority w:val="99"/>
+    <w:qFormat w:val="1"/>
+    <w:locked w:val="1"/>
+    <w:rPr>
+      <w:rFonts w:eastAsia="DFKai-SB" w:cs="Times New Roman"/>
+      <w:sz w:val="22"/>
+      <w:szCs w:val="22"/>
+      <w:lang w:val="en-US" w:eastAsia="en-US" w:bidi="ar-SA"/>
+    </w:rPr>
+  </w:style>
+  <w:style w:type="paragraph" w:styleId="000003">
+    <w:name w:val="footer"/>
+    <w:basedOn w:val="00000c"/>
+    <w:link w:val="00001b"/>
+    <w:uiPriority w:val="99"/>
+    <w:pPr>
+      <w:tabs>
+        <w:tab w:val="center" w:pos="4680"/>
+        <w:tab w:val="right" w:pos="9360"/>
+      </w:tabs>
+      <w:spacing w:after="0"/>
+    </w:pPr>
+  </w:style>
+  <w:style w:type="paragraph" w:styleId="00001d">
+    <w:name w:val="toc 1"/>
+    <w:basedOn w:val="00000c"/>
+    <w:next w:val="00000c"/>
+    <w:autoRedefine w:val="1"/>
+    <w:uiPriority w:val="39"/>
+    <w:pPr>
+      <w:spacing w:after="100"/>
+      <w:ind w:firstLine="0"/>
+    </w:pPr>
+  </w:style>
+  <w:style w:type="character" w:styleId="000024">
+    <w:name w:val="Hyperlink"/>
+    <w:basedOn w:val="000013"/>
+    <w:uiPriority w:val="99"/>
+    <w:rPr>
+      <w:rFonts w:cs="Times New Roman"/>
+      <w:color w:val="0000FF"/>
+      <w:u w:val="single"/>
     </w:rPr>
   </w:style>
   <w:style w:type="paragraph" w:styleId="000006">
@@ -2321,6 +2386,218 @@
     </w:pPr>
     <w:rPr>
       <w:sz w:val="20"/>
+    </w:rPr>
+  </w:style>
+  <w:style w:type="paragraph" w:styleId="000016">
+    <w:name w:val="toc 3"/>
+    <w:basedOn w:val="00000c"/>
+    <w:next w:val="00000c"/>
+    <w:autoRedefine w:val="1"/>
+    <w:uiPriority w:val="39"/>
+    <w:locked w:val="1"/>
+    <w:pPr>
+      <w:ind w:left="397" w:firstLine="0"/>
+    </w:pPr>
+    <w:rPr>
+      <w:i w:val="1"/>
+    </w:rPr>
+  </w:style>
+  <w:style w:type="character" w:styleId="000023">
+    <w:name w:val="Emphasis"/>
+    <w:basedOn w:val="000013"/>
+    <w:uiPriority w:val="0"/>
+    <w:qFormat w:val="1"/>
+    <w:locked w:val="1"/>
+    <w:rPr>
+      <w:i w:val="1"/>
+      <w:iCs w:val="1"/>
+    </w:rPr>
+  </w:style>
+  <w:style w:type="character" w:styleId="000026">
+    <w:name w:val="Placeholder Text"/>
+    <w:basedOn w:val="000013"/>
+    <w:uiPriority w:val="99"/>
+    <w:semiHidden w:val="1"/>
+    <w:rPr>
+      <w:color w:val="808080"/>
+    </w:rPr>
+  </w:style>
+  <w:style w:type="character" w:styleId="00000e" w:customStyle="1">
+    <w:name w:val="标题 1 字符"/>
+    <w:basedOn w:val="000013"/>
+    <w:link w:val="00000d"/>
+    <w:uiPriority w:val="99"/>
+    <w:locked w:val="1"/>
+    <w:rPr>
+      <w:rFonts w:ascii="Times New Roman" w:hAnsi="Times New Roman" w:eastAsia="DFKai-SB"/>
+      <w:b w:val="1"/>
+      <w:bCs w:val="1"/>
+      <w:sz w:val="36"/>
+      <w:szCs w:val="28"/>
+      <w:lang w:eastAsia="en-US"/>
+    </w:rPr>
+  </w:style>
+  <w:style w:type="character" w:styleId="000010" w:customStyle="1">
+    <w:name w:val="标题 2 字符"/>
+    <w:basedOn w:val="000013"/>
+    <w:link w:val="00000f"/>
+    <w:uiPriority w:val="99"/>
+    <w:locked w:val="1"/>
+    <w:rPr>
+      <w:rFonts w:ascii="Times New Roman" w:hAnsi="Times New Roman" w:eastAsia="DFKai-SB"/>
+      <w:b w:val="1"/>
+      <w:bCs w:val="1"/>
+      <w:sz w:val="32"/>
+      <w:szCs w:val="26"/>
+      <w:lang w:eastAsia="en-US"/>
+    </w:rPr>
+  </w:style>
+  <w:style w:type="paragraph" w:styleId="00001e">
+    <w:name w:val="table of figures"/>
+    <w:basedOn w:val="00000c"/>
+    <w:next w:val="00000c"/>
+    <w:uiPriority w:val="99"/>
+    <w:unhideWhenUsed w:val="1"/>
+    <w:pPr>
+      <w:spacing w:after="0"/>
+      <w:ind w:firstLine="0"/>
+    </w:pPr>
+  </w:style>
+  <w:style w:type="table" w:styleId="000020">
+    <w:name w:val="Table Grid"/>
+    <w:basedOn w:val="000014"/>
+    <w:uiPriority w:val="99"/>
+    <w:locked w:val="1"/>
+    <w:pPr>
+      <w:spacing w:after="200" w:line="360" w:lineRule="auto"/>
+      <w:ind w:firstLine="720"/>
+    </w:pPr>
+    <w:rPr>
+      <w:rFonts w:eastAsia="Times New Roman"/>
+    </w:rPr>
+    <w:tblPr>
+      <w:tblBorders>
+        <w:top w:val="single" w:color="auto" w:sz="4" w:space="0"/>
+        <w:left w:val="single" w:color="auto" w:sz="4" w:space="0"/>
+        <w:bottom w:val="single" w:color="auto" w:sz="4" w:space="0"/>
+        <w:right w:val="single" w:color="auto" w:sz="4" w:space="0"/>
+        <w:insideH w:val="single" w:color="auto" w:sz="4" w:space="0"/>
+        <w:insideV w:val="single" w:color="auto" w:sz="4" w:space="0"/>
+      </w:tblBorders>
+    </w:tblPr>
+  </w:style>
+  <w:style w:type="paragraph" w:styleId="000027">
+    <w:name w:val="List Paragraph"/>
+    <w:basedOn w:val="00000c"/>
+    <w:uiPriority w:val="34"/>
+    <w:qFormat w:val="1"/>
+    <w:pPr>
+      <w:ind w:firstLine="0"/>
+      <w:contextualSpacing w:val="1"/>
+    </w:pPr>
+  </w:style>
+  <w:style w:type="character" w:styleId="00001a" w:customStyle="1">
+    <w:name w:val="批注框文本 字符"/>
+    <w:basedOn w:val="000013"/>
+    <w:link w:val="000019"/>
+    <w:uiPriority w:val="99"/>
+    <w:semiHidden w:val="1"/>
+    <w:qFormat w:val="1"/>
+    <w:locked w:val="1"/>
+    <w:rPr>
+      <w:rFonts w:ascii="Tahoma" w:hAnsi="Tahoma" w:cs="Tahoma"/>
+      <w:sz w:val="16"/>
+      <w:szCs w:val="16"/>
+    </w:rPr>
+  </w:style>
+  <w:style w:type="paragraph" w:styleId="00000c" w:default="1">
+    <w:name w:val="Normal"/>
+    <w:uiPriority w:val="0"/>
+    <w:qFormat w:val="1"/>
+    <w:pPr>
+      <w:spacing w:after="120" w:line="276" w:lineRule="auto"/>
+      <w:ind w:firstLine="595"/>
+    </w:pPr>
+    <w:rPr>
+      <w:rFonts w:ascii="Times New Roman" w:hAnsi="Times New Roman" w:eastAsia="DFKai-SB" w:cs="Times New Roman"/>
+      <w:sz w:val="22"/>
+      <w:szCs w:val="22"/>
+      <w:lang w:val="en-US" w:eastAsia="en-US" w:bidi="ar-SA"/>
+    </w:rPr>
+  </w:style>
+  <w:style w:type="character" w:styleId="000012" w:customStyle="1">
+    <w:name w:val="标题 3 字符"/>
+    <w:basedOn w:val="000013"/>
+    <w:link w:val="000011"/>
+    <w:uiPriority w:val="99"/>
+    <w:locked w:val="1"/>
+    <w:rPr>
+      <w:rFonts w:ascii="Times New Roman" w:hAnsi="Times New Roman" w:eastAsia="DFKai-SB" w:cs="Arial"/>
+      <w:bCs w:val="1"/>
+      <w:i w:val="1"/>
+      <w:sz w:val="28"/>
+      <w:szCs w:val="26"/>
+      <w:lang w:eastAsia="en-US"/>
+    </w:rPr>
+  </w:style>
+  <w:style w:type="character" w:styleId="00001b" w:customStyle="1">
+    <w:name w:val="页脚 字符"/>
+    <w:basedOn w:val="000013"/>
+    <w:link w:val="000003"/>
+    <w:uiPriority w:val="99"/>
+    <w:qFormat w:val="1"/>
+    <w:locked w:val="1"/>
+    <w:rPr>
+      <w:rFonts w:ascii="Times New Roman" w:hAnsi="Times New Roman" w:cs="Times New Roman"/>
+      <w:sz w:val="24"/>
+    </w:rPr>
+  </w:style>
+  <w:style w:type="character" w:styleId="000022">
+    <w:name w:val="FollowedHyperlink"/>
+    <w:basedOn w:val="000013"/>
+    <w:uiPriority w:val="99"/>
+    <w:semiHidden w:val="1"/>
+    <w:unhideWhenUsed w:val="1"/>
+    <w:rPr>
+      <w:color w:val="800080" w:themeColor="followedHyperlink"/>
+      <w:u w:val="single"/>
+      <w14:textFill>
+        <w14:solidFill>
+          <w14:schemeClr w14:val="folHlink"/>
+        </w14:solidFill>
+      </w14:textFill>
+    </w:rPr>
+  </w:style>
+  <w:style w:type="paragraph" w:styleId="000025" w:customStyle="1">
+    <w:name w:val="Style Heading 1 + (Asian) DFKai-SB"/>
+    <w:basedOn w:val="00000d"/>
+    <w:uiPriority w:val="99"/>
+  </w:style>
+  <w:style w:type="character" w:styleId="000018" w:customStyle="1">
+    <w:name w:val="尾注文本 字符"/>
+    <w:basedOn w:val="000013"/>
+    <w:link w:val="000017"/>
+    <w:uiPriority w:val="99"/>
+    <w:semiHidden w:val="1"/>
+    <w:rPr>
+      <w:rFonts w:ascii="Times New Roman" w:hAnsi="Times New Roman" w:eastAsia="DFKai-SB"/>
+      <w:lang w:eastAsia="en-US"/>
+    </w:rPr>
+  </w:style>
+  <w:style w:type="paragraph" w:styleId="000015">
+    <w:name w:val="caption"/>
+    <w:basedOn w:val="00000c"/>
+    <w:next w:val="00000c"/>
+    <w:uiPriority w:val="99"/>
+    <w:qFormat w:val="1"/>
+    <w:locked w:val="1"/>
+    <w:pPr>
+      <w:ind w:firstLine="0"/>
+      <w:jc w:val="center"/>
+    </w:pPr>
+    <w:rPr>
+      <w:bCs w:val="1"/>
+      <w:szCs w:val="20"/>
     </w:rPr>
   </w:style>
   <w:style w:type="paragraph" w:styleId="000011">
@@ -2346,19 +2623,16 @@
       <w:szCs w:val="26"/>
     </w:rPr>
   </w:style>
-  <w:style w:type="paragraph" w:styleId="000016">
-    <w:name w:val="toc 3"/>
+  <w:style w:type="paragraph" w:styleId="00001f">
+    <w:name w:val="toc 2"/>
     <w:basedOn w:val="00000c"/>
     <w:next w:val="00000c"/>
     <w:autoRedefine w:val="1"/>
     <w:uiPriority w:val="39"/>
-    <w:locked w:val="1"/>
     <w:pPr>
+      <w:spacing w:after="100"/>
       <w:ind w:left="397" w:firstLine="0"/>
     </w:pPr>
-    <w:rPr>
-      <w:i w:val="1"/>
-    </w:rPr>
   </w:style>
   <w:style w:type="character" w:styleId="000028" w:customStyle="1">
     <w:name w:val="Unresolved Mention"/>
@@ -2371,147 +2645,26 @@
       <w:shd w:val="clear" w:color="auto" w:fill="E1DFDD"/>
     </w:rPr>
   </w:style>
-  <w:style w:type="character" w:styleId="000018" w:customStyle="1">
-    <w:name w:val="尾注文本 字符"/>
-    <w:basedOn w:val="000013"/>
-    <w:link w:val="000017"/>
+  <w:style w:type="paragraph" w:styleId="00000f">
+    <w:name w:val="heading 2"/>
+    <w:basedOn w:val="00000c"/>
+    <w:next w:val="00000c"/>
+    <w:link w:val="000010"/>
     <w:uiPriority w:val="99"/>
-    <w:semiHidden w:val="1"/>
+    <w:qFormat w:val="1"/>
+    <w:pPr>
+      <w:keepNext w:val="1"/>
+      <w:keepLines w:val="1"/>
+      <w:spacing w:before="200" w:after="120"/>
+      <w:ind w:firstLine="0"/>
+      <w:outlineLvl w:val="1"/>
+    </w:pPr>
     <w:rPr>
-      <w:rFonts w:ascii="Times New Roman" w:hAnsi="Times New Roman" w:eastAsia="DFKai-SB"/>
-      <w:lang w:eastAsia="en-US"/>
-    </w:rPr>
-  </w:style>
-  <w:style w:type="character" w:styleId="00000e" w:customStyle="1">
-    <w:name w:val="标题 1 字符"/>
-    <w:basedOn w:val="000013"/>
-    <w:link w:val="00000d"/>
-    <w:uiPriority w:val="99"/>
-    <w:locked w:val="1"/>
-    <w:rPr>
-      <w:rFonts w:ascii="Times New Roman" w:hAnsi="Times New Roman" w:eastAsia="DFKai-SB"/>
+      <w:rFonts w:ascii="Times New Roman" w:hAnsi="Times New Roman"/>
       <w:b w:val="1"/>
       <w:bCs w:val="1"/>
-      <w:sz w:val="36"/>
-      <w:szCs w:val="28"/>
-      <w:lang w:eastAsia="en-US"/>
-    </w:rPr>
-  </w:style>
-  <w:style w:type="character" w:styleId="000010" w:customStyle="1">
-    <w:name w:val="标题 2 字符"/>
-    <w:basedOn w:val="000013"/>
-    <w:link w:val="00000f"/>
-    <w:uiPriority w:val="99"/>
-    <w:locked w:val="1"/>
-    <w:rPr>
-      <w:rFonts w:ascii="Times New Roman" w:hAnsi="Times New Roman" w:eastAsia="DFKai-SB"/>
-      <w:b w:val="1"/>
-      <w:bCs w:val="1"/>
-      <w:sz w:val="32"/>
+      <w:sz w:val="26"/>
       <w:szCs w:val="26"/>
-      <w:lang w:eastAsia="en-US"/>
-    </w:rPr>
-  </w:style>
-  <w:style w:type="character" w:styleId="000013" w:default="1">
-    <w:name w:val="Default Paragraph Font"/>
-    <w:uiPriority w:val="1"/>
-    <w:semiHidden w:val="1"/>
-    <w:unhideWhenUsed w:val="1"/>
-  </w:style>
-  <w:style w:type="paragraph" w:styleId="00001e">
-    <w:name w:val="table of figures"/>
-    <w:basedOn w:val="00000c"/>
-    <w:next w:val="00000c"/>
-    <w:uiPriority w:val="99"/>
-    <w:unhideWhenUsed w:val="1"/>
-    <w:pPr>
-      <w:spacing w:after="0"/>
-      <w:ind w:firstLine="0"/>
-    </w:pPr>
-  </w:style>
-  <w:style w:type="table" w:styleId="000020">
-    <w:name w:val="Table Grid"/>
-    <w:basedOn w:val="000014"/>
-    <w:uiPriority w:val="99"/>
-    <w:locked w:val="1"/>
-    <w:pPr>
-      <w:spacing w:after="200" w:line="360" w:lineRule="auto"/>
-      <w:ind w:firstLine="720"/>
-    </w:pPr>
-    <w:rPr>
-      <w:rFonts w:eastAsia="Times New Roman"/>
-    </w:rPr>
-    <w:tblPr>
-      <w:tblBorders>
-        <w:top w:val="single" w:color="auto" w:sz="4" w:space="0"/>
-        <w:left w:val="single" w:color="auto" w:sz="4" w:space="0"/>
-        <w:bottom w:val="single" w:color="auto" w:sz="4" w:space="0"/>
-        <w:right w:val="single" w:color="auto" w:sz="4" w:space="0"/>
-        <w:insideH w:val="single" w:color="auto" w:sz="4" w:space="0"/>
-        <w:insideV w:val="single" w:color="auto" w:sz="4" w:space="0"/>
-      </w:tblBorders>
-    </w:tblPr>
-  </w:style>
-  <w:style w:type="table" w:styleId="000014" w:default="1">
-    <w:name w:val="Normal Table"/>
-    <w:uiPriority w:val="99"/>
-    <w:semiHidden w:val="1"/>
-    <w:unhideWhenUsed w:val="1"/>
-    <w:tblPr>
-      <w:tblCellMar>
-        <w:top w:w="0" w:type="dxa"/>
-        <w:left w:w="108" w:type="dxa"/>
-        <w:bottom w:w="0" w:type="dxa"/>
-        <w:right w:w="108" w:type="dxa"/>
-      </w:tblCellMar>
-    </w:tblPr>
-  </w:style>
-  <w:style w:type="character" w:styleId="000024">
-    <w:name w:val="Hyperlink"/>
-    <w:basedOn w:val="000013"/>
-    <w:uiPriority w:val="99"/>
-    <w:rPr>
-      <w:rFonts w:cs="Times New Roman"/>
-      <w:color w:val="0000FF"/>
-      <w:u w:val="single"/>
-    </w:rPr>
-  </w:style>
-  <w:style w:type="paragraph" w:styleId="00000c" w:default="1">
-    <w:name w:val="Normal"/>
-    <w:uiPriority w:val="0"/>
-    <w:qFormat w:val="1"/>
-    <w:pPr>
-      <w:spacing w:after="120" w:line="276" w:lineRule="auto"/>
-      <w:ind w:firstLine="595"/>
-    </w:pPr>
-    <w:rPr>
-      <w:rFonts w:ascii="Times New Roman" w:hAnsi="Times New Roman" w:eastAsia="DFKai-SB" w:cs="Times New Roman"/>
-      <w:sz w:val="22"/>
-      <w:szCs w:val="22"/>
-      <w:lang w:val="en-US" w:eastAsia="en-US" w:bidi="ar-SA"/>
-    </w:rPr>
-  </w:style>
-  <w:style w:type="character" w:styleId="00001b" w:customStyle="1">
-    <w:name w:val="页脚 字符"/>
-    <w:basedOn w:val="000013"/>
-    <w:link w:val="000003"/>
-    <w:uiPriority w:val="99"/>
-    <w:qFormat w:val="1"/>
-    <w:locked w:val="1"/>
-    <w:rPr>
-      <w:rFonts w:ascii="Times New Roman" w:hAnsi="Times New Roman" w:cs="Times New Roman"/>
-      <w:sz w:val="24"/>
-    </w:rPr>
-  </w:style>
-  <w:style w:type="character" w:styleId="000023">
-    <w:name w:val="Emphasis"/>
-    <w:basedOn w:val="000013"/>
-    <w:uiPriority w:val="0"/>
-    <w:qFormat w:val="1"/>
-    <w:locked w:val="1"/>
-    <w:rPr>
-      <w:i w:val="1"/>
-      <w:iCs w:val="1"/>
     </w:rPr>
   </w:style>
   <w:style w:type="character" w:styleId="000021">
@@ -2522,159 +2675,6 @@
     <w:unhideWhenUsed w:val="1"/>
     <w:rPr>
       <w:vertAlign w:val="superscript"/>
-    </w:rPr>
-  </w:style>
-  <w:style w:type="character" w:styleId="000022">
-    <w:name w:val="FollowedHyperlink"/>
-    <w:basedOn w:val="000013"/>
-    <w:uiPriority w:val="99"/>
-    <w:semiHidden w:val="1"/>
-    <w:unhideWhenUsed w:val="1"/>
-    <w:rPr>
-      <w:color w:val="800080" w:themeColor="followedHyperlink"/>
-      <w:u w:val="single"/>
-      <w14:textFill>
-        <w14:solidFill>
-          <w14:schemeClr w14:val="folHlink"/>
-        </w14:solidFill>
-      </w14:textFill>
-    </w:rPr>
-  </w:style>
-  <w:style w:type="paragraph" w:styleId="000025" w:customStyle="1">
-    <w:name w:val="Style Heading 1 + (Asian) DFKai-SB"/>
-    <w:basedOn w:val="00000d"/>
-    <w:uiPriority w:val="99"/>
-  </w:style>
-  <w:style w:type="character" w:styleId="000026">
-    <w:name w:val="Placeholder Text"/>
-    <w:basedOn w:val="000013"/>
-    <w:uiPriority w:val="99"/>
-    <w:semiHidden w:val="1"/>
-    <w:rPr>
-      <w:color w:val="808080"/>
-    </w:rPr>
-  </w:style>
-  <w:style w:type="character" w:styleId="00001c" w:customStyle="1">
-    <w:name w:val="页眉 字符"/>
-    <w:basedOn w:val="000013"/>
-    <w:link w:val="000006"/>
-    <w:uiPriority w:val="99"/>
-    <w:qFormat w:val="1"/>
-    <w:locked w:val="1"/>
-    <w:rPr>
-      <w:rFonts w:eastAsia="DFKai-SB" w:cs="Times New Roman"/>
-      <w:sz w:val="22"/>
-      <w:szCs w:val="22"/>
-      <w:lang w:val="en-US" w:eastAsia="en-US" w:bidi="ar-SA"/>
-    </w:rPr>
-  </w:style>
-  <w:style w:type="paragraph" w:styleId="00001d">
-    <w:name w:val="toc 1"/>
-    <w:basedOn w:val="00000c"/>
-    <w:next w:val="00000c"/>
-    <w:autoRedefine w:val="1"/>
-    <w:uiPriority w:val="39"/>
-    <w:pPr>
-      <w:spacing w:after="100"/>
-      <w:ind w:firstLine="0"/>
-    </w:pPr>
-  </w:style>
-  <w:style w:type="paragraph" w:styleId="000017">
-    <w:name w:val="endnote text"/>
-    <w:basedOn w:val="00000c"/>
-    <w:link w:val="000018"/>
-    <w:uiPriority w:val="99"/>
-    <w:semiHidden w:val="1"/>
-    <w:unhideWhenUsed w:val="1"/>
-    <w:pPr>
-      <w:spacing w:after="0"/>
-      <w:ind w:left="57" w:hanging="57"/>
-    </w:pPr>
-    <w:rPr>
-      <w:sz w:val="20"/>
-      <w:szCs w:val="20"/>
-    </w:rPr>
-  </w:style>
-  <w:style w:type="character" w:styleId="000012" w:customStyle="1">
-    <w:name w:val="标题 3 字符"/>
-    <w:basedOn w:val="000013"/>
-    <w:link w:val="000011"/>
-    <w:uiPriority w:val="99"/>
-    <w:locked w:val="1"/>
-    <w:rPr>
-      <w:rFonts w:ascii="Times New Roman" w:hAnsi="Times New Roman" w:eastAsia="DFKai-SB" w:cs="Arial"/>
-      <w:bCs w:val="1"/>
-      <w:i w:val="1"/>
-      <w:sz w:val="28"/>
-      <w:szCs w:val="26"/>
-      <w:lang w:eastAsia="en-US"/>
-    </w:rPr>
-  </w:style>
-  <w:style w:type="paragraph" w:styleId="000003">
-    <w:name w:val="footer"/>
-    <w:basedOn w:val="00000c"/>
-    <w:link w:val="00001b"/>
-    <w:uiPriority w:val="99"/>
-    <w:pPr>
-      <w:tabs>
-        <w:tab w:val="center" w:pos="4680"/>
-        <w:tab w:val="right" w:pos="9360"/>
-      </w:tabs>
-      <w:spacing w:after="0"/>
-    </w:pPr>
-  </w:style>
-  <w:style w:type="paragraph" w:styleId="00000d">
-    <w:name w:val="heading 1"/>
-    <w:basedOn w:val="00000c"/>
-    <w:next w:val="00000c"/>
-    <w:link w:val="00000e"/>
-    <w:uiPriority w:val="99"/>
-    <w:qFormat w:val="1"/>
-    <w:pPr>
-      <w:keepNext w:val="1"/>
-      <w:keepLines w:val="1"/>
-      <w:spacing w:before="200" w:after="120"/>
-      <w:ind w:firstLine="0"/>
-      <w:jc w:val="center"/>
-      <w:outlineLvl w:val="0"/>
-    </w:pPr>
-    <w:rPr>
-      <w:rFonts w:ascii="Times New Roman" w:hAnsi="Times New Roman"/>
-      <w:b w:val="1"/>
-      <w:bCs w:val="1"/>
-      <w:sz w:val="32"/>
-      <w:szCs w:val="28"/>
-    </w:rPr>
-  </w:style>
-  <w:style w:type="paragraph" w:styleId="000015">
-    <w:name w:val="caption"/>
-    <w:basedOn w:val="00000c"/>
-    <w:next w:val="00000c"/>
-    <w:uiPriority w:val="99"/>
-    <w:qFormat w:val="1"/>
-    <w:locked w:val="1"/>
-    <w:pPr>
-      <w:ind w:firstLine="0"/>
-      <w:jc w:val="center"/>
-    </w:pPr>
-    <w:rPr>
-      <w:bCs w:val="1"/>
-      <w:szCs w:val="20"/>
-    </w:rPr>
-  </w:style>
-  <w:style w:type="paragraph" w:styleId="000019">
-    <w:name w:val="Balloon Text"/>
-    <w:basedOn w:val="00000c"/>
-    <w:link w:val="00001a"/>
-    <w:uiPriority w:val="99"/>
-    <w:semiHidden w:val="1"/>
-    <w:pPr>
-      <w:spacing w:after="0"/>
-    </w:pPr>
-    <w:rPr>
-      <w:rFonts w:ascii="Tahoma" w:hAnsi="Tahoma" w:cs="Tahoma"/>
-      <w:sz w:val="16"/>
-      <w:szCs w:val="16"/>
     </w:rPr>
   </w:style>
 </w:styles>

</xml_diff>

<commit_message>
Add member contributions section required for every course report
</commit_message>
<xml_diff>
--- a/docs/Task1_Project_Proposal_Campus_Secondhand_Platform.docx
+++ b/docs/Task1_Project_Proposal_Campus_Secondhand_Platform.docx
@@ -1864,6 +1864,302 @@
         <w:t>The project will demonstrate software requirements analysis, modular design, UML documentation, implementation, integration and testing. The automatic matching function provides the main data-processing feature and distinguishes the system from a simple database-based listing website.</w:t>
       </w:r>
     </w:p>
+    <w:p>
+      <w:pPr>
+        <w:pStyle w:val="00000d"/>
+      </w:pPr>
+      <w:r>
+        <w:t>6. Contributions to This Report</w:t>
+      </w:r>
+    </w:p>
+    <w:p>
+      <w:r>
+        <w:t>This report was produced jointly by the four members of Group 11. The table below states the specific contribution of each member to this Task1 - Project Proposal. Each member contributed approximately 25% of the total work on this report.</w:t>
+      </w:r>
+    </w:p>
+    <w:tbl>
+      <w:tblPr>
+        <w:tblStyle w:val="000020"/>
+        <w:tblW w:type="auto" w:w="0"/>
+        <w:tblLook w:firstColumn="1" w:firstRow="1" w:lastColumn="0" w:lastRow="0" w:noHBand="0" w:noVBand="1" w:val="04A0"/>
+      </w:tblPr>
+      <w:tblGrid>
+        <w:gridCol w:w="2329"/>
+        <w:gridCol w:w="2329"/>
+        <w:gridCol w:w="2329"/>
+        <w:gridCol w:w="2329"/>
+      </w:tblGrid>
+      <w:tr>
+        <w:tc>
+          <w:tcPr>
+            <w:tcW w:type="dxa" w:w="2329"/>
+          </w:tcPr>
+          <w:p>
+            <w:r>
+              <w:rPr>
+                <w:sz w:val="20"/>
+              </w:rPr>
+              <w:t>Member</w:t>
+            </w:r>
+          </w:p>
+        </w:tc>
+        <w:tc>
+          <w:tcPr>
+            <w:tcW w:type="dxa" w:w="2329"/>
+          </w:tcPr>
+          <w:p>
+            <w:r>
+              <w:rPr>
+                <w:sz w:val="20"/>
+              </w:rPr>
+              <w:t>Name / Student No.</w:t>
+            </w:r>
+          </w:p>
+        </w:tc>
+        <w:tc>
+          <w:tcPr>
+            <w:tcW w:type="dxa" w:w="2329"/>
+          </w:tcPr>
+          <w:p>
+            <w:r>
+              <w:rPr>
+                <w:sz w:val="20"/>
+              </w:rPr>
+              <w:t>Contribution to This Report</w:t>
+            </w:r>
+          </w:p>
+        </w:tc>
+        <w:tc>
+          <w:tcPr>
+            <w:tcW w:type="dxa" w:w="2329"/>
+          </w:tcPr>
+          <w:p>
+            <w:r>
+              <w:rPr>
+                <w:sz w:val="20"/>
+              </w:rPr>
+              <w:t>Share</w:t>
+            </w:r>
+          </w:p>
+        </w:tc>
+      </w:tr>
+      <w:tr>
+        <w:tc>
+          <w:tcPr>
+            <w:tcW w:type="dxa" w:w="2329"/>
+          </w:tcPr>
+          <w:p>
+            <w:r>
+              <w:rPr>
+                <w:sz w:val="20"/>
+              </w:rPr>
+              <w:t>Member 1</w:t>
+            </w:r>
+          </w:p>
+        </w:tc>
+        <w:tc>
+          <w:tcPr>
+            <w:tcW w:type="dxa" w:w="2329"/>
+          </w:tcPr>
+          <w:p>
+            <w:r>
+              <w:rPr>
+                <w:sz w:val="20"/>
+              </w:rPr>
+              <w:t>Wu Yutong / 1240016186</w:t>
+            </w:r>
+          </w:p>
+        </w:tc>
+        <w:tc>
+          <w:tcPr>
+            <w:tcW w:type="dxa" w:w="2329"/>
+          </w:tcPr>
+          <w:p>
+            <w:r>
+              <w:rPr>
+                <w:sz w:val="20"/>
+              </w:rPr>
+              <w:t>Led the team; organised meetings and the task breakdown; wrote Section 1 (Team Profile) and Section 3 (Plan of Work and Product Ownership); compiled and finalised the complete report.</w:t>
+            </w:r>
+          </w:p>
+        </w:tc>
+        <w:tc>
+          <w:tcPr>
+            <w:tcW w:type="dxa" w:w="2329"/>
+          </w:tcPr>
+          <w:p>
+            <w:r>
+              <w:rPr>
+                <w:sz w:val="20"/>
+              </w:rPr>
+              <w:t>25%</w:t>
+            </w:r>
+          </w:p>
+        </w:tc>
+      </w:tr>
+      <w:tr>
+        <w:tc>
+          <w:tcPr>
+            <w:tcW w:type="dxa" w:w="2329"/>
+          </w:tcPr>
+          <w:p>
+            <w:r>
+              <w:rPr>
+                <w:sz w:val="20"/>
+              </w:rPr>
+              <w:t>Member 2</w:t>
+            </w:r>
+          </w:p>
+        </w:tc>
+        <w:tc>
+          <w:tcPr>
+            <w:tcW w:type="dxa" w:w="2329"/>
+          </w:tcPr>
+          <w:p>
+            <w:r>
+              <w:rPr>
+                <w:sz w:val="20"/>
+              </w:rPr>
+              <w:t>Wang Yike / 1240012305</w:t>
+            </w:r>
+          </w:p>
+        </w:tc>
+        <w:tc>
+          <w:tcPr>
+            <w:tcW w:type="dxa" w:w="2329"/>
+          </w:tcPr>
+          <w:p>
+            <w:r>
+              <w:rPr>
+                <w:sz w:val="20"/>
+              </w:rPr>
+              <w:t>Wrote Section 2.1 (Problem Diagnosis) and Section 2.2 (Proposed Treatment); defined the F1-F8 functional feature list and the typical use scenario in Section 2.3; sketched the initial system structure.</w:t>
+            </w:r>
+          </w:p>
+        </w:tc>
+        <w:tc>
+          <w:tcPr>
+            <w:tcW w:type="dxa" w:w="2329"/>
+          </w:tcPr>
+          <w:p>
+            <w:r>
+              <w:rPr>
+                <w:sz w:val="20"/>
+              </w:rPr>
+              <w:t>25%</w:t>
+            </w:r>
+          </w:p>
+        </w:tc>
+      </w:tr>
+      <w:tr>
+        <w:tc>
+          <w:tcPr>
+            <w:tcW w:type="dxa" w:w="2329"/>
+          </w:tcPr>
+          <w:p>
+            <w:r>
+              <w:rPr>
+                <w:sz w:val="20"/>
+              </w:rPr>
+              <w:t>Member 3</w:t>
+            </w:r>
+          </w:p>
+        </w:tc>
+        <w:tc>
+          <w:tcPr>
+            <w:tcW w:type="dxa" w:w="2329"/>
+          </w:tcPr>
+          <w:p>
+            <w:r>
+              <w:rPr>
+                <w:sz w:val="20"/>
+              </w:rPr>
+              <w:t>Chen Moxiong / 1240008865</w:t>
+            </w:r>
+          </w:p>
+        </w:tc>
+        <w:tc>
+          <w:tcPr>
+            <w:tcW w:type="dxa" w:w="2329"/>
+          </w:tcPr>
+          <w:p>
+            <w:r>
+              <w:rPr>
+                <w:sz w:val="20"/>
+              </w:rPr>
+              <w:t>Designed the rule-based matching method and the weighted scoring formula for F5; wrote Section 4 (Success Criteria) and the measurable quality commitments of Pair A and Pair B.</w:t>
+            </w:r>
+          </w:p>
+        </w:tc>
+        <w:tc>
+          <w:tcPr>
+            <w:tcW w:type="dxa" w:w="2329"/>
+          </w:tcPr>
+          <w:p>
+            <w:r>
+              <w:rPr>
+                <w:sz w:val="20"/>
+              </w:rPr>
+              <w:t>25%</w:t>
+            </w:r>
+          </w:p>
+        </w:tc>
+      </w:tr>
+      <w:tr>
+        <w:tc>
+          <w:tcPr>
+            <w:tcW w:type="dxa" w:w="2329"/>
+          </w:tcPr>
+          <w:p>
+            <w:r>
+              <w:rPr>
+                <w:sz w:val="20"/>
+              </w:rPr>
+              <w:t>Member 4</w:t>
+            </w:r>
+          </w:p>
+        </w:tc>
+        <w:tc>
+          <w:tcPr>
+            <w:tcW w:type="dxa" w:w="2329"/>
+          </w:tcPr>
+          <w:p>
+            <w:r>
+              <w:rPr>
+                <w:sz w:val="20"/>
+              </w:rPr>
+              <w:t>Gao Shengzhe / 1240008949</w:t>
+            </w:r>
+          </w:p>
+        </w:tc>
+        <w:tc>
+          <w:tcPr>
+            <w:tcW w:type="dxa" w:w="2329"/>
+          </w:tcPr>
+          <w:p>
+            <w:r>
+              <w:rPr>
+                <w:sz w:val="20"/>
+              </w:rPr>
+              <w:t>Applied the MUST report template and formatting; created the GitHub repository and the project README; wrote Section 5 (Expected Result) and the project scope; proofread the final document.</w:t>
+            </w:r>
+          </w:p>
+        </w:tc>
+        <w:tc>
+          <w:tcPr>
+            <w:tcW w:type="dxa" w:w="2329"/>
+          </w:tcPr>
+          <w:p>
+            <w:r>
+              <w:rPr>
+                <w:sz w:val="20"/>
+              </w:rPr>
+              <w:t>25%</w:t>
+            </w:r>
+          </w:p>
+        </w:tc>
+      </w:tr>
+    </w:tbl>
     <w:sectPr>
       <w:headerReference r:id="rId7" w:type="default"/>
       <w:headerReference r:id="rId6" w:type="first"/>

</xml_diff>

<commit_message>
Proposal: member names in Member column, student numbers only in second column
</commit_message>
<xml_diff>
--- a/docs/Task1_Project_Proposal_Campus_Secondhand_Platform.docx
+++ b/docs/Task1_Project_Proposal_Campus_Secondhand_Platform.docx
@@ -413,7 +413,7 @@
     </w:p>
     <w:p>
       <w:pPr>
-        <w:pStyle w:val="00000d"/>
+        <w:pStyle w:val="000009"/>
         <w:jc w:val="left"/>
       </w:pPr>
       <w:r>
@@ -484,7 +484,7 @@
     </w:p>
     <w:p>
       <w:pPr>
-        <w:pStyle w:val="00000d"/>
+        <w:pStyle w:val="000009"/>
         <w:jc w:val="left"/>
       </w:pPr>
       <w:r>
@@ -501,7 +501,7 @@
     </w:p>
     <w:tbl>
       <w:tblPr>
-        <w:tblStyle w:val="000020"/>
+        <w:tblStyle w:val="000017"/>
         <w:tblW w:w="0" w:type="auto"/>
         <w:jc w:val="center"/>
         <w:tblBorders>
@@ -563,7 +563,7 @@
                 <w:b w:val="1"/>
                 <w:sz w:val="19"/>
               </w:rPr>
-              <w:t>Name / Student No.</w:t>
+              <w:t>Student No.</w:t>
             </w:r>
           </w:p>
         </w:tc>
@@ -619,22 +619,22 @@
                 <w:rFonts w:ascii="Times New Roman" w:hAnsi="Times New Roman"/>
                 <w:sz w:val="19"/>
               </w:rPr>
-              <w:t>Member 1</w:t>
-            </w:r>
-          </w:p>
-        </w:tc>
-        <w:tc>
-          <w:tcPr>
-            <w:tcW w:w="2329" w:type="dxa"/>
-          </w:tcPr>
-          <w:p>
-            <w:pPr/>
-            <w:r>
-              <w:rPr>
-                <w:rFonts w:ascii="Times New Roman" w:hAnsi="Times New Roman"/>
-                <w:sz w:val="19"/>
-              </w:rPr>
-              <w:t>Wu Yutong / 1240016186</w:t>
+              <w:t>Wu Yutong</w:t>
+            </w:r>
+          </w:p>
+        </w:tc>
+        <w:tc>
+          <w:tcPr>
+            <w:tcW w:w="2329" w:type="dxa"/>
+          </w:tcPr>
+          <w:p>
+            <w:pPr/>
+            <w:r>
+              <w:rPr>
+                <w:rFonts w:ascii="Times New Roman" w:hAnsi="Times New Roman"/>
+                <w:sz w:val="19"/>
+              </w:rPr>
+              <w:t>1240016186</w:t>
             </w:r>
           </w:p>
         </w:tc>
@@ -684,22 +684,22 @@
                 <w:rFonts w:ascii="Times New Roman" w:hAnsi="Times New Roman"/>
                 <w:sz w:val="19"/>
               </w:rPr>
-              <w:t>Member 2</w:t>
-            </w:r>
-          </w:p>
-        </w:tc>
-        <w:tc>
-          <w:tcPr>
-            <w:tcW w:w="2329" w:type="dxa"/>
-          </w:tcPr>
-          <w:p>
-            <w:pPr/>
-            <w:r>
-              <w:rPr>
-                <w:rFonts w:ascii="Times New Roman" w:hAnsi="Times New Roman"/>
-                <w:sz w:val="19"/>
-              </w:rPr>
-              <w:t>Wang Yike / 1240012305</w:t>
+              <w:t>Wang Yike</w:t>
+            </w:r>
+          </w:p>
+        </w:tc>
+        <w:tc>
+          <w:tcPr>
+            <w:tcW w:w="2329" w:type="dxa"/>
+          </w:tcPr>
+          <w:p>
+            <w:pPr/>
+            <w:r>
+              <w:rPr>
+                <w:rFonts w:ascii="Times New Roman" w:hAnsi="Times New Roman"/>
+                <w:sz w:val="19"/>
+              </w:rPr>
+              <w:t>1240012305</w:t>
             </w:r>
           </w:p>
         </w:tc>
@@ -749,22 +749,22 @@
                 <w:rFonts w:ascii="Times New Roman" w:hAnsi="Times New Roman"/>
                 <w:sz w:val="19"/>
               </w:rPr>
-              <w:t>Member 3</w:t>
-            </w:r>
-          </w:p>
-        </w:tc>
-        <w:tc>
-          <w:tcPr>
-            <w:tcW w:w="2329" w:type="dxa"/>
-          </w:tcPr>
-          <w:p>
-            <w:pPr/>
-            <w:r>
-              <w:rPr>
-                <w:rFonts w:ascii="Times New Roman" w:hAnsi="Times New Roman"/>
-                <w:sz w:val="19"/>
-              </w:rPr>
-              <w:t>Chen Moxiong / 1240008865</w:t>
+              <w:t>Chen Moxiong</w:t>
+            </w:r>
+          </w:p>
+        </w:tc>
+        <w:tc>
+          <w:tcPr>
+            <w:tcW w:w="2329" w:type="dxa"/>
+          </w:tcPr>
+          <w:p>
+            <w:pPr/>
+            <w:r>
+              <w:rPr>
+                <w:rFonts w:ascii="Times New Roman" w:hAnsi="Times New Roman"/>
+                <w:sz w:val="19"/>
+              </w:rPr>
+              <w:t>1240008865</w:t>
             </w:r>
           </w:p>
         </w:tc>
@@ -814,22 +814,22 @@
                 <w:rFonts w:ascii="Times New Roman" w:hAnsi="Times New Roman"/>
                 <w:sz w:val="19"/>
               </w:rPr>
-              <w:t>Member 4</w:t>
-            </w:r>
-          </w:p>
-        </w:tc>
-        <w:tc>
-          <w:tcPr>
-            <w:tcW w:w="2329" w:type="dxa"/>
-          </w:tcPr>
-          <w:p>
-            <w:pPr/>
-            <w:r>
-              <w:rPr>
-                <w:rFonts w:ascii="Times New Roman" w:hAnsi="Times New Roman"/>
-                <w:sz w:val="19"/>
-              </w:rPr>
-              <w:t>Gao Shengzhe / 1240008949</w:t>
+              <w:t>Gao Shengzhe</w:t>
+            </w:r>
+          </w:p>
+        </w:tc>
+        <w:tc>
+          <w:tcPr>
+            <w:tcW w:w="2329" w:type="dxa"/>
+          </w:tcPr>
+          <w:p>
+            <w:pPr/>
+            <w:r>
+              <w:rPr>
+                <w:rFonts w:ascii="Times New Roman" w:hAnsi="Times New Roman"/>
+                <w:sz w:val="19"/>
+              </w:rPr>
+              <w:t>1240008949</w:t>
             </w:r>
           </w:p>
         </w:tc>
@@ -867,7 +867,7 @@
     </w:tbl>
     <w:p>
       <w:pPr>
-        <w:pStyle w:val="00000d"/>
+        <w:pStyle w:val="000009"/>
         <w:jc w:val="left"/>
       </w:pPr>
       <w:r>
@@ -876,7 +876,7 @@
     </w:p>
     <w:p>
       <w:pPr>
-        <w:pStyle w:val="00000f"/>
+        <w:pStyle w:val="000015"/>
       </w:pPr>
       <w:r>
         <w:t>2.1 Problem Diagnosis</w:t>
@@ -900,7 +900,7 @@
     </w:p>
     <w:p>
       <w:pPr>
-        <w:pStyle w:val="00000f"/>
+        <w:pStyle w:val="000015"/>
       </w:pPr>
       <w:r>
         <w:t>2.2 Proposed Treatment</w:t>
@@ -924,7 +924,7 @@
     </w:p>
     <w:p>
       <w:pPr>
-        <w:pStyle w:val="00000f"/>
+        <w:pStyle w:val="000015"/>
       </w:pPr>
       <w:r>
         <w:t>2.3 Typical Use Scenario</w:t>
@@ -940,7 +940,7 @@
     </w:p>
     <w:p>
       <w:pPr>
-        <w:pStyle w:val="00000f"/>
+        <w:pStyle w:val="000015"/>
       </w:pPr>
       <w:r>
         <w:t>2.4 Functional Features</w:t>
@@ -1008,7 +1008,7 @@
     </w:p>
     <w:p>
       <w:pPr>
-        <w:pStyle w:val="00000c"/>
+        <w:pStyle w:val="000003"/>
         <w:rPr>
           <w:rFonts w:ascii="Times New Roman" w:hAnsi="Times New Roman" w:eastAsia="DFKai-SB" w:cs="Times New Roman"/>
           <w:sz w:val="22"/>
@@ -1064,7 +1064,7 @@
     </w:p>
     <w:p>
       <w:pPr>
-        <w:pStyle w:val="00000d"/>
+        <w:pStyle w:val="000009"/>
         <w:jc w:val="left"/>
       </w:pPr>
       <w:r>
@@ -1073,7 +1073,7 @@
     </w:p>
     <w:p>
       <w:pPr>
-        <w:pStyle w:val="00000f"/>
+        <w:pStyle w:val="000015"/>
       </w:pPr>
       <w:r>
         <w:t>3.1 Plan of Work</w:t>
@@ -1089,7 +1089,7 @@
     </w:p>
     <w:tbl>
       <w:tblPr>
-        <w:tblStyle w:val="000020"/>
+        <w:tblStyle w:val="000017"/>
         <w:tblW w:w="0" w:type="auto"/>
         <w:jc w:val="center"/>
         <w:tblBorders>
@@ -1476,7 +1476,7 @@
     </w:tbl>
     <w:p>
       <w:pPr>
-        <w:pStyle w:val="00000f"/>
+        <w:pStyle w:val="000015"/>
       </w:pPr>
       <w:r>
         <w:t>3.2 Product Ownership</w:t>
@@ -1492,7 +1492,7 @@
     </w:p>
     <w:tbl>
       <w:tblPr>
-        <w:tblStyle w:val="000020"/>
+        <w:tblStyle w:val="000017"/>
         <w:tblW w:w="0" w:type="auto"/>
         <w:jc w:val="center"/>
         <w:tblBorders>
@@ -1591,7 +1591,7 @@
                 <w:rFonts w:ascii="Times New Roman" w:hAnsi="Times New Roman"/>
                 <w:sz w:val="19"/>
               </w:rPr>
-              <w:t>Member 1 (Wu Yutong)</w:t>
+              <w:t>Wu Yutong</w:t>
             </w:r>
           </w:p>
         </w:tc>
@@ -1641,7 +1641,7 @@
                 <w:rFonts w:ascii="Times New Roman" w:hAnsi="Times New Roman"/>
                 <w:sz w:val="19"/>
               </w:rPr>
-              <w:t>Member 2 (Wang Yike)</w:t>
+              <w:t>Wang Yike</w:t>
             </w:r>
           </w:p>
         </w:tc>
@@ -1691,7 +1691,7 @@
                 <w:rFonts w:ascii="Times New Roman" w:hAnsi="Times New Roman"/>
                 <w:sz w:val="19"/>
               </w:rPr>
-              <w:t>Member 3 (Chen Moxiong)</w:t>
+              <w:t>Chen Moxiong</w:t>
             </w:r>
           </w:p>
         </w:tc>
@@ -1741,7 +1741,7 @@
                 <w:rFonts w:ascii="Times New Roman" w:hAnsi="Times New Roman"/>
                 <w:sz w:val="19"/>
               </w:rPr>
-              <w:t>Member 4 (Gao Shengzhe)</w:t>
+              <w:t>Gao Shengzhe</w:t>
             </w:r>
           </w:p>
         </w:tc>
@@ -1779,7 +1779,7 @@
     </w:tbl>
     <w:p>
       <w:pPr>
-        <w:pStyle w:val="00000c"/>
+        <w:pStyle w:val="000003"/>
         <w:rPr>
           <w:rFonts w:ascii="Times New Roman" w:hAnsi="Times New Roman" w:eastAsia="DFKai-SB" w:cs="Times New Roman"/>
           <w:sz w:val="22"/>
@@ -1799,7 +1799,7 @@
     </w:p>
     <w:p>
       <w:pPr>
-        <w:pStyle w:val="00000d"/>
+        <w:pStyle w:val="000009"/>
         <w:rPr>
           <w:rFonts w:ascii="Times New Roman" w:hAnsi="Times New Roman"/>
           <w:b w:val="1"/>
@@ -1821,7 +1821,7 @@
     </w:p>
     <w:p>
       <w:pPr>
-        <w:pStyle w:val="00000c"/>
+        <w:pStyle w:val="000003"/>
         <w:rPr>
           <w:rFonts w:ascii="Times New Roman" w:hAnsi="Times New Roman" w:eastAsia="DFKai-SB" w:cs="Times New Roman"/>
           <w:sz w:val="22"/>
@@ -1841,7 +1841,7 @@
     </w:p>
     <w:p>
       <w:pPr>
-        <w:pStyle w:val="00000d"/>
+        <w:pStyle w:val="000009"/>
         <w:jc w:val="left"/>
       </w:pPr>
       <w:r>
@@ -1866,7 +1866,7 @@
     </w:p>
     <w:p>
       <w:pPr>
-        <w:pStyle w:val="00000d"/>
+        <w:pStyle w:val="000009"/>
       </w:pPr>
       <w:r>
         <w:t>6. Contributions to This Report</w:t>
@@ -1879,9 +1879,9 @@
     </w:p>
     <w:tbl>
       <w:tblPr>
-        <w:tblStyle w:val="000020"/>
-        <w:tblW w:type="auto" w:w="0"/>
-        <w:tblLook w:firstColumn="1" w:firstRow="1" w:lastColumn="0" w:lastRow="0" w:noHBand="0" w:noVBand="1" w:val="04A0"/>
+        <w:tblStyle w:val="000017"/>
+        <w:tblW w:w="0" w:type="auto"/>
+        <w:tblLook w:firstRow="1" w:lastRow="0" w:firstColumn="1" w:lastColumn="0" w:noHBand="0" w:noVBand="1" w:val="04A0"/>
       </w:tblPr>
       <w:tblGrid>
         <w:gridCol w:w="2329"/>
@@ -1890,9 +1890,10 @@
         <w:gridCol w:w="2329"/>
       </w:tblGrid>
       <w:tr>
-        <w:tc>
-          <w:tcPr>
-            <w:tcW w:type="dxa" w:w="2329"/>
+        <w:trPr/>
+        <w:tc>
+          <w:tcPr>
+            <w:tcW w:w="2329" w:type="dxa"/>
           </w:tcPr>
           <w:p>
             <w:r>
@@ -1905,20 +1906,20 @@
         </w:tc>
         <w:tc>
           <w:tcPr>
-            <w:tcW w:type="dxa" w:w="2329"/>
+            <w:tcW w:w="2329" w:type="dxa"/>
           </w:tcPr>
           <w:p>
             <w:r>
               <w:rPr>
                 <w:sz w:val="20"/>
               </w:rPr>
-              <w:t>Name / Student No.</w:t>
-            </w:r>
-          </w:p>
-        </w:tc>
-        <w:tc>
-          <w:tcPr>
-            <w:tcW w:type="dxa" w:w="2329"/>
+              <w:t>Student No.</w:t>
+            </w:r>
+          </w:p>
+        </w:tc>
+        <w:tc>
+          <w:tcPr>
+            <w:tcW w:w="2329" w:type="dxa"/>
           </w:tcPr>
           <w:p>
             <w:r>
@@ -1931,7 +1932,7 @@
         </w:tc>
         <w:tc>
           <w:tcPr>
-            <w:tcW w:type="dxa" w:w="2329"/>
+            <w:tcW w:w="2329" w:type="dxa"/>
           </w:tcPr>
           <w:p>
             <w:r>
@@ -1944,35 +1945,36 @@
         </w:tc>
       </w:tr>
       <w:tr>
-        <w:tc>
-          <w:tcPr>
-            <w:tcW w:type="dxa" w:w="2329"/>
+        <w:trPr/>
+        <w:tc>
+          <w:tcPr>
+            <w:tcW w:w="2329" w:type="dxa"/>
           </w:tcPr>
           <w:p>
             <w:r>
               <w:rPr>
                 <w:sz w:val="20"/>
               </w:rPr>
-              <w:t>Member 1</w:t>
-            </w:r>
-          </w:p>
-        </w:tc>
-        <w:tc>
-          <w:tcPr>
-            <w:tcW w:type="dxa" w:w="2329"/>
+              <w:t>Wu Yutong</w:t>
+            </w:r>
+          </w:p>
+        </w:tc>
+        <w:tc>
+          <w:tcPr>
+            <w:tcW w:w="2329" w:type="dxa"/>
           </w:tcPr>
           <w:p>
             <w:r>
               <w:rPr>
                 <w:sz w:val="20"/>
               </w:rPr>
-              <w:t>Wu Yutong / 1240016186</w:t>
-            </w:r>
-          </w:p>
-        </w:tc>
-        <w:tc>
-          <w:tcPr>
-            <w:tcW w:type="dxa" w:w="2329"/>
+              <w:t>1240016186</w:t>
+            </w:r>
+          </w:p>
+        </w:tc>
+        <w:tc>
+          <w:tcPr>
+            <w:tcW w:w="2329" w:type="dxa"/>
           </w:tcPr>
           <w:p>
             <w:r>
@@ -1985,7 +1987,7 @@
         </w:tc>
         <w:tc>
           <w:tcPr>
-            <w:tcW w:type="dxa" w:w="2329"/>
+            <w:tcW w:w="2329" w:type="dxa"/>
           </w:tcPr>
           <w:p>
             <w:r>
@@ -1998,35 +2000,36 @@
         </w:tc>
       </w:tr>
       <w:tr>
-        <w:tc>
-          <w:tcPr>
-            <w:tcW w:type="dxa" w:w="2329"/>
+        <w:trPr/>
+        <w:tc>
+          <w:tcPr>
+            <w:tcW w:w="2329" w:type="dxa"/>
           </w:tcPr>
           <w:p>
             <w:r>
               <w:rPr>
                 <w:sz w:val="20"/>
               </w:rPr>
-              <w:t>Member 2</w:t>
-            </w:r>
-          </w:p>
-        </w:tc>
-        <w:tc>
-          <w:tcPr>
-            <w:tcW w:type="dxa" w:w="2329"/>
+              <w:t>Wang Yike</w:t>
+            </w:r>
+          </w:p>
+        </w:tc>
+        <w:tc>
+          <w:tcPr>
+            <w:tcW w:w="2329" w:type="dxa"/>
           </w:tcPr>
           <w:p>
             <w:r>
               <w:rPr>
                 <w:sz w:val="20"/>
               </w:rPr>
-              <w:t>Wang Yike / 1240012305</w:t>
-            </w:r>
-          </w:p>
-        </w:tc>
-        <w:tc>
-          <w:tcPr>
-            <w:tcW w:type="dxa" w:w="2329"/>
+              <w:t>1240012305</w:t>
+            </w:r>
+          </w:p>
+        </w:tc>
+        <w:tc>
+          <w:tcPr>
+            <w:tcW w:w="2329" w:type="dxa"/>
           </w:tcPr>
           <w:p>
             <w:r>
@@ -2039,7 +2042,7 @@
         </w:tc>
         <w:tc>
           <w:tcPr>
-            <w:tcW w:type="dxa" w:w="2329"/>
+            <w:tcW w:w="2329" w:type="dxa"/>
           </w:tcPr>
           <w:p>
             <w:r>
@@ -2052,35 +2055,36 @@
         </w:tc>
       </w:tr>
       <w:tr>
-        <w:tc>
-          <w:tcPr>
-            <w:tcW w:type="dxa" w:w="2329"/>
+        <w:trPr/>
+        <w:tc>
+          <w:tcPr>
+            <w:tcW w:w="2329" w:type="dxa"/>
           </w:tcPr>
           <w:p>
             <w:r>
               <w:rPr>
                 <w:sz w:val="20"/>
               </w:rPr>
-              <w:t>Member 3</w:t>
-            </w:r>
-          </w:p>
-        </w:tc>
-        <w:tc>
-          <w:tcPr>
-            <w:tcW w:type="dxa" w:w="2329"/>
+              <w:t>Chen Moxiong</w:t>
+            </w:r>
+          </w:p>
+        </w:tc>
+        <w:tc>
+          <w:tcPr>
+            <w:tcW w:w="2329" w:type="dxa"/>
           </w:tcPr>
           <w:p>
             <w:r>
               <w:rPr>
                 <w:sz w:val="20"/>
               </w:rPr>
-              <w:t>Chen Moxiong / 1240008865</w:t>
-            </w:r>
-          </w:p>
-        </w:tc>
-        <w:tc>
-          <w:tcPr>
-            <w:tcW w:type="dxa" w:w="2329"/>
+              <w:t>1240008865</w:t>
+            </w:r>
+          </w:p>
+        </w:tc>
+        <w:tc>
+          <w:tcPr>
+            <w:tcW w:w="2329" w:type="dxa"/>
           </w:tcPr>
           <w:p>
             <w:r>
@@ -2093,7 +2097,7 @@
         </w:tc>
         <w:tc>
           <w:tcPr>
-            <w:tcW w:type="dxa" w:w="2329"/>
+            <w:tcW w:w="2329" w:type="dxa"/>
           </w:tcPr>
           <w:p>
             <w:r>
@@ -2106,35 +2110,36 @@
         </w:tc>
       </w:tr>
       <w:tr>
-        <w:tc>
-          <w:tcPr>
-            <w:tcW w:type="dxa" w:w="2329"/>
+        <w:trPr/>
+        <w:tc>
+          <w:tcPr>
+            <w:tcW w:w="2329" w:type="dxa"/>
           </w:tcPr>
           <w:p>
             <w:r>
               <w:rPr>
                 <w:sz w:val="20"/>
               </w:rPr>
-              <w:t>Member 4</w:t>
-            </w:r>
-          </w:p>
-        </w:tc>
-        <w:tc>
-          <w:tcPr>
-            <w:tcW w:type="dxa" w:w="2329"/>
+              <w:t>Gao Shengzhe</w:t>
+            </w:r>
+          </w:p>
+        </w:tc>
+        <w:tc>
+          <w:tcPr>
+            <w:tcW w:w="2329" w:type="dxa"/>
           </w:tcPr>
           <w:p>
             <w:r>
               <w:rPr>
                 <w:sz w:val="20"/>
               </w:rPr>
-              <w:t>Gao Shengzhe / 1240008949</w:t>
-            </w:r>
-          </w:p>
-        </w:tc>
-        <w:tc>
-          <w:tcPr>
-            <w:tcW w:type="dxa" w:w="2329"/>
+              <w:t>1240008949</w:t>
+            </w:r>
+          </w:p>
+        </w:tc>
+        <w:tc>
+          <w:tcPr>
+            <w:tcW w:w="2329" w:type="dxa"/>
           </w:tcPr>
           <w:p>
             <w:r>
@@ -2147,7 +2152,7 @@
         </w:tc>
         <w:tc>
           <w:tcPr>
-            <w:tcW w:type="dxa" w:w="2329"/>
+            <w:tcW w:w="2329" w:type="dxa"/>
           </w:tcPr>
           <w:p>
             <w:r>
@@ -2163,8 +2168,8 @@
     <w:sectPr>
       <w:headerReference r:id="rId7" w:type="default"/>
       <w:headerReference r:id="rId6" w:type="first"/>
+      <w:footerReference r:id="rId9" w:type="default"/>
       <w:footerReference r:id="rId8" w:type="first"/>
-      <w:footerReference r:id="rId9" w:type="default"/>
       <w:endnotePr>
         <w:numFmt w:val="decimal"/>
       </w:endnotePr>
@@ -2180,14 +2185,14 @@
 
 <file path=word/endnotes.xml><?xml version="1.0" encoding="utf-8"?>
 <w:endnotes xmlns:w="http://schemas.openxmlformats.org/wordprocessingml/2006/main" xmlns:w14="http://schemas.microsoft.com/office/word/2010/wordml" xmlns:mc="http://schemas.openxmlformats.org/markup-compatibility/2006" mc:Ignorable="w14">
+  <w:endnote w:type="separator" w:id="0">
+    <w:p>
+      <w:pPr>
+        <w:spacing w:line="240" w:lineRule="auto"/>
+      </w:pPr>
+    </w:p>
+  </w:endnote>
   <w:endnote w:type="continuationSeparator" w:id="1">
-    <w:p>
-      <w:pPr>
-        <w:spacing w:line="240" w:lineRule="auto"/>
-      </w:pPr>
-    </w:p>
-  </w:endnote>
-  <w:endnote w:type="separator" w:id="0">
     <w:p>
       <w:pPr>
         <w:spacing w:line="240" w:lineRule="auto"/>
@@ -2209,7 +2214,7 @@
 <w:ftr xmlns:w="http://schemas.openxmlformats.org/wordprocessingml/2006/main" xmlns:w14="http://schemas.microsoft.com/office/word/2010/wordml" xmlns:mc="http://schemas.openxmlformats.org/markup-compatibility/2006" mc:Ignorable="w14">
   <w:p>
     <w:pPr>
-      <w:pStyle w:val="000003"/>
+      <w:pStyle w:val="00000d"/>
       <w:ind w:firstLine="0"/>
       <w:jc w:val="center"/>
     </w:pPr>
@@ -2225,7 +2230,7 @@
   </w:p>
   <w:p>
     <w:pPr>
-      <w:pStyle w:val="000003"/>
+      <w:pStyle w:val="00000d"/>
     </w:pPr>
   </w:p>
 </w:ftr>
@@ -2233,14 +2238,14 @@
 
 <file path=word/footnotes.xml><?xml version="1.0" encoding="utf-8"?>
 <w:footnotes xmlns:w="http://schemas.openxmlformats.org/wordprocessingml/2006/main" xmlns:w14="http://schemas.microsoft.com/office/word/2010/wordml" xmlns:mc="http://schemas.openxmlformats.org/markup-compatibility/2006" mc:Ignorable="w14">
-  <w:footnote w:type="continuationSeparator" w:id="1">
+  <w:footnote w:type="separator" w:id="1">
     <w:p>
       <w:pPr>
         <w:spacing w:before="0" w:after="0" w:line="276" w:lineRule="auto"/>
       </w:pPr>
     </w:p>
   </w:footnote>
-  <w:footnote w:type="separator" w:id="0">
+  <w:footnote w:type="continuationSeparator" w:id="0">
     <w:p>
       <w:pPr>
         <w:spacing w:before="0" w:after="0" w:line="276" w:lineRule="auto"/>
@@ -2262,7 +2267,7 @@
 <w:hdr xmlns:w="http://schemas.openxmlformats.org/wordprocessingml/2006/main" xmlns:w14="http://schemas.microsoft.com/office/word/2010/wordml" xmlns:mc="http://schemas.openxmlformats.org/markup-compatibility/2006" mc:Ignorable="w14">
   <w:p>
     <w:pPr>
-      <w:pStyle w:val="000006"/>
+      <w:pStyle w:val="00000c"/>
       <w:pBdr>
         <w:bottom w:val="thickThinSmallGap" w:color="622423" w:themeColor="accent2" w:themeShade="7F" w:sz="24" w:space="1"/>
       </w:pBdr>
@@ -2273,7 +2278,7 @@
   </w:p>
   <w:p>
     <w:pPr>
-      <w:pStyle w:val="000006"/>
+      <w:pStyle w:val="00000c"/>
       <w:rPr>
         <w:szCs w:val="20"/>
       </w:rPr>
@@ -2293,283 +2298,261 @@
     <w:pPrDefault/>
   </w:docDefaults>
   <w:latentStyles w:defLockedState="0" w:defUIPriority="99" w:defSemiHidden="1" w:defUnhideWhenUsed="1" w:defQFormat="0" w:count="260">
+    <w:lsdException w:name="HTML Preformatted" w:uiPriority="99"/>
+    <w:lsdException w:name="List Continue 5" w:uiPriority="99"/>
+    <w:lsdException w:name="FollowedHyperlink" w:uiPriority="99"/>
+    <w:lsdException w:name="Colorful Shading Accent 1" w:uiPriority="71" w:semiHidden="0" w:unhideWhenUsed="0"/>
+    <w:lsdException w:name="heading 1" w:uiPriority="99" w:semiHidden="0" w:unhideWhenUsed="0" w:qFormat="1"/>
+    <w:lsdException w:name="table of figures" w:uiPriority="99" w:semiHidden="0"/>
+    <w:lsdException w:name="Message Header" w:uiPriority="99"/>
+    <w:lsdException w:name="Table Theme" w:uiPriority="99"/>
+    <w:lsdException w:name="Table Columns 2" w:uiPriority="99"/>
+    <w:lsdException w:name="Note Heading" w:uiPriority="99"/>
+    <w:lsdException w:name="heading 2" w:uiPriority="99" w:semiHidden="0" w:unhideWhenUsed="0" w:qFormat="1"/>
+    <w:lsdException w:name="Dark List Accent 1" w:uiPriority="70" w:semiHidden="0" w:unhideWhenUsed="0"/>
+    <w:lsdException w:name="Medium List 1 Accent 4" w:uiPriority="65" w:semiHidden="0" w:unhideWhenUsed="0"/>
+    <w:lsdException w:name="Table Classic 1" w:uiPriority="99"/>
+    <w:lsdException w:name="Table Classic 2" w:uiPriority="99"/>
+    <w:lsdException w:name="List Number 5" w:uiPriority="99"/>
+    <w:lsdException w:name="List Continue 2" w:uiPriority="99"/>
+    <w:lsdException w:name="Body Text" w:uiPriority="99"/>
+    <w:lsdException w:name="Colorful Shading" w:uiPriority="71" w:semiHidden="0" w:unhideWhenUsed="0"/>
+    <w:lsdException w:name="Salutation" w:uiPriority="99"/>
+    <w:lsdException w:name="heading 3" w:locked="1" w:uiPriority="99" w:semiHidden="0" w:unhideWhenUsed="0" w:qFormat="1"/>
+    <w:lsdException w:name="Table Subtle 1" w:uiPriority="99"/>
+    <w:lsdException w:name="index 7" w:uiPriority="99"/>
+    <w:lsdException w:name="index 8" w:uiPriority="99"/>
+    <w:lsdException w:name="Medium List 2 Accent 5" w:uiPriority="66" w:semiHidden="0" w:unhideWhenUsed="0"/>
+    <w:lsdException w:name="Medium Grid 1 Accent 5" w:uiPriority="67" w:semiHidden="0" w:unhideWhenUsed="0"/>
+    <w:lsdException w:name="Table Grid 2" w:uiPriority="99"/>
+    <w:lsdException w:name="List Bullet 3" w:uiPriority="99"/>
+    <w:lsdException w:name="index 9" w:uiPriority="99"/>
+    <w:lsdException w:name="Light Shading Accent 1" w:uiPriority="60" w:semiHidden="0" w:unhideWhenUsed="0"/>
+    <w:lsdException w:name="Colorful List Accent 6" w:uiPriority="72" w:semiHidden="0" w:unhideWhenUsed="0"/>
+    <w:lsdException w:name="Medium Grid 3 Accent 4" w:uiPriority="69" w:semiHidden="0" w:unhideWhenUsed="0"/>
+    <w:lsdException w:name="Table Grid 3" w:uiPriority="99"/>
+    <w:lsdException w:name="List 3" w:uiPriority="99"/>
+    <w:lsdException w:name="Medium List 2 Accent 4" w:uiPriority="66" w:semiHidden="0" w:unhideWhenUsed="0"/>
+    <w:lsdException w:name="Light List Accent 2" w:uiPriority="61" w:semiHidden="0" w:unhideWhenUsed="0"/>
+    <w:lsdException w:name="Colorful Grid" w:uiPriority="73" w:semiHidden="0" w:unhideWhenUsed="0"/>
+    <w:lsdException w:name="Table 3D effects 1" w:uiPriority="99"/>
+    <w:lsdException w:name="Medium Shading 2 Accent 2" w:uiPriority="64" w:semiHidden="0" w:unhideWhenUsed="0"/>
+    <w:lsdException w:name="Medium Grid 3 Accent 5" w:uiPriority="69" w:semiHidden="0" w:unhideWhenUsed="0"/>
+    <w:lsdException w:name="Medium Shading 2 Accent 5" w:uiPriority="64" w:semiHidden="0" w:unhideWhenUsed="0"/>
+    <w:lsdException w:name="List Number 2" w:uiPriority="99"/>
+    <w:lsdException w:name="Table Subtle 2" w:uiPriority="99"/>
+    <w:lsdException w:name="HTML Variable" w:uiPriority="99"/>
+    <w:lsdException w:name="Medium Grid 1 Accent 6" w:uiPriority="67" w:semiHidden="0" w:unhideWhenUsed="0"/>
+    <w:lsdException w:name="Body Text Indent" w:uiPriority="99"/>
+    <w:lsdException w:name="envelope return" w:uiPriority="99"/>
+    <w:lsdException w:name="Table Grid 1" w:uiPriority="99"/>
+    <w:lsdException w:name="Placeholder Text" w:uiPriority="99" w:unhideWhenUsed="0"/>
+    <w:lsdException w:name="Colorful Shading Accent 5" w:uiPriority="71" w:semiHidden="0" w:unhideWhenUsed="0"/>
+    <w:lsdException w:name="Normal" w:uiPriority="0" w:semiHidden="0" w:unhideWhenUsed="0" w:qFormat="1"/>
+    <w:lsdException w:name="Normal Indent" w:uiPriority="99"/>
+    <w:lsdException w:name="HTML Code" w:uiPriority="99"/>
+    <w:lsdException w:name="Medium Grid 3 Accent 6" w:uiPriority="69" w:semiHidden="0" w:unhideWhenUsed="0"/>
+    <w:lsdException w:name="Body Text First Indent 2" w:uiPriority="99"/>
+    <w:lsdException w:name="Colorful List Accent 2" w:uiPriority="72" w:semiHidden="0" w:unhideWhenUsed="0"/>
+    <w:lsdException w:name="Body Text 3" w:uiPriority="99"/>
+    <w:lsdException w:name="Table Web 2" w:uiPriority="99"/>
+    <w:lsdException w:name="Table 3D effects 2" w:uiPriority="99"/>
+    <w:lsdException w:name="Light List Accent 1" w:uiPriority="61" w:semiHidden="0" w:unhideWhenUsed="0"/>
+    <w:lsdException w:name="Body Text First Indent" w:uiPriority="99"/>
+    <w:lsdException w:name="Light List Accent 6" w:uiPriority="61" w:semiHidden="0" w:unhideWhenUsed="0"/>
+    <w:lsdException w:name="Medium Shading 2 Accent 3" w:uiPriority="64" w:semiHidden="0" w:unhideWhenUsed="0"/>
+    <w:lsdException w:name="HTML Definition" w:uiPriority="99"/>
+    <w:lsdException w:name="Colorful Grid Accent 1" w:uiPriority="73" w:semiHidden="0" w:unhideWhenUsed="0"/>
+    <w:lsdException w:name="Colorful List Accent 3" w:uiPriority="72" w:semiHidden="0" w:unhideWhenUsed="0"/>
+    <w:lsdException w:name="Table List 6" w:uiPriority="99"/>
+    <w:lsdException w:name="Medium Grid 1" w:uiPriority="67" w:semiHidden="0" w:unhideWhenUsed="0"/>
+    <w:lsdException w:name="HTML Cite" w:uiPriority="99"/>
+    <w:lsdException w:name="Dark List" w:uiPriority="70" w:semiHidden="0" w:unhideWhenUsed="0"/>
+    <w:lsdException w:name="Colorful Shading Accent 4" w:uiPriority="71" w:semiHidden="0" w:unhideWhenUsed="0"/>
+    <w:lsdException w:name="Medium List 1 Accent 1" w:uiPriority="65" w:semiHidden="0" w:unhideWhenUsed="0"/>
+    <w:lsdException w:name="Table List 7" w:uiPriority="99"/>
+    <w:lsdException w:name="HTML Address" w:uiPriority="99"/>
+    <w:lsdException w:name="Light Grid Accent 5" w:uiPriority="62" w:semiHidden="0" w:unhideWhenUsed="0"/>
+    <w:lsdException w:name="Table Elegant" w:uiPriority="99"/>
+    <w:lsdException w:name="endnote text" w:uiPriority="99"/>
+    <w:lsdException w:name="Medium Grid 3 Accent 1" w:uiPriority="69" w:semiHidden="0" w:unhideWhenUsed="0"/>
+    <w:lsdException w:name="Table Web 1" w:uiPriority="99"/>
+    <w:lsdException w:name="Medium List 2" w:uiPriority="66" w:semiHidden="0" w:unhideWhenUsed="0"/>
+    <w:lsdException w:name="page number" w:uiPriority="99"/>
+    <w:lsdException w:name="heading 8" w:locked="1" w:uiPriority="0" w:qFormat="1"/>
+    <w:lsdException w:name="toc 4" w:locked="1" w:uiPriority="0" w:semiHidden="0" w:unhideWhenUsed="0"/>
+    <w:lsdException w:name="Table List 8" w:uiPriority="99"/>
+    <w:lsdException w:name="heading 5" w:locked="1" w:uiPriority="0" w:qFormat="1"/>
+    <w:lsdException w:name="Medium Shading 2 Accent 4" w:uiPriority="64" w:semiHidden="0" w:unhideWhenUsed="0"/>
+    <w:lsdException w:name="Medium List 1 Accent 2" w:uiPriority="65" w:semiHidden="0" w:unhideWhenUsed="0"/>
+    <w:lsdException w:name="footer" w:uiPriority="99" w:semiHidden="0" w:unhideWhenUsed="0"/>
+    <w:lsdException w:name="index 1" w:uiPriority="99"/>
+    <w:lsdException w:name="List Bullet 4" w:uiPriority="99"/>
+    <w:lsdException w:name="Light Grid Accent 4" w:uiPriority="62" w:semiHidden="0" w:unhideWhenUsed="0"/>
+    <w:lsdException w:name="Medium List 1 Accent 3" w:uiPriority="65" w:semiHidden="0" w:unhideWhenUsed="0"/>
+    <w:lsdException w:name="Medium Grid 1 Accent 3" w:uiPriority="67" w:semiHidden="0" w:unhideWhenUsed="0"/>
+    <w:lsdException w:name="index 2" w:uiPriority="99"/>
+    <w:lsdException w:name="heading 7" w:locked="1" w:uiPriority="0" w:qFormat="1"/>
+    <w:lsdException w:name="Balloon Text" w:uiPriority="99" w:unhideWhenUsed="0"/>
+    <w:lsdException w:name="index 3" w:uiPriority="99"/>
+    <w:lsdException w:name="Light Shading Accent 6" w:uiPriority="60" w:semiHidden="0" w:unhideWhenUsed="0"/>
+    <w:lsdException w:name="toc 3" w:locked="1" w:uiPriority="39" w:semiHidden="0" w:unhideWhenUsed="0"/>
+    <w:lsdException w:name="Plain Text" w:uiPriority="99"/>
+    <w:lsdException w:name="Hyperlink" w:uiPriority="99" w:semiHidden="0" w:unhideWhenUsed="0"/>
+    <w:lsdException w:name="Medium List 2 Accent 3" w:uiPriority="66" w:semiHidden="0" w:unhideWhenUsed="0"/>
+    <w:lsdException w:name="Table Simple 3" w:uiPriority="99"/>
+    <w:lsdException w:name="index 4" w:uiPriority="99"/>
+    <w:lsdException w:name="Medium List 2 Accent 2" w:uiPriority="66" w:semiHidden="0" w:unhideWhenUsed="0"/>
+    <w:lsdException w:name="annotation text" w:uiPriority="99"/>
+    <w:lsdException w:name="Medium List 2 Accent 1" w:uiPriority="66" w:semiHidden="0" w:unhideWhenUsed="0"/>
+    <w:lsdException w:name="Medium Grid 3 Accent 3" w:uiPriority="69" w:semiHidden="0" w:unhideWhenUsed="0"/>
+    <w:lsdException w:name="List Continue 3" w:uiPriority="99"/>
+    <w:lsdException w:name="Table Grid 4" w:uiPriority="99"/>
+    <w:lsdException w:name="index 5" w:uiPriority="99"/>
+    <w:lsdException w:name="Normal (Web)" w:uiPriority="99"/>
+    <w:lsdException w:name="Light Shading Accent 2" w:uiPriority="60" w:semiHidden="0" w:unhideWhenUsed="0"/>
+    <w:lsdException w:name="Dark List Accent 5" w:uiPriority="70" w:semiHidden="0" w:unhideWhenUsed="0"/>
+    <w:lsdException w:name="Dark List Accent 6" w:uiPriority="70" w:semiHidden="0" w:unhideWhenUsed="0"/>
+    <w:lsdException w:name="Light Shading Accent 3" w:uiPriority="60" w:semiHidden="0" w:unhideWhenUsed="0"/>
+    <w:lsdException w:name="Table Columns 1" w:uiPriority="99"/>
+    <w:lsdException w:name="Colorful Grid Accent 6" w:uiPriority="73" w:semiHidden="0" w:unhideWhenUsed="0"/>
+    <w:lsdException w:name="Medium List 1 Accent 6" w:uiPriority="65" w:semiHidden="0" w:unhideWhenUsed="0"/>
+    <w:lsdException w:name="List Number 4" w:uiPriority="99"/>
+    <w:lsdException w:name="List 2" w:uiPriority="99"/>
+    <w:lsdException w:name="Table Simple 2" w:uiPriority="99"/>
+    <w:lsdException w:name="List Number 3" w:uiPriority="99"/>
+    <w:lsdException w:name="Medium Grid 3 Accent 2" w:uiPriority="69" w:semiHidden="0" w:unhideWhenUsed="0"/>
+    <w:lsdException w:name="Table Columns 3" w:uiPriority="99"/>
+    <w:lsdException w:name="Medium List 2 Accent 6" w:uiPriority="66" w:semiHidden="0" w:unhideWhenUsed="0"/>
+    <w:lsdException w:name="macro" w:uiPriority="99"/>
+    <w:lsdException w:name="Table List 2" w:uiPriority="99"/>
+    <w:lsdException w:name="Table Colorful 3" w:uiPriority="99"/>
+    <w:lsdException w:name="line number" w:uiPriority="99"/>
+    <w:lsdException w:name="Medium Shading 2 Accent 1" w:uiPriority="64" w:semiHidden="0" w:unhideWhenUsed="0"/>
+    <w:lsdException w:name="Body Text 2" w:uiPriority="99"/>
+    <w:lsdException w:name="toc 9" w:locked="1" w:uiPriority="0" w:semiHidden="0" w:unhideWhenUsed="0"/>
+    <w:lsdException w:name="Table List 3" w:uiPriority="99"/>
+    <w:lsdException w:name="Date" w:uiPriority="99"/>
+    <w:lsdException w:name="Light Grid Accent 1" w:uiPriority="62" w:semiHidden="0" w:unhideWhenUsed="0"/>
+    <w:lsdException w:name="envelope address" w:uiPriority="99"/>
+    <w:lsdException w:name="Medium Shading 1 Accent 4" w:uiPriority="63" w:semiHidden="0" w:unhideWhenUsed="0"/>
+    <w:lsdException w:name="Colorful Grid Accent 2" w:uiPriority="73" w:semiHidden="0" w:unhideWhenUsed="0"/>
+    <w:lsdException w:name="Colorful Grid Accent 5" w:uiPriority="73" w:semiHidden="0" w:unhideWhenUsed="0"/>
+    <w:lsdException w:name="Table Colorful 1" w:uiPriority="99"/>
+    <w:lsdException w:name="Medium Shading 1 Accent 5" w:uiPriority="63" w:semiHidden="0" w:unhideWhenUsed="0"/>
+    <w:lsdException w:name="Colorful List Accent 5" w:uiPriority="72" w:semiHidden="0" w:unhideWhenUsed="0"/>
+    <w:lsdException w:name="List Number" w:uiPriority="99"/>
+    <w:lsdException w:name="Light Grid Accent 6" w:uiPriority="62" w:semiHidden="0" w:unhideWhenUsed="0"/>
+    <w:lsdException w:name="Colorful Grid Accent 3" w:uiPriority="73" w:semiHidden="0" w:unhideWhenUsed="0"/>
+    <w:lsdException w:name="Table List 1" w:uiPriority="99"/>
+    <w:lsdException w:name="Medium List 1 Accent 5" w:uiPriority="65" w:semiHidden="0" w:unhideWhenUsed="0"/>
+    <w:lsdException w:name="endnote reference" w:uiPriority="99"/>
+    <w:lsdException w:name="List Bullet" w:uiPriority="99"/>
+    <w:lsdException w:name="Table Colorful 2" w:uiPriority="99"/>
+    <w:lsdException w:name="Table Classic 3" w:uiPriority="99"/>
+    <w:lsdException w:name="Light Grid Accent 3" w:uiPriority="62" w:semiHidden="0" w:unhideWhenUsed="0"/>
+    <w:lsdException w:name="Colorful Shading Accent 6" w:uiPriority="71" w:semiHidden="0" w:unhideWhenUsed="0"/>
+    <w:lsdException w:name="Table Classic 4" w:uiPriority="99"/>
+    <w:lsdException w:name="toc 8" w:locked="1" w:uiPriority="0" w:semiHidden="0" w:unhideWhenUsed="0"/>
+    <w:lsdException w:name="toc 5" w:locked="1" w:uiPriority="0" w:semiHidden="0" w:unhideWhenUsed="0"/>
+    <w:lsdException w:name="Colorful Grid Accent 4" w:uiPriority="73" w:semiHidden="0" w:unhideWhenUsed="0"/>
+    <w:lsdException w:name="Medium Grid 2 Accent 3" w:uiPriority="68" w:semiHidden="0" w:unhideWhenUsed="0"/>
+    <w:lsdException w:name="Medium Shading 2" w:uiPriority="64" w:semiHidden="0" w:unhideWhenUsed="0"/>
+    <w:lsdException w:name="footnote text" w:uiPriority="99"/>
+    <w:lsdException w:name="Body Text Indent 3" w:uiPriority="99"/>
+    <w:lsdException w:name="Medium Grid 2 Accent 2" w:uiPriority="68" w:semiHidden="0" w:unhideWhenUsed="0"/>
+    <w:lsdException w:name="Colorful List Accent 4" w:uiPriority="72" w:semiHidden="0" w:unhideWhenUsed="0"/>
+    <w:lsdException w:name="E-mail Signature" w:uiPriority="99"/>
+    <w:lsdException w:name="index 6" w:uiPriority="99"/>
+    <w:lsdException w:name="Light List Accent 3" w:uiPriority="61" w:semiHidden="0" w:unhideWhenUsed="0"/>
+    <w:lsdException w:name="caption" w:locked="1" w:uiPriority="99" w:semiHidden="0" w:unhideWhenUsed="0" w:qFormat="1"/>
+    <w:lsdException w:name="toc 6" w:locked="1" w:uiPriority="0" w:semiHidden="0" w:unhideWhenUsed="0"/>
+    <w:lsdException w:name="table of authorities" w:uiPriority="99"/>
+    <w:lsdException w:name="annotation reference" w:uiPriority="99"/>
+    <w:lsdException w:name="List Paragraph" w:uiPriority="34" w:semiHidden="0" w:unhideWhenUsed="0" w:qFormat="1"/>
+    <w:lsdException w:name="toc 7" w:locked="1" w:uiPriority="0" w:semiHidden="0" w:unhideWhenUsed="0"/>
+    <w:lsdException w:name="Block Text" w:uiPriority="99"/>
+    <w:lsdException w:name="Medium Grid 1 Accent 2" w:uiPriority="67" w:semiHidden="0" w:unhideWhenUsed="0"/>
+    <w:lsdException w:name="Medium Grid 2 Accent 6" w:uiPriority="68" w:semiHidden="0" w:unhideWhenUsed="0"/>
+    <w:lsdException w:name="heading 9" w:locked="1" w:uiPriority="0" w:qFormat="1"/>
+    <w:lsdException w:name="Table Professional" w:uiPriority="99"/>
+    <w:lsdException w:name="index heading" w:uiPriority="99"/>
+    <w:lsdException w:name="Medium Grid 2 Accent 5" w:uiPriority="68" w:semiHidden="0" w:unhideWhenUsed="0"/>
+    <w:lsdException w:name="heading 6" w:locked="1" w:uiPriority="0" w:qFormat="1"/>
+    <w:lsdException w:name="Table Contemporary" w:uiPriority="99"/>
+    <w:lsdException w:name="Normal Table" w:uiPriority="99"/>
+    <w:lsdException w:name="Medium Grid 3" w:uiPriority="69" w:semiHidden="0" w:unhideWhenUsed="0"/>
+    <w:lsdException w:name="Dark List Accent 3" w:uiPriority="70" w:semiHidden="0" w:unhideWhenUsed="0"/>
+    <w:lsdException w:name="List 5" w:uiPriority="99"/>
+    <w:lsdException w:name="Medium Grid 2" w:uiPriority="68" w:semiHidden="0" w:unhideWhenUsed="0"/>
+    <w:lsdException w:name="Medium Grid 2 Accent 4" w:uiPriority="68" w:semiHidden="0" w:unhideWhenUsed="0"/>
+    <w:lsdException w:name="Light List Accent 5" w:uiPriority="61" w:semiHidden="0" w:unhideWhenUsed="0"/>
+    <w:lsdException w:name="Closing" w:uiPriority="99"/>
+    <w:lsdException w:name="Colorful List" w:uiPriority="72" w:semiHidden="0" w:unhideWhenUsed="0"/>
+    <w:lsdException w:name="Table Grid 6" w:uiPriority="99"/>
+    <w:lsdException w:name="Medium Grid 1 Accent 4" w:uiPriority="67" w:semiHidden="0" w:unhideWhenUsed="0"/>
+    <w:lsdException w:name="List Bullet 2" w:uiPriority="99"/>
+    <w:lsdException w:name="Medium Grid 1 Accent 1" w:uiPriority="67" w:semiHidden="0" w:unhideWhenUsed="0"/>
+    <w:lsdException w:name="Document Map" w:uiPriority="99"/>
+    <w:lsdException w:name="Signature" w:uiPriority="99"/>
+    <w:lsdException w:name="Table Grid" w:locked="1" w:uiPriority="99" w:semiHidden="0" w:unhideWhenUsed="0"/>
+    <w:lsdException w:name="header" w:uiPriority="99" w:semiHidden="0" w:unhideWhenUsed="0"/>
+    <w:lsdException w:name="Table Columns 5" w:uiPriority="99"/>
+    <w:lsdException w:name="Emphasis" w:locked="1" w:uiPriority="0" w:semiHidden="0" w:unhideWhenUsed="0" w:qFormat="1"/>
+    <w:lsdException w:name="Table 3D effects 3" w:uiPriority="99"/>
+    <w:lsdException w:name="HTML Keyboard" w:uiPriority="99"/>
+    <w:lsdException w:name="Table Grid 7" w:uiPriority="99"/>
+    <w:lsdException w:name="Dark List Accent 2" w:uiPriority="70" w:semiHidden="0" w:unhideWhenUsed="0"/>
+    <w:lsdException w:name="Light Shading Accent 5" w:uiPriority="60" w:semiHidden="0" w:unhideWhenUsed="0"/>
+    <w:lsdException w:name="Body Text Indent 2" w:uiPriority="99"/>
+    <w:lsdException w:name="List Continue" w:uiPriority="99"/>
+    <w:lsdException w:name="Table List 5" w:uiPriority="99"/>
+    <w:lsdException w:name="Light Grid" w:uiPriority="62" w:semiHidden="0" w:unhideWhenUsed="0"/>
+    <w:lsdException w:name="Table Columns 4" w:uiPriority="99"/>
+    <w:lsdException w:name="List Continue 4" w:uiPriority="99"/>
+    <w:lsdException w:name="Medium Shading 2 Accent 6" w:uiPriority="64" w:semiHidden="0" w:unhideWhenUsed="0"/>
+    <w:lsdException w:name="Table Grid 8" w:uiPriority="99"/>
+    <w:lsdException w:name="Medium Shading 1 Accent 6" w:uiPriority="63" w:semiHidden="0" w:unhideWhenUsed="0"/>
+    <w:lsdException w:name="Light List Accent 4" w:uiPriority="61" w:semiHidden="0" w:unhideWhenUsed="0"/>
+    <w:lsdException w:name="List" w:uiPriority="99"/>
+    <w:lsdException w:name="toc 2" w:uiPriority="39" w:semiHidden="0" w:unhideWhenUsed="0"/>
+    <w:lsdException w:name="Strong" w:locked="1" w:uiPriority="0" w:semiHidden="0" w:unhideWhenUsed="0" w:qFormat="1"/>
+    <w:lsdException w:name="Medium Shading 1 Accent 3" w:uiPriority="63" w:semiHidden="0" w:unhideWhenUsed="0"/>
+    <w:lsdException w:name="Table Web 3" w:uiPriority="99"/>
+    <w:lsdException w:name="List Bullet 5" w:uiPriority="99"/>
+    <w:lsdException w:name="Subtitle" w:locked="1" w:uiPriority="0" w:semiHidden="0" w:unhideWhenUsed="0" w:qFormat="1"/>
+    <w:lsdException w:name="List 4" w:uiPriority="99"/>
+    <w:lsdException w:name="Table Grid 5" w:uiPriority="99"/>
+    <w:lsdException w:name="HTML Acronym" w:uiPriority="99"/>
+    <w:lsdException w:name="Medium Grid 2 Accent 1" w:uiPriority="68" w:semiHidden="0" w:unhideWhenUsed="0"/>
+    <w:lsdException w:name="Medium List 1" w:uiPriority="65" w:semiHidden="0" w:unhideWhenUsed="0"/>
+    <w:lsdException w:name="Colorful List Accent 1" w:uiPriority="72" w:semiHidden="0" w:unhideWhenUsed="0"/>
+    <w:lsdException w:name="Light Shading" w:uiPriority="60" w:semiHidden="0" w:unhideWhenUsed="0"/>
+    <w:lsdException w:name="Table List 4" w:uiPriority="99"/>
+    <w:lsdException w:name="Light Shading Accent 4" w:uiPriority="60" w:semiHidden="0" w:unhideWhenUsed="0"/>
+    <w:lsdException w:name="Table Simple 1" w:uiPriority="99"/>
+    <w:lsdException w:name="HTML Sample" w:uiPriority="99"/>
+    <w:lsdException w:name="Medium Shading 1 Accent 2" w:uiPriority="63" w:semiHidden="0" w:unhideWhenUsed="0"/>
+    <w:lsdException w:name="Medium Shading 1 Accent 1" w:uiPriority="63" w:semiHidden="0" w:unhideWhenUsed="0"/>
+    <w:lsdException w:name="toc 1" w:uiPriority="39" w:semiHidden="0" w:unhideWhenUsed="0"/>
+    <w:lsdException w:name="Light List" w:uiPriority="61" w:semiHidden="0" w:unhideWhenUsed="0"/>
+    <w:lsdException w:name="Title" w:locked="1" w:uiPriority="0" w:semiHidden="0" w:unhideWhenUsed="0" w:qFormat="1"/>
     <w:lsdException w:name="Colorful Shading Accent 2" w:uiPriority="71" w:semiHidden="0" w:unhideWhenUsed="0"/>
-    <w:lsdException w:name="Table Grid 5" w:uiPriority="99"/>
-    <w:lsdException w:name="heading 7" w:locked="1" w:uiPriority="0" w:qFormat="1"/>
-    <w:lsdException w:name="Table Columns 2" w:uiPriority="99"/>
-    <w:lsdException w:name="Normal Table" w:uiPriority="99"/>
-    <w:lsdException w:name="Colorful Shading Accent 5" w:uiPriority="71" w:semiHidden="0" w:unhideWhenUsed="0"/>
-    <w:lsdException w:name="Body Text" w:uiPriority="99"/>
-    <w:lsdException w:name="List Number" w:uiPriority="99"/>
-    <w:lsdException w:name="Table Classic 1" w:uiPriority="99"/>
-    <w:lsdException w:name="Medium Shading 1 Accent 1" w:uiPriority="63" w:semiHidden="0" w:unhideWhenUsed="0"/>
-    <w:lsdException w:name="toc 7" w:locked="1" w:uiPriority="0" w:semiHidden="0" w:unhideWhenUsed="0"/>
-    <w:lsdException w:name="Hyperlink" w:uiPriority="99" w:semiHidden="0" w:unhideWhenUsed="0"/>
-    <w:lsdException w:name="List Continue 5" w:uiPriority="99"/>
-    <w:lsdException w:name="Medium Shading 2 Accent 1" w:uiPriority="64" w:semiHidden="0" w:unhideWhenUsed="0"/>
-    <w:lsdException w:name="List Number 4" w:uiPriority="99"/>
+    <w:lsdException w:name="Dark List Accent 4" w:uiPriority="70" w:semiHidden="0" w:unhideWhenUsed="0"/>
+    <w:lsdException w:name="Default Paragraph Font" w:uiPriority="1"/>
+    <w:lsdException w:name="Colorful Shading Accent 3" w:uiPriority="71" w:semiHidden="0" w:unhideWhenUsed="0"/>
+    <w:lsdException w:name="Medium Shading 1" w:uiPriority="63" w:semiHidden="0" w:unhideWhenUsed="0"/>
+    <w:lsdException w:name="Light Grid Accent 2" w:uiPriority="62" w:semiHidden="0" w:unhideWhenUsed="0"/>
+    <w:lsdException w:name="footnote reference" w:uiPriority="99"/>
+    <w:lsdException w:name="HTML Typewriter" w:uiPriority="99"/>
     <w:lsdException w:name="toa heading" w:uiPriority="99"/>
-    <w:lsdException w:name="Medium Shading 2 Accent 6" w:uiPriority="64" w:semiHidden="0" w:unhideWhenUsed="0"/>
-    <w:lsdException w:name="HTML Typewriter" w:uiPriority="99"/>
-    <w:lsdException w:name="Medium Grid 3 Accent 5" w:uiPriority="69" w:semiHidden="0" w:unhideWhenUsed="0"/>
-    <w:lsdException w:name="Table Classic 3" w:uiPriority="99"/>
-    <w:lsdException w:name="toc 5" w:locked="1" w:uiPriority="0" w:semiHidden="0" w:unhideWhenUsed="0"/>
-    <w:lsdException w:name="Message Header" w:uiPriority="99"/>
-    <w:lsdException w:name="Medium Shading 1" w:uiPriority="63" w:semiHidden="0" w:unhideWhenUsed="0"/>
-    <w:lsdException w:name="Table 3D effects 1" w:uiPriority="99"/>
-    <w:lsdException w:name="Dark List" w:uiPriority="70" w:semiHidden="0" w:unhideWhenUsed="0"/>
-    <w:lsdException w:name="Medium Shading 1 Accent 6" w:uiPriority="63" w:semiHidden="0" w:unhideWhenUsed="0"/>
-    <w:lsdException w:name="Medium List 2 Accent 6" w:uiPriority="66" w:semiHidden="0" w:unhideWhenUsed="0"/>
-    <w:lsdException w:name="List Continue 3" w:uiPriority="99"/>
-    <w:lsdException w:name="Table List 2" w:uiPriority="99"/>
-    <w:lsdException w:name="Table Elegant" w:uiPriority="99"/>
-    <w:lsdException w:name="Light Shading Accent 3" w:uiPriority="60" w:semiHidden="0" w:unhideWhenUsed="0"/>
-    <w:lsdException w:name="Light Grid Accent 4" w:uiPriority="62" w:semiHidden="0" w:unhideWhenUsed="0"/>
-    <w:lsdException w:name="Colorful Shading Accent 4" w:uiPriority="71" w:semiHidden="0" w:unhideWhenUsed="0"/>
-    <w:lsdException w:name="List Bullet" w:uiPriority="99"/>
-    <w:lsdException w:name="Table List 5" w:uiPriority="99"/>
-    <w:lsdException w:name="Table Simple 1" w:uiPriority="99"/>
-    <w:lsdException w:name="List 4" w:uiPriority="99"/>
-    <w:lsdException w:name="Medium List 1 Accent 4" w:uiPriority="65" w:semiHidden="0" w:unhideWhenUsed="0"/>
-    <w:lsdException w:name="index 5" w:uiPriority="99"/>
-    <w:lsdException w:name="Table Grid 7" w:uiPriority="99"/>
-    <w:lsdException w:name="toc 6" w:locked="1" w:uiPriority="0" w:semiHidden="0" w:unhideWhenUsed="0"/>
-    <w:lsdException w:name="heading 9" w:locked="1" w:uiPriority="0" w:qFormat="1"/>
-    <w:lsdException w:name="Note Heading" w:uiPriority="99"/>
     <w:lsdException w:name="annotation subject" w:uiPriority="99"/>
-    <w:lsdException w:name="Medium Grid 2 Accent 2" w:uiPriority="68" w:semiHidden="0" w:unhideWhenUsed="0"/>
-    <w:lsdException w:name="Table Colorful 1" w:uiPriority="99"/>
-    <w:lsdException w:name="HTML Sample" w:uiPriority="99"/>
-    <w:lsdException w:name="toc 1" w:uiPriority="39" w:semiHidden="0" w:unhideWhenUsed="0"/>
-    <w:lsdException w:name="Light Shading Accent 4" w:uiPriority="60" w:semiHidden="0" w:unhideWhenUsed="0"/>
-    <w:lsdException w:name="HTML Address" w:uiPriority="99"/>
-    <w:lsdException w:name="Medium Shading 2 Accent 5" w:uiPriority="64" w:semiHidden="0" w:unhideWhenUsed="0"/>
-    <w:lsdException w:name="toc 9" w:locked="1" w:uiPriority="0" w:semiHidden="0" w:unhideWhenUsed="0"/>
-    <w:lsdException w:name="footnote text" w:uiPriority="99"/>
-    <w:lsdException w:name="Medium Grid 3 Accent 4" w:uiPriority="69" w:semiHidden="0" w:unhideWhenUsed="0"/>
-    <w:lsdException w:name="List Number 5" w:uiPriority="99"/>
-    <w:lsdException w:name="Medium Shading 2" w:uiPriority="64" w:semiHidden="0" w:unhideWhenUsed="0"/>
-    <w:lsdException w:name="Medium Grid 3 Accent 3" w:uiPriority="69" w:semiHidden="0" w:unhideWhenUsed="0"/>
-    <w:lsdException w:name="Medium List 2 Accent 2" w:uiPriority="66" w:semiHidden="0" w:unhideWhenUsed="0"/>
-    <w:lsdException w:name="Table Colorful 3" w:uiPriority="99"/>
-    <w:lsdException w:name="Closing" w:uiPriority="99"/>
-    <w:lsdException w:name="Normal (Web)" w:uiPriority="99"/>
-    <w:lsdException w:name="E-mail Signature" w:uiPriority="99"/>
-    <w:lsdException w:name="line number" w:uiPriority="99"/>
-    <w:lsdException w:name="Table List 4" w:uiPriority="99"/>
-    <w:lsdException w:name="Light Shading Accent 2" w:uiPriority="60" w:semiHidden="0" w:unhideWhenUsed="0"/>
-    <w:lsdException w:name="index 1" w:uiPriority="99"/>
-    <w:lsdException w:name="Table Classic 2" w:uiPriority="99"/>
-    <w:lsdException w:name="index heading" w:uiPriority="99"/>
-    <w:lsdException w:name="Medium Shading 1 Accent 2" w:uiPriority="63" w:semiHidden="0" w:unhideWhenUsed="0"/>
-    <w:lsdException w:name="Table Subtle 1" w:uiPriority="99"/>
-    <w:lsdException w:name="Body Text Indent 3" w:uiPriority="99"/>
-    <w:lsdException w:name="Light Shading Accent 5" w:uiPriority="60" w:semiHidden="0" w:unhideWhenUsed="0"/>
-    <w:lsdException w:name="Medium Grid 1 Accent 5" w:uiPriority="67" w:semiHidden="0" w:unhideWhenUsed="0"/>
-    <w:lsdException w:name="Medium Grid 2 Accent 6" w:uiPriority="68" w:semiHidden="0" w:unhideWhenUsed="0"/>
-    <w:lsdException w:name="List Number 3" w:uiPriority="99"/>
-    <w:lsdException w:name="Emphasis" w:locked="1" w:uiPriority="0" w:semiHidden="0" w:unhideWhenUsed="0" w:qFormat="1"/>
-    <w:lsdException w:name="index 3" w:uiPriority="99"/>
-    <w:lsdException w:name="Medium List 1 Accent 6" w:uiPriority="65" w:semiHidden="0" w:unhideWhenUsed="0"/>
-    <w:lsdException w:name="HTML Preformatted" w:uiPriority="99"/>
-    <w:lsdException w:name="Table Columns 1" w:uiPriority="99"/>
-    <w:lsdException w:name="Table List 7" w:uiPriority="99"/>
-    <w:lsdException w:name="Body Text Indent" w:uiPriority="99"/>
-    <w:lsdException w:name="Table Classic 4" w:uiPriority="99"/>
-    <w:lsdException w:name="Medium Grid 2" w:uiPriority="68" w:semiHidden="0" w:unhideWhenUsed="0"/>
-    <w:lsdException w:name="Colorful Shading Accent 6" w:uiPriority="71" w:semiHidden="0" w:unhideWhenUsed="0"/>
-    <w:lsdException w:name="heading 5" w:locked="1" w:uiPriority="0" w:qFormat="1"/>
-    <w:lsdException w:name="Light List Accent 5" w:uiPriority="61" w:semiHidden="0" w:unhideWhenUsed="0"/>
-    <w:lsdException w:name="Medium Grid 3 Accent 6" w:uiPriority="69" w:semiHidden="0" w:unhideWhenUsed="0"/>
-    <w:lsdException w:name="Medium Grid 2 Accent 4" w:uiPriority="68" w:semiHidden="0" w:unhideWhenUsed="0"/>
-    <w:lsdException w:name="Default Paragraph Font" w:uiPriority="1"/>
-    <w:lsdException w:name="toc 8" w:locked="1" w:uiPriority="0" w:semiHidden="0" w:unhideWhenUsed="0"/>
-    <w:lsdException w:name="Medium Grid 1 Accent 6" w:uiPriority="67" w:semiHidden="0" w:unhideWhenUsed="0"/>
-    <w:lsdException w:name="annotation reference" w:uiPriority="99"/>
-    <w:lsdException w:name="Dark List Accent 5" w:uiPriority="70" w:semiHidden="0" w:unhideWhenUsed="0"/>
-    <w:lsdException w:name="HTML Code" w:uiPriority="99"/>
-    <w:lsdException w:name="toc 3" w:locked="1" w:uiPriority="39" w:semiHidden="0" w:unhideWhenUsed="0"/>
-    <w:lsdException w:name="Light Shading Accent 6" w:uiPriority="60" w:semiHidden="0" w:unhideWhenUsed="0"/>
-    <w:lsdException w:name="table of authorities" w:uiPriority="99"/>
-    <w:lsdException w:name="Medium List 2 Accent 3" w:uiPriority="66" w:semiHidden="0" w:unhideWhenUsed="0"/>
-    <w:lsdException w:name="Table Web 3" w:uiPriority="99"/>
-    <w:lsdException w:name="Medium Grid 1 Accent 1" w:uiPriority="67" w:semiHidden="0" w:unhideWhenUsed="0"/>
-    <w:lsdException w:name="FollowedHyperlink" w:uiPriority="99"/>
-    <w:lsdException w:name="List 3" w:uiPriority="99"/>
-    <w:lsdException w:name="Light Grid Accent 3" w:uiPriority="62" w:semiHidden="0" w:unhideWhenUsed="0"/>
-    <w:lsdException w:name="Table Grid 4" w:uiPriority="99"/>
-    <w:lsdException w:name="Light Shading Accent 1" w:uiPriority="60" w:semiHidden="0" w:unhideWhenUsed="0"/>
-    <w:lsdException w:name="List Bullet 3" w:uiPriority="99"/>
-    <w:lsdException w:name="heading 6" w:locked="1" w:uiPriority="0" w:qFormat="1"/>
-    <w:lsdException w:name="Medium List 2 Accent 4" w:uiPriority="66" w:semiHidden="0" w:unhideWhenUsed="0"/>
-    <w:lsdException w:name="Table Columns 3" w:uiPriority="99"/>
-    <w:lsdException w:name="HTML Variable" w:uiPriority="99"/>
-    <w:lsdException w:name="index 7" w:uiPriority="99"/>
-    <w:lsdException w:name="Table Web 1" w:uiPriority="99"/>
-    <w:lsdException w:name="heading 1" w:uiPriority="99" w:semiHidden="0" w:unhideWhenUsed="0" w:qFormat="1"/>
-    <w:lsdException w:name="Colorful Grid Accent 5" w:uiPriority="73" w:semiHidden="0" w:unhideWhenUsed="0"/>
-    <w:lsdException w:name="Table Colorful 2" w:uiPriority="99"/>
-    <w:lsdException w:name="Table Grid" w:locked="1" w:uiPriority="99" w:semiHidden="0" w:unhideWhenUsed="0"/>
-    <w:lsdException w:name="Block Text" w:uiPriority="99"/>
-    <w:lsdException w:name="Table List 6" w:uiPriority="99"/>
-    <w:lsdException w:name="Medium Grid 3" w:uiPriority="69" w:semiHidden="0" w:unhideWhenUsed="0"/>
-    <w:lsdException w:name="Medium List 1" w:uiPriority="65" w:semiHidden="0" w:unhideWhenUsed="0"/>
-    <w:lsdException w:name="Light List Accent 4" w:uiPriority="61" w:semiHidden="0" w:unhideWhenUsed="0"/>
-    <w:lsdException w:name="Medium List 2 Accent 1" w:uiPriority="66" w:semiHidden="0" w:unhideWhenUsed="0"/>
-    <w:lsdException w:name="Body Text First Indent" w:uiPriority="99"/>
-    <w:lsdException w:name="Date" w:uiPriority="99"/>
-    <w:lsdException w:name="table of figures" w:uiPriority="99" w:semiHidden="0"/>
-    <w:lsdException w:name="header" w:uiPriority="99" w:semiHidden="0" w:unhideWhenUsed="0"/>
-    <w:lsdException w:name="List Paragraph" w:uiPriority="34" w:semiHidden="0" w:unhideWhenUsed="0" w:qFormat="1"/>
-    <w:lsdException w:name="envelope address" w:uiPriority="99"/>
-    <w:lsdException w:name="List Continue 4" w:uiPriority="99"/>
-    <w:lsdException w:name="Dark List Accent 1" w:uiPriority="70" w:semiHidden="0" w:unhideWhenUsed="0"/>
-    <w:lsdException w:name="index 2" w:uiPriority="99"/>
-    <w:lsdException w:name="HTML Keyboard" w:uiPriority="99"/>
-    <w:lsdException w:name="Medium Grid 2 Accent 5" w:uiPriority="68" w:semiHidden="0" w:unhideWhenUsed="0"/>
-    <w:lsdException w:name="Colorful Grid Accent 3" w:uiPriority="73" w:semiHidden="0" w:unhideWhenUsed="0"/>
-    <w:lsdException w:name="index 9" w:uiPriority="99"/>
-    <w:lsdException w:name="Colorful List Accent 3" w:uiPriority="72" w:semiHidden="0" w:unhideWhenUsed="0"/>
-    <w:lsdException w:name="Colorful List" w:uiPriority="72" w:semiHidden="0" w:unhideWhenUsed="0"/>
-    <w:lsdException w:name="index 4" w:uiPriority="99"/>
-    <w:lsdException w:name="Medium Grid 1 Accent 3" w:uiPriority="67" w:semiHidden="0" w:unhideWhenUsed="0"/>
-    <w:lsdException w:name="Table Grid 6" w:uiPriority="99"/>
-    <w:lsdException w:name="Light List Accent 3" w:uiPriority="61" w:semiHidden="0" w:unhideWhenUsed="0"/>
-    <w:lsdException w:name="footnote reference" w:uiPriority="99"/>
-    <w:lsdException w:name="heading 8" w:locked="1" w:uiPriority="0" w:qFormat="1"/>
-    <w:lsdException w:name="Dark List Accent 6" w:uiPriority="70" w:semiHidden="0" w:unhideWhenUsed="0"/>
-    <w:lsdException w:name="Body Text 2" w:uiPriority="99"/>
-    <w:lsdException w:name="endnote reference" w:uiPriority="99"/>
-    <w:lsdException w:name="Medium Grid 2 Accent 3" w:uiPriority="68" w:semiHidden="0" w:unhideWhenUsed="0"/>
-    <w:lsdException w:name="heading 3" w:locked="1" w:uiPriority="99" w:semiHidden="0" w:unhideWhenUsed="0" w:qFormat="1"/>
-    <w:lsdException w:name="Balloon Text" w:uiPriority="99" w:unhideWhenUsed="0"/>
-    <w:lsdException w:name="Colorful Grid Accent 4" w:uiPriority="73" w:semiHidden="0" w:unhideWhenUsed="0"/>
-    <w:lsdException w:name="Colorful List Accent 4" w:uiPriority="72" w:semiHidden="0" w:unhideWhenUsed="0"/>
-    <w:lsdException w:name="Body Text First Indent 2" w:uiPriority="99"/>
-    <w:lsdException w:name="Colorful Grid" w:uiPriority="73" w:semiHidden="0" w:unhideWhenUsed="0"/>
-    <w:lsdException w:name="Colorful Shading" w:uiPriority="71" w:semiHidden="0" w:unhideWhenUsed="0"/>
-    <w:lsdException w:name="List" w:uiPriority="99"/>
-    <w:lsdException w:name="endnote text" w:uiPriority="99"/>
-    <w:lsdException w:name="Light List Accent 1" w:uiPriority="61" w:semiHidden="0" w:unhideWhenUsed="0"/>
-    <w:lsdException w:name="Medium Grid 1 Accent 4" w:uiPriority="67" w:semiHidden="0" w:unhideWhenUsed="0"/>
-    <w:lsdException w:name="Medium Grid 3 Accent 2" w:uiPriority="69" w:semiHidden="0" w:unhideWhenUsed="0"/>
-    <w:lsdException w:name="Medium List 1 Accent 3" w:uiPriority="65" w:semiHidden="0" w:unhideWhenUsed="0"/>
-    <w:lsdException w:name="Table Columns 4" w:uiPriority="99"/>
-    <w:lsdException w:name="Colorful Shading Accent 3" w:uiPriority="71" w:semiHidden="0" w:unhideWhenUsed="0"/>
-    <w:lsdException w:name="List Bullet 5" w:uiPriority="99"/>
-    <w:lsdException w:name="index 8" w:uiPriority="99"/>
-    <w:lsdException w:name="Table Theme" w:uiPriority="99"/>
-    <w:lsdException w:name="HTML Definition" w:uiPriority="99"/>
-    <w:lsdException w:name="Table Simple 3" w:uiPriority="99"/>
-    <w:lsdException w:name="Colorful Grid Accent 2" w:uiPriority="73" w:semiHidden="0" w:unhideWhenUsed="0"/>
-    <w:lsdException w:name="Document Map" w:uiPriority="99"/>
-    <w:lsdException w:name="Colorful List Accent 2" w:uiPriority="72" w:semiHidden="0" w:unhideWhenUsed="0"/>
-    <w:lsdException w:name="Signature" w:uiPriority="99"/>
     <w:lsdException w:name="heading 4" w:locked="1" w:uiPriority="0" w:qFormat="1"/>
-    <w:lsdException w:name="page number" w:uiPriority="99"/>
-    <w:lsdException w:name="Colorful Shading Accent 1" w:uiPriority="71" w:semiHidden="0" w:unhideWhenUsed="0"/>
-    <w:lsdException w:name="Colorful List Accent 5" w:uiPriority="72" w:semiHidden="0" w:unhideWhenUsed="0"/>
-    <w:lsdException w:name="Light Grid Accent 1" w:uiPriority="62" w:semiHidden="0" w:unhideWhenUsed="0"/>
-    <w:lsdException w:name="Table Contemporary" w:uiPriority="99"/>
-    <w:lsdException w:name="toc 4" w:locked="1" w:uiPriority="0" w:semiHidden="0" w:unhideWhenUsed="0"/>
-    <w:lsdException w:name="Normal" w:uiPriority="0" w:semiHidden="0" w:unhideWhenUsed="0" w:qFormat="1"/>
-    <w:lsdException w:name="heading 2" w:uiPriority="99" w:semiHidden="0" w:unhideWhenUsed="0" w:qFormat="1"/>
-    <w:lsdException w:name="Medium List 1 Accent 1" w:uiPriority="65" w:semiHidden="0" w:unhideWhenUsed="0"/>
-    <w:lsdException w:name="caption" w:locked="1" w:uiPriority="99" w:semiHidden="0" w:unhideWhenUsed="0" w:qFormat="1"/>
-    <w:lsdException w:name="Subtitle" w:locked="1" w:uiPriority="0" w:semiHidden="0" w:unhideWhenUsed="0" w:qFormat="1"/>
-    <w:lsdException w:name="HTML Acronym" w:uiPriority="99"/>
-    <w:lsdException w:name="Dark List Accent 4" w:uiPriority="70" w:semiHidden="0" w:unhideWhenUsed="0"/>
-    <w:lsdException w:name="toc 2" w:uiPriority="39" w:semiHidden="0" w:unhideWhenUsed="0"/>
-    <w:lsdException w:name="Table List 8" w:uiPriority="99"/>
-    <w:lsdException w:name="Medium Shading 1 Accent 5" w:uiPriority="63" w:semiHidden="0" w:unhideWhenUsed="0"/>
-    <w:lsdException w:name="annotation text" w:uiPriority="99"/>
-    <w:lsdException w:name="Table Web 2" w:uiPriority="99"/>
-    <w:lsdException w:name="Colorful Grid Accent 6" w:uiPriority="73" w:semiHidden="0" w:unhideWhenUsed="0"/>
-    <w:lsdException w:name="Colorful List Accent 6" w:uiPriority="72" w:semiHidden="0" w:unhideWhenUsed="0"/>
-    <w:lsdException w:name="List Continue 2" w:uiPriority="99"/>
-    <w:lsdException w:name="Table List 3" w:uiPriority="99"/>
-    <w:lsdException w:name="Medium List 2 Accent 5" w:uiPriority="66" w:semiHidden="0" w:unhideWhenUsed="0"/>
-    <w:lsdException w:name="List 2" w:uiPriority="99"/>
-    <w:lsdException w:name="Dark List Accent 3" w:uiPriority="70" w:semiHidden="0" w:unhideWhenUsed="0"/>
-    <w:lsdException w:name="Light Grid Accent 2" w:uiPriority="62" w:semiHidden="0" w:unhideWhenUsed="0"/>
-    <w:lsdException w:name="HTML Cite" w:uiPriority="99"/>
-    <w:lsdException w:name="Medium List 1 Accent 2" w:uiPriority="65" w:semiHidden="0" w:unhideWhenUsed="0"/>
-    <w:lsdException w:name="Table Simple 2" w:uiPriority="99"/>
-    <w:lsdException w:name="Colorful Grid Accent 1" w:uiPriority="73" w:semiHidden="0" w:unhideWhenUsed="0"/>
-    <w:lsdException w:name="List 5" w:uiPriority="99"/>
-    <w:lsdException w:name="Table 3D effects 2" w:uiPriority="99"/>
-    <w:lsdException w:name="Colorful List Accent 1" w:uiPriority="72" w:semiHidden="0" w:unhideWhenUsed="0"/>
-    <w:lsdException w:name="index 6" w:uiPriority="99"/>
-    <w:lsdException w:name="Light Grid Accent 5" w:uiPriority="62" w:semiHidden="0" w:unhideWhenUsed="0"/>
-    <w:lsdException w:name="Medium List 1 Accent 5" w:uiPriority="65" w:semiHidden="0" w:unhideWhenUsed="0"/>
-    <w:lsdException w:name="Body Text Indent 2" w:uiPriority="99"/>
-    <w:lsdException w:name="Light Grid" w:uiPriority="62" w:semiHidden="0" w:unhideWhenUsed="0"/>
-    <w:lsdException w:name="Table List 1" w:uiPriority="99"/>
-    <w:lsdException w:name="footer" w:uiPriority="99" w:semiHidden="0" w:unhideWhenUsed="0"/>
-    <w:lsdException w:name="Medium Grid 2 Accent 1" w:uiPriority="68" w:semiHidden="0" w:unhideWhenUsed="0"/>
-    <w:lsdException w:name="Strong" w:locked="1" w:uiPriority="0" w:semiHidden="0" w:unhideWhenUsed="0" w:qFormat="1"/>
-    <w:lsdException w:name="Light List Accent 6" w:uiPriority="61" w:semiHidden="0" w:unhideWhenUsed="0"/>
-    <w:lsdException w:name="Medium List 2" w:uiPriority="66" w:semiHidden="0" w:unhideWhenUsed="0"/>
-    <w:lsdException w:name="Salutation" w:uiPriority="99"/>
-    <w:lsdException w:name="List Continue" w:uiPriority="99"/>
-    <w:lsdException w:name="Medium Shading 2 Accent 4" w:uiPriority="64" w:semiHidden="0" w:unhideWhenUsed="0"/>
-    <w:lsdException w:name="Table Grid 8" w:uiPriority="99"/>
-    <w:lsdException w:name="Medium Shading 1 Accent 4" w:uiPriority="63" w:semiHidden="0" w:unhideWhenUsed="0"/>
-    <w:lsdException w:name="Table Grid 3" w:uiPriority="99"/>
-    <w:lsdException w:name="Dark List Accent 2" w:uiPriority="70" w:semiHidden="0" w:unhideWhenUsed="0"/>
-    <w:lsdException w:name="Light Shading" w:uiPriority="60" w:semiHidden="0" w:unhideWhenUsed="0"/>
-    <w:lsdException w:name="Title" w:locked="1" w:uiPriority="0" w:semiHidden="0" w:unhideWhenUsed="0" w:qFormat="1"/>
-    <w:lsdException w:name="Medium Shading 1 Accent 3" w:uiPriority="63" w:semiHidden="0" w:unhideWhenUsed="0"/>
-    <w:lsdException w:name="Medium Grid 1 Accent 2" w:uiPriority="67" w:semiHidden="0" w:unhideWhenUsed="0"/>
-    <w:lsdException w:name="Light List" w:uiPriority="61" w:semiHidden="0" w:unhideWhenUsed="0"/>
-    <w:lsdException w:name="Light Grid Accent 6" w:uiPriority="62" w:semiHidden="0" w:unhideWhenUsed="0"/>
-    <w:lsdException w:name="Body Text 3" w:uiPriority="99"/>
-    <w:lsdException w:name="Normal Indent" w:uiPriority="99"/>
-    <w:lsdException w:name="Table Grid 1" w:uiPriority="99"/>
-    <w:lsdException w:name="List Number 2" w:uiPriority="99"/>
-    <w:lsdException w:name="Light List Accent 2" w:uiPriority="61" w:semiHidden="0" w:unhideWhenUsed="0"/>
-    <w:lsdException w:name="Medium Shading 2 Accent 3" w:uiPriority="64" w:semiHidden="0" w:unhideWhenUsed="0"/>
-    <w:lsdException w:name="Medium Grid 1" w:uiPriority="67" w:semiHidden="0" w:unhideWhenUsed="0"/>
-    <w:lsdException w:name="Plain Text" w:uiPriority="99"/>
-    <w:lsdException w:name="Table 3D effects 3" w:uiPriority="99"/>
-    <w:lsdException w:name="Table Subtle 2" w:uiPriority="99"/>
-    <w:lsdException w:name="List Bullet 2" w:uiPriority="99"/>
-    <w:lsdException w:name="Table Professional" w:uiPriority="99"/>
-    <w:lsdException w:name="Table Grid 2" w:uiPriority="99"/>
-    <w:lsdException w:name="Placeholder Text" w:uiPriority="99" w:unhideWhenUsed="0"/>
-    <w:lsdException w:name="Medium Grid 3 Accent 1" w:uiPriority="69" w:semiHidden="0" w:unhideWhenUsed="0"/>
-    <w:lsdException w:name="Table Columns 5" w:uiPriority="99"/>
-    <w:lsdException w:name="envelope return" w:uiPriority="99"/>
-    <w:lsdException w:name="List Bullet 4" w:uiPriority="99"/>
-    <w:lsdException w:name="Medium Shading 2 Accent 2" w:uiPriority="64" w:semiHidden="0" w:unhideWhenUsed="0"/>
-    <w:lsdException w:name="macro" w:uiPriority="99"/>
   </w:latentStyles>
-  <w:style w:type="paragraph" w:styleId="000017">
-    <w:name w:val="endnote text"/>
-    <w:basedOn w:val="00000c"/>
-    <w:link w:val="000018"/>
-    <w:uiPriority w:val="99"/>
-    <w:semiHidden w:val="1"/>
-    <w:unhideWhenUsed w:val="1"/>
-    <w:pPr>
-      <w:spacing w:after="0"/>
-      <w:ind w:left="57" w:hanging="57"/>
-    </w:pPr>
-    <w:rPr>
-      <w:sz w:val="20"/>
-      <w:szCs w:val="20"/>
-    </w:rPr>
-  </w:style>
-  <w:style w:type="character" w:styleId="000013" w:default="1">
-    <w:name w:val="Default Paragraph Font"/>
-    <w:uiPriority w:val="1"/>
-    <w:semiHidden w:val="1"/>
-    <w:unhideWhenUsed w:val="1"/>
-  </w:style>
-  <w:style w:type="paragraph" w:styleId="000019">
+  <w:style w:type="paragraph" w:styleId="000006">
     <w:name w:val="Balloon Text"/>
-    <w:basedOn w:val="00000c"/>
-    <w:link w:val="00001a"/>
+    <w:basedOn w:val="000003"/>
+    <w:link w:val="000007"/>
     <w:uiPriority w:val="99"/>
     <w:semiHidden w:val="1"/>
     <w:pPr>
@@ -2581,7 +2564,86 @@
       <w:szCs w:val="16"/>
     </w:rPr>
   </w:style>
-  <w:style w:type="table" w:styleId="000014" w:default="1">
+  <w:style w:type="character" w:styleId="000012">
+    <w:name w:val="Emphasis"/>
+    <w:basedOn w:val="000005"/>
+    <w:uiPriority w:val="0"/>
+    <w:qFormat w:val="1"/>
+    <w:locked w:val="1"/>
+    <w:rPr>
+      <w:i w:val="1"/>
+      <w:iCs w:val="1"/>
+    </w:rPr>
+  </w:style>
+  <w:style w:type="character" w:styleId="00001f" w:customStyle="1">
+    <w:name w:val="Unresolved Mention"/>
+    <w:basedOn w:val="000005"/>
+    <w:uiPriority w:val="99"/>
+    <w:semiHidden w:val="1"/>
+    <w:unhideWhenUsed w:val="1"/>
+    <w:rPr>
+      <w:color w:val="605E5C"/>
+      <w:shd w:val="clear" w:color="auto" w:fill="E1DFDD"/>
+    </w:rPr>
+  </w:style>
+  <w:style w:type="paragraph" w:styleId="000011">
+    <w:name w:val="toc 3"/>
+    <w:basedOn w:val="000003"/>
+    <w:next w:val="000003"/>
+    <w:autoRedefine w:val="1"/>
+    <w:uiPriority w:val="39"/>
+    <w:locked w:val="1"/>
+    <w:pPr>
+      <w:ind w:left="397" w:firstLine="0"/>
+    </w:pPr>
+    <w:rPr>
+      <w:i w:val="1"/>
+    </w:rPr>
+  </w:style>
+  <w:style w:type="paragraph" w:styleId="00000f">
+    <w:name w:val="toc 1"/>
+    <w:basedOn w:val="000003"/>
+    <w:next w:val="000003"/>
+    <w:autoRedefine w:val="1"/>
+    <w:uiPriority w:val="39"/>
+    <w:pPr>
+      <w:spacing w:after="100"/>
+      <w:ind w:firstLine="0"/>
+    </w:pPr>
+  </w:style>
+  <w:style w:type="paragraph" w:styleId="00000c">
+    <w:name w:val="header"/>
+    <w:basedOn w:val="000003"/>
+    <w:link w:val="00000b"/>
+    <w:uiPriority w:val="99"/>
+    <w:pPr>
+      <w:tabs>
+        <w:tab w:val="center" w:pos="4680"/>
+        <w:tab w:val="right" w:pos="9360"/>
+      </w:tabs>
+      <w:spacing w:after="0"/>
+      <w:ind w:firstLine="0"/>
+      <w:jc w:val="right"/>
+    </w:pPr>
+    <w:rPr>
+      <w:sz w:val="20"/>
+    </w:rPr>
+  </w:style>
+  <w:style w:type="character" w:styleId="000007" w:customStyle="1">
+    <w:name w:val="批注框文本 字符"/>
+    <w:basedOn w:val="000005"/>
+    <w:link w:val="000006"/>
+    <w:uiPriority w:val="99"/>
+    <w:semiHidden w:val="1"/>
+    <w:qFormat w:val="1"/>
+    <w:locked w:val="1"/>
+    <w:rPr>
+      <w:rFonts w:ascii="Tahoma" w:hAnsi="Tahoma" w:cs="Tahoma"/>
+      <w:sz w:val="16"/>
+      <w:szCs w:val="16"/>
+    </w:rPr>
+  </w:style>
+  <w:style w:type="table" w:styleId="000008" w:default="1">
     <w:name w:val="Normal Table"/>
     <w:uiPriority w:val="99"/>
     <w:semiHidden w:val="1"/>
@@ -2595,11 +2657,201 @@
       </w:tblCellMar>
     </w:tblPr>
   </w:style>
+  <w:style w:type="paragraph" w:styleId="000015">
+    <w:name w:val="heading 2"/>
+    <w:basedOn w:val="000003"/>
+    <w:next w:val="000003"/>
+    <w:link w:val="000014"/>
+    <w:uiPriority w:val="99"/>
+    <w:qFormat w:val="1"/>
+    <w:pPr>
+      <w:keepNext w:val="1"/>
+      <w:keepLines w:val="1"/>
+      <w:spacing w:before="200" w:after="120"/>
+      <w:ind w:firstLine="0"/>
+      <w:outlineLvl w:val="1"/>
+    </w:pPr>
+    <w:rPr>
+      <w:rFonts w:ascii="Times New Roman" w:hAnsi="Times New Roman"/>
+      <w:b w:val="1"/>
+      <w:bCs w:val="1"/>
+      <w:sz w:val="26"/>
+      <w:szCs w:val="26"/>
+    </w:rPr>
+  </w:style>
+  <w:style w:type="character" w:styleId="000010">
+    <w:name w:val="Hyperlink"/>
+    <w:basedOn w:val="000005"/>
+    <w:uiPriority w:val="99"/>
+    <w:rPr>
+      <w:rFonts w:cs="Times New Roman"/>
+      <w:color w:val="0000FF"/>
+      <w:u w:val="single"/>
+    </w:rPr>
+  </w:style>
+  <w:style w:type="character" w:styleId="000020">
+    <w:name w:val="endnote reference"/>
+    <w:basedOn w:val="000005"/>
+    <w:uiPriority w:val="99"/>
+    <w:semiHidden w:val="1"/>
+    <w:unhideWhenUsed w:val="1"/>
+    <w:rPr>
+      <w:vertAlign w:val="superscript"/>
+    </w:rPr>
+  </w:style>
+  <w:style w:type="character" w:styleId="000019" w:customStyle="1">
+    <w:name w:val="标题 3 字符"/>
+    <w:basedOn w:val="000005"/>
+    <w:link w:val="00001a"/>
+    <w:uiPriority w:val="99"/>
+    <w:locked w:val="1"/>
+    <w:rPr>
+      <w:rFonts w:ascii="Times New Roman" w:hAnsi="Times New Roman" w:eastAsia="DFKai-SB" w:cs="Arial"/>
+      <w:bCs w:val="1"/>
+      <w:i w:val="1"/>
+      <w:sz w:val="28"/>
+      <w:szCs w:val="26"/>
+      <w:lang w:eastAsia="en-US"/>
+    </w:rPr>
+  </w:style>
+  <w:style w:type="paragraph" w:styleId="000003" w:default="1">
+    <w:name w:val="Normal"/>
+    <w:uiPriority w:val="0"/>
+    <w:qFormat w:val="1"/>
+    <w:pPr>
+      <w:spacing w:after="120" w:line="276" w:lineRule="auto"/>
+      <w:ind w:firstLine="595"/>
+    </w:pPr>
+    <w:rPr>
+      <w:rFonts w:ascii="Times New Roman" w:hAnsi="Times New Roman" w:eastAsia="DFKai-SB" w:cs="Times New Roman"/>
+      <w:sz w:val="22"/>
+      <w:szCs w:val="22"/>
+      <w:lang w:val="en-US" w:eastAsia="en-US" w:bidi="ar-SA"/>
+    </w:rPr>
+  </w:style>
+  <w:style w:type="character" w:styleId="00000e" w:customStyle="1">
+    <w:name w:val="页脚 字符"/>
+    <w:basedOn w:val="000005"/>
+    <w:link w:val="00000d"/>
+    <w:uiPriority w:val="99"/>
+    <w:qFormat w:val="1"/>
+    <w:locked w:val="1"/>
+    <w:rPr>
+      <w:rFonts w:ascii="Times New Roman" w:hAnsi="Times New Roman" w:cs="Times New Roman"/>
+      <w:sz w:val="24"/>
+    </w:rPr>
+  </w:style>
+  <w:style w:type="paragraph" w:styleId="00001e">
+    <w:name w:val="toc 2"/>
+    <w:basedOn w:val="000003"/>
+    <w:next w:val="000003"/>
+    <w:autoRedefine w:val="1"/>
+    <w:uiPriority w:val="39"/>
+    <w:pPr>
+      <w:spacing w:after="100"/>
+      <w:ind w:left="397" w:firstLine="0"/>
+    </w:pPr>
+  </w:style>
+  <w:style w:type="paragraph" w:styleId="000016">
+    <w:name w:val="table of figures"/>
+    <w:basedOn w:val="000003"/>
+    <w:next w:val="000003"/>
+    <w:uiPriority w:val="99"/>
+    <w:unhideWhenUsed w:val="1"/>
+    <w:pPr>
+      <w:spacing w:after="0"/>
+      <w:ind w:firstLine="0"/>
+    </w:pPr>
+  </w:style>
   <w:style w:type="paragraph" w:styleId="00000d">
+    <w:name w:val="footer"/>
+    <w:basedOn w:val="000003"/>
+    <w:link w:val="00000e"/>
+    <w:uiPriority w:val="99"/>
+    <w:pPr>
+      <w:tabs>
+        <w:tab w:val="center" w:pos="4680"/>
+        <w:tab w:val="right" w:pos="9360"/>
+      </w:tabs>
+      <w:spacing w:after="0"/>
+    </w:pPr>
+  </w:style>
+  <w:style w:type="character" w:styleId="00000b" w:customStyle="1">
+    <w:name w:val="页眉 字符"/>
+    <w:basedOn w:val="000005"/>
+    <w:link w:val="00000c"/>
+    <w:uiPriority w:val="99"/>
+    <w:qFormat w:val="1"/>
+    <w:locked w:val="1"/>
+    <w:rPr>
+      <w:rFonts w:eastAsia="DFKai-SB" w:cs="Times New Roman"/>
+      <w:sz w:val="22"/>
+      <w:szCs w:val="22"/>
+      <w:lang w:val="en-US" w:eastAsia="en-US" w:bidi="ar-SA"/>
+    </w:rPr>
+  </w:style>
+  <w:style w:type="character" w:styleId="00001b">
+    <w:name w:val="FollowedHyperlink"/>
+    <w:basedOn w:val="000005"/>
+    <w:uiPriority w:val="99"/>
+    <w:semiHidden w:val="1"/>
+    <w:unhideWhenUsed w:val="1"/>
+    <w:rPr>
+      <w:color w:val="800080" w:themeColor="followedHyperlink"/>
+      <w:u w:val="single"/>
+      <w14:textFill>
+        <w14:solidFill>
+          <w14:schemeClr w14:val="folHlink"/>
+        </w14:solidFill>
+      </w14:textFill>
+    </w:rPr>
+  </w:style>
+  <w:style w:type="character" w:styleId="00000a" w:customStyle="1">
+    <w:name w:val="标题 1 字符"/>
+    <w:basedOn w:val="000005"/>
+    <w:link w:val="000009"/>
+    <w:uiPriority w:val="99"/>
+    <w:locked w:val="1"/>
+    <w:rPr>
+      <w:rFonts w:ascii="Times New Roman" w:hAnsi="Times New Roman" w:eastAsia="DFKai-SB"/>
+      <w:b w:val="1"/>
+      <w:bCs w:val="1"/>
+      <w:sz w:val="36"/>
+      <w:szCs w:val="28"/>
+      <w:lang w:eastAsia="en-US"/>
+    </w:rPr>
+  </w:style>
+  <w:style w:type="paragraph" w:styleId="000018">
+    <w:name w:val="List Paragraph"/>
+    <w:basedOn w:val="000003"/>
+    <w:uiPriority w:val="34"/>
+    <w:qFormat w:val="1"/>
+    <w:pPr>
+      <w:ind w:firstLine="0"/>
+      <w:contextualSpacing w:val="1"/>
+    </w:pPr>
+  </w:style>
+  <w:style w:type="paragraph" w:styleId="000002">
+    <w:name w:val="endnote text"/>
+    <w:basedOn w:val="000003"/>
+    <w:link w:val="000004"/>
+    <w:uiPriority w:val="99"/>
+    <w:semiHidden w:val="1"/>
+    <w:unhideWhenUsed w:val="1"/>
+    <w:pPr>
+      <w:spacing w:after="0"/>
+      <w:ind w:left="57" w:hanging="57"/>
+    </w:pPr>
+    <w:rPr>
+      <w:sz w:val="20"/>
+      <w:szCs w:val="20"/>
+    </w:rPr>
+  </w:style>
+  <w:style w:type="paragraph" w:styleId="000009">
     <w:name w:val="heading 1"/>
-    <w:basedOn w:val="00000c"/>
-    <w:next w:val="00000c"/>
-    <w:link w:val="00000e"/>
+    <w:basedOn w:val="000003"/>
+    <w:next w:val="000003"/>
+    <w:link w:val="00000a"/>
     <w:uiPriority w:val="99"/>
     <w:qFormat w:val="1"/>
     <w:pPr>
@@ -2618,150 +2870,45 @@
       <w:szCs w:val="28"/>
     </w:rPr>
   </w:style>
-  <w:style w:type="character" w:styleId="00001c" w:customStyle="1">
-    <w:name w:val="页眉 字符"/>
-    <w:basedOn w:val="000013"/>
-    <w:link w:val="000006"/>
+  <w:style w:type="character" w:styleId="000005" w:default="1">
+    <w:name w:val="Default Paragraph Font"/>
+    <w:uiPriority w:val="1"/>
+    <w:semiHidden w:val="1"/>
+    <w:unhideWhenUsed w:val="1"/>
+  </w:style>
+  <w:style w:type="paragraph" w:styleId="00001c" w:customStyle="1">
+    <w:name w:val="Style Heading 1 + (Asian) DFKai-SB"/>
+    <w:basedOn w:val="000009"/>
+    <w:uiPriority w:val="99"/>
+  </w:style>
+  <w:style w:type="paragraph" w:styleId="00001d">
+    <w:name w:val="caption"/>
+    <w:basedOn w:val="000003"/>
+    <w:next w:val="000003"/>
     <w:uiPriority w:val="99"/>
     <w:qFormat w:val="1"/>
     <w:locked w:val="1"/>
+    <w:pPr>
+      <w:ind w:firstLine="0"/>
+      <w:jc w:val="center"/>
+    </w:pPr>
     <w:rPr>
-      <w:rFonts w:eastAsia="DFKai-SB" w:cs="Times New Roman"/>
-      <w:sz w:val="22"/>
-      <w:szCs w:val="22"/>
-      <w:lang w:val="en-US" w:eastAsia="en-US" w:bidi="ar-SA"/>
+      <w:bCs w:val="1"/>
+      <w:szCs w:val="20"/>
     </w:rPr>
   </w:style>
-  <w:style w:type="paragraph" w:styleId="000003">
-    <w:name w:val="footer"/>
-    <w:basedOn w:val="00000c"/>
-    <w:link w:val="00001b"/>
-    <w:uiPriority w:val="99"/>
-    <w:pPr>
-      <w:tabs>
-        <w:tab w:val="center" w:pos="4680"/>
-        <w:tab w:val="right" w:pos="9360"/>
-      </w:tabs>
-      <w:spacing w:after="0"/>
-    </w:pPr>
-  </w:style>
-  <w:style w:type="paragraph" w:styleId="00001d">
-    <w:name w:val="toc 1"/>
-    <w:basedOn w:val="00000c"/>
-    <w:next w:val="00000c"/>
-    <w:autoRedefine w:val="1"/>
-    <w:uiPriority w:val="39"/>
-    <w:pPr>
-      <w:spacing w:after="100"/>
-      <w:ind w:firstLine="0"/>
-    </w:pPr>
-  </w:style>
-  <w:style w:type="character" w:styleId="000024">
-    <w:name w:val="Hyperlink"/>
-    <w:basedOn w:val="000013"/>
-    <w:uiPriority w:val="99"/>
-    <w:rPr>
-      <w:rFonts w:cs="Times New Roman"/>
-      <w:color w:val="0000FF"/>
-      <w:u w:val="single"/>
-    </w:rPr>
-  </w:style>
-  <w:style w:type="paragraph" w:styleId="000006">
-    <w:name w:val="header"/>
-    <w:basedOn w:val="00000c"/>
-    <w:link w:val="00001c"/>
-    <w:uiPriority w:val="99"/>
-    <w:pPr>
-      <w:tabs>
-        <w:tab w:val="center" w:pos="4680"/>
-        <w:tab w:val="right" w:pos="9360"/>
-      </w:tabs>
-      <w:spacing w:after="0"/>
-      <w:ind w:firstLine="0"/>
-      <w:jc w:val="right"/>
-    </w:pPr>
-    <w:rPr>
-      <w:sz w:val="20"/>
-    </w:rPr>
-  </w:style>
-  <w:style w:type="paragraph" w:styleId="000016">
-    <w:name w:val="toc 3"/>
-    <w:basedOn w:val="00000c"/>
-    <w:next w:val="00000c"/>
-    <w:autoRedefine w:val="1"/>
-    <w:uiPriority w:val="39"/>
-    <w:locked w:val="1"/>
-    <w:pPr>
-      <w:ind w:left="397" w:firstLine="0"/>
-    </w:pPr>
-    <w:rPr>
-      <w:i w:val="1"/>
-    </w:rPr>
-  </w:style>
-  <w:style w:type="character" w:styleId="000023">
-    <w:name w:val="Emphasis"/>
-    <w:basedOn w:val="000013"/>
-    <w:uiPriority w:val="0"/>
-    <w:qFormat w:val="1"/>
-    <w:locked w:val="1"/>
-    <w:rPr>
-      <w:i w:val="1"/>
-      <w:iCs w:val="1"/>
-    </w:rPr>
-  </w:style>
-  <w:style w:type="character" w:styleId="000026">
+  <w:style w:type="character" w:styleId="000013">
     <w:name w:val="Placeholder Text"/>
-    <w:basedOn w:val="000013"/>
+    <w:basedOn w:val="000005"/>
     <w:uiPriority w:val="99"/>
     <w:semiHidden w:val="1"/>
     <w:rPr>
       <w:color w:val="808080"/>
     </w:rPr>
   </w:style>
-  <w:style w:type="character" w:styleId="00000e" w:customStyle="1">
-    <w:name w:val="标题 1 字符"/>
-    <w:basedOn w:val="000013"/>
-    <w:link w:val="00000d"/>
-    <w:uiPriority w:val="99"/>
-    <w:locked w:val="1"/>
-    <w:rPr>
-      <w:rFonts w:ascii="Times New Roman" w:hAnsi="Times New Roman" w:eastAsia="DFKai-SB"/>
-      <w:b w:val="1"/>
-      <w:bCs w:val="1"/>
-      <w:sz w:val="36"/>
-      <w:szCs w:val="28"/>
-      <w:lang w:eastAsia="en-US"/>
-    </w:rPr>
-  </w:style>
-  <w:style w:type="character" w:styleId="000010" w:customStyle="1">
-    <w:name w:val="标题 2 字符"/>
-    <w:basedOn w:val="000013"/>
-    <w:link w:val="00000f"/>
-    <w:uiPriority w:val="99"/>
-    <w:locked w:val="1"/>
-    <w:rPr>
-      <w:rFonts w:ascii="Times New Roman" w:hAnsi="Times New Roman" w:eastAsia="DFKai-SB"/>
-      <w:b w:val="1"/>
-      <w:bCs w:val="1"/>
-      <w:sz w:val="32"/>
-      <w:szCs w:val="26"/>
-      <w:lang w:eastAsia="en-US"/>
-    </w:rPr>
-  </w:style>
-  <w:style w:type="paragraph" w:styleId="00001e">
-    <w:name w:val="table of figures"/>
-    <w:basedOn w:val="00000c"/>
-    <w:next w:val="00000c"/>
-    <w:uiPriority w:val="99"/>
-    <w:unhideWhenUsed w:val="1"/>
-    <w:pPr>
-      <w:spacing w:after="0"/>
-      <w:ind w:firstLine="0"/>
-    </w:pPr>
-  </w:style>
-  <w:style w:type="table" w:styleId="000020">
+  <w:style w:type="table" w:styleId="000017">
     <w:name w:val="Table Grid"/>
-    <w:basedOn w:val="000014"/>
+    <w:basedOn w:val="000008"/>
     <w:uiPriority w:val="99"/>
     <w:locked w:val="1"/>
     <w:pPr>
@@ -2782,125 +2929,11 @@
       </w:tblBorders>
     </w:tblPr>
   </w:style>
-  <w:style w:type="paragraph" w:styleId="000027">
-    <w:name w:val="List Paragraph"/>
-    <w:basedOn w:val="00000c"/>
-    <w:uiPriority w:val="34"/>
-    <w:qFormat w:val="1"/>
-    <w:pPr>
-      <w:ind w:firstLine="0"/>
-      <w:contextualSpacing w:val="1"/>
-    </w:pPr>
-  </w:style>
-  <w:style w:type="character" w:styleId="00001a" w:customStyle="1">
-    <w:name w:val="批注框文本 字符"/>
-    <w:basedOn w:val="000013"/>
+  <w:style w:type="paragraph" w:styleId="00001a">
+    <w:name w:val="heading 3"/>
+    <w:basedOn w:val="000003"/>
+    <w:next w:val="000003"/>
     <w:link w:val="000019"/>
-    <w:uiPriority w:val="99"/>
-    <w:semiHidden w:val="1"/>
-    <w:qFormat w:val="1"/>
-    <w:locked w:val="1"/>
-    <w:rPr>
-      <w:rFonts w:ascii="Tahoma" w:hAnsi="Tahoma" w:cs="Tahoma"/>
-      <w:sz w:val="16"/>
-      <w:szCs w:val="16"/>
-    </w:rPr>
-  </w:style>
-  <w:style w:type="paragraph" w:styleId="00000c" w:default="1">
-    <w:name w:val="Normal"/>
-    <w:uiPriority w:val="0"/>
-    <w:qFormat w:val="1"/>
-    <w:pPr>
-      <w:spacing w:after="120" w:line="276" w:lineRule="auto"/>
-      <w:ind w:firstLine="595"/>
-    </w:pPr>
-    <w:rPr>
-      <w:rFonts w:ascii="Times New Roman" w:hAnsi="Times New Roman" w:eastAsia="DFKai-SB" w:cs="Times New Roman"/>
-      <w:sz w:val="22"/>
-      <w:szCs w:val="22"/>
-      <w:lang w:val="en-US" w:eastAsia="en-US" w:bidi="ar-SA"/>
-    </w:rPr>
-  </w:style>
-  <w:style w:type="character" w:styleId="000012" w:customStyle="1">
-    <w:name w:val="标题 3 字符"/>
-    <w:basedOn w:val="000013"/>
-    <w:link w:val="000011"/>
-    <w:uiPriority w:val="99"/>
-    <w:locked w:val="1"/>
-    <w:rPr>
-      <w:rFonts w:ascii="Times New Roman" w:hAnsi="Times New Roman" w:eastAsia="DFKai-SB" w:cs="Arial"/>
-      <w:bCs w:val="1"/>
-      <w:i w:val="1"/>
-      <w:sz w:val="28"/>
-      <w:szCs w:val="26"/>
-      <w:lang w:eastAsia="en-US"/>
-    </w:rPr>
-  </w:style>
-  <w:style w:type="character" w:styleId="00001b" w:customStyle="1">
-    <w:name w:val="页脚 字符"/>
-    <w:basedOn w:val="000013"/>
-    <w:link w:val="000003"/>
-    <w:uiPriority w:val="99"/>
-    <w:qFormat w:val="1"/>
-    <w:locked w:val="1"/>
-    <w:rPr>
-      <w:rFonts w:ascii="Times New Roman" w:hAnsi="Times New Roman" w:cs="Times New Roman"/>
-      <w:sz w:val="24"/>
-    </w:rPr>
-  </w:style>
-  <w:style w:type="character" w:styleId="000022">
-    <w:name w:val="FollowedHyperlink"/>
-    <w:basedOn w:val="000013"/>
-    <w:uiPriority w:val="99"/>
-    <w:semiHidden w:val="1"/>
-    <w:unhideWhenUsed w:val="1"/>
-    <w:rPr>
-      <w:color w:val="800080" w:themeColor="followedHyperlink"/>
-      <w:u w:val="single"/>
-      <w14:textFill>
-        <w14:solidFill>
-          <w14:schemeClr w14:val="folHlink"/>
-        </w14:solidFill>
-      </w14:textFill>
-    </w:rPr>
-  </w:style>
-  <w:style w:type="paragraph" w:styleId="000025" w:customStyle="1">
-    <w:name w:val="Style Heading 1 + (Asian) DFKai-SB"/>
-    <w:basedOn w:val="00000d"/>
-    <w:uiPriority w:val="99"/>
-  </w:style>
-  <w:style w:type="character" w:styleId="000018" w:customStyle="1">
-    <w:name w:val="尾注文本 字符"/>
-    <w:basedOn w:val="000013"/>
-    <w:link w:val="000017"/>
-    <w:uiPriority w:val="99"/>
-    <w:semiHidden w:val="1"/>
-    <w:rPr>
-      <w:rFonts w:ascii="Times New Roman" w:hAnsi="Times New Roman" w:eastAsia="DFKai-SB"/>
-      <w:lang w:eastAsia="en-US"/>
-    </w:rPr>
-  </w:style>
-  <w:style w:type="paragraph" w:styleId="000015">
-    <w:name w:val="caption"/>
-    <w:basedOn w:val="00000c"/>
-    <w:next w:val="00000c"/>
-    <w:uiPriority w:val="99"/>
-    <w:qFormat w:val="1"/>
-    <w:locked w:val="1"/>
-    <w:pPr>
-      <w:ind w:firstLine="0"/>
-      <w:jc w:val="center"/>
-    </w:pPr>
-    <w:rPr>
-      <w:bCs w:val="1"/>
-      <w:szCs w:val="20"/>
-    </w:rPr>
-  </w:style>
-  <w:style w:type="paragraph" w:styleId="000011">
-    <w:name w:val="heading 3"/>
-    <w:basedOn w:val="00000c"/>
-    <w:next w:val="00000c"/>
-    <w:link w:val="000012"/>
     <w:uiPriority w:val="99"/>
     <w:qFormat w:val="1"/>
     <w:locked w:val="1"/>
@@ -2919,58 +2952,30 @@
       <w:szCs w:val="26"/>
     </w:rPr>
   </w:style>
-  <w:style w:type="paragraph" w:styleId="00001f">
-    <w:name w:val="toc 2"/>
-    <w:basedOn w:val="00000c"/>
-    <w:next w:val="00000c"/>
-    <w:autoRedefine w:val="1"/>
-    <w:uiPriority w:val="39"/>
-    <w:pPr>
-      <w:spacing w:after="100"/>
-      <w:ind w:left="397" w:firstLine="0"/>
-    </w:pPr>
+  <w:style w:type="character" w:styleId="000014" w:customStyle="1">
+    <w:name w:val="标题 2 字符"/>
+    <w:basedOn w:val="000005"/>
+    <w:link w:val="000015"/>
+    <w:uiPriority w:val="99"/>
+    <w:locked w:val="1"/>
+    <w:rPr>
+      <w:rFonts w:ascii="Times New Roman" w:hAnsi="Times New Roman" w:eastAsia="DFKai-SB"/>
+      <w:b w:val="1"/>
+      <w:bCs w:val="1"/>
+      <w:sz w:val="32"/>
+      <w:szCs w:val="26"/>
+      <w:lang w:eastAsia="en-US"/>
+    </w:rPr>
   </w:style>
-  <w:style w:type="character" w:styleId="000028" w:customStyle="1">
-    <w:name w:val="Unresolved Mention"/>
-    <w:basedOn w:val="000013"/>
+  <w:style w:type="character" w:styleId="000004" w:customStyle="1">
+    <w:name w:val="尾注文本 字符"/>
+    <w:basedOn w:val="000005"/>
+    <w:link w:val="000002"/>
     <w:uiPriority w:val="99"/>
     <w:semiHidden w:val="1"/>
-    <w:unhideWhenUsed w:val="1"/>
     <w:rPr>
-      <w:color w:val="605E5C"/>
-      <w:shd w:val="clear" w:color="auto" w:fill="E1DFDD"/>
-    </w:rPr>
-  </w:style>
-  <w:style w:type="paragraph" w:styleId="00000f">
-    <w:name w:val="heading 2"/>
-    <w:basedOn w:val="00000c"/>
-    <w:next w:val="00000c"/>
-    <w:link w:val="000010"/>
-    <w:uiPriority w:val="99"/>
-    <w:qFormat w:val="1"/>
-    <w:pPr>
-      <w:keepNext w:val="1"/>
-      <w:keepLines w:val="1"/>
-      <w:spacing w:before="200" w:after="120"/>
-      <w:ind w:firstLine="0"/>
-      <w:outlineLvl w:val="1"/>
-    </w:pPr>
-    <w:rPr>
-      <w:rFonts w:ascii="Times New Roman" w:hAnsi="Times New Roman"/>
-      <w:b w:val="1"/>
-      <w:bCs w:val="1"/>
-      <w:sz w:val="26"/>
-      <w:szCs w:val="26"/>
-    </w:rPr>
-  </w:style>
-  <w:style w:type="character" w:styleId="000021">
-    <w:name w:val="endnote reference"/>
-    <w:basedOn w:val="000013"/>
-    <w:uiPriority w:val="99"/>
-    <w:semiHidden w:val="1"/>
-    <w:unhideWhenUsed w:val="1"/>
-    <w:rPr>
-      <w:vertAlign w:val="superscript"/>
+      <w:rFonts w:ascii="Times New Roman" w:hAnsi="Times New Roman" w:eastAsia="DFKai-SB"/>
+      <w:lang w:eastAsia="en-US"/>
     </w:rPr>
   </w:style>
 </w:styles>

</xml_diff>